<commit_message>
feat: add user properties and enhance routes for owner management
- Added optional properties `username` and `role` to the User interface.
- Expanded the web routes for owner functionalities including receivables, purchases, expenses, and consignments.
- Implemented a new script for multi-agent synchronization and enhanced the existing proposal generation script.
- Updated tests to cover new functionalities for managing receivables, purchases, expenses, and consignments.
</commit_message>
<xml_diff>
--- a/docs/Transformasi Digital/Proposal Transformasi Digital - Grossmart.docx
+++ b/docs/Transformasi Digital/Proposal Transformasi Digital - Grossmart.docx
@@ -287,7 +287,29 @@
           <w:sz w:val="24"/>
           <w:rFonts w:ascii="Times New Roman" w:hAnsi="Times New Roman" w:cs="Times New Roman"/>
         </w:rPr>
-        <w:t>Toko kelontong mandiri (~3,9 juta unit di Indonesia) menyediakan kebutuhan pokok harian warga permukiman secara dekat dan terjangkau. Namun, keberadaannya kian terdesak oleh jaringan minimarket waralaba modern yang didukung sistem kasir otomatis. Sebagian besar pengelola warung tradisional berusia paruh baya hingga lanjut usia yang masih mengandalkan pencatatan manual di buku kertas, nota sobekan, dan kalkulator saku. Cara manual ini menimbulkan berbagai persoalan harian: antrean jam sibuk melambat, rawan selisih uang laci malam hari, catatan bon utang langganan terselip, dan pembukuan makanan titipan warga sering keliru. Aplikasi kasir komersial di pasaran umumnya mematok biaya sewa bulanan yang memberatkan margin tipis warung, menggunakan antarmuka berhuruf kecil yang rumit bagi lansia, serta tidak menyediakan alur tutup kasir buta (</w:t>
+        <w:t xml:space="preserve">Sekitar 3,9 juta toko kelontong di Indonesia melayani kebutuhan harian warga di kawasan permukiman. Sebagian besar warung ini dikelola oleh pedagang berusia paruh baya hingga lanjut usia yang masih mengandalkan buku kertas, nota lepas, dan kalkulator saku. Pencatatan manual membuat antrean jam sibuk lambat, memicu selisih uang kas laci saat tutup toko malam hari, serta membuat catatan bon utang dan barang titipan warga mudah terselip. Di sisi lain, aplikasi kasir komersial membebani pedagang dengan biaya sewa bulanan dan memiliki antarmuka berhuruf kecil yang sulit dipakai kasir lanjut usia. Proposal ini mengusulkan </w:t>
+      </w:r>
+      <w:r>
+        <w:rPr>
+          <w:rFonts w:ascii="Times New Roman" w:hAnsi="Times New Roman"/>
+          <w:b/>
+          <w:i w:val="0"/>
+          <w:color w:val="000000"/>
+          <w:sz w:val="24"/>
+          <w:rFonts w:ascii="Times New Roman" w:hAnsi="Times New Roman" w:cs="Times New Roman"/>
+        </w:rPr>
+        <w:t>Grossmart</w:t>
+      </w:r>
+      <w:r>
+        <w:rPr>
+          <w:rFonts w:ascii="Times New Roman" w:hAnsi="Times New Roman"/>
+          <w:b w:val="0"/>
+          <w:i w:val="0"/>
+          <w:color w:val="000000"/>
+          <w:sz w:val="24"/>
+          <w:rFonts w:ascii="Times New Roman" w:hAnsi="Times New Roman" w:cs="Times New Roman"/>
+        </w:rPr>
+        <w:t>, aplikasi kasir mandiri (</w:t>
       </w:r>
       <w:r>
         <w:rPr>
@@ -298,6 +320,138 @@
           <w:sz w:val="24"/>
           <w:rFonts w:ascii="Times New Roman" w:hAnsi="Times New Roman" w:cs="Times New Roman"/>
         </w:rPr>
+        <w:t>self-hosted</w:t>
+      </w:r>
+      <w:r>
+        <w:rPr>
+          <w:rFonts w:ascii="Times New Roman" w:hAnsi="Times New Roman"/>
+          <w:b w:val="0"/>
+          <w:i w:val="0"/>
+          <w:color w:val="000000"/>
+          <w:sz w:val="24"/>
+          <w:rFonts w:ascii="Times New Roman" w:hAnsi="Times New Roman" w:cs="Times New Roman"/>
+        </w:rPr>
+        <w:t xml:space="preserve">) berbasis </w:t>
+      </w:r>
+      <w:r>
+        <w:rPr>
+          <w:rFonts w:ascii="Times New Roman" w:hAnsi="Times New Roman"/>
+          <w:b w:val="0"/>
+          <w:i/>
+          <w:color w:val="000000"/>
+          <w:sz w:val="24"/>
+          <w:rFonts w:ascii="Times New Roman" w:hAnsi="Times New Roman" w:cs="Times New Roman"/>
+        </w:rPr>
+        <w:t>Laravel 11</w:t>
+      </w:r>
+      <w:r>
+        <w:rPr>
+          <w:rFonts w:ascii="Times New Roman" w:hAnsi="Times New Roman"/>
+          <w:b w:val="0"/>
+          <w:i w:val="0"/>
+          <w:color w:val="000000"/>
+          <w:sz w:val="24"/>
+          <w:rFonts w:ascii="Times New Roman" w:hAnsi="Times New Roman" w:cs="Times New Roman"/>
+        </w:rPr>
+        <w:t xml:space="preserve">, </w:t>
+      </w:r>
+      <w:r>
+        <w:rPr>
+          <w:rFonts w:ascii="Times New Roman" w:hAnsi="Times New Roman"/>
+          <w:b w:val="0"/>
+          <w:i/>
+          <w:color w:val="000000"/>
+          <w:sz w:val="24"/>
+          <w:rFonts w:ascii="Times New Roman" w:hAnsi="Times New Roman" w:cs="Times New Roman"/>
+        </w:rPr>
+        <w:t>React 18</w:t>
+      </w:r>
+      <w:r>
+        <w:rPr>
+          <w:rFonts w:ascii="Times New Roman" w:hAnsi="Times New Roman"/>
+          <w:b w:val="0"/>
+          <w:i w:val="0"/>
+          <w:color w:val="000000"/>
+          <w:sz w:val="24"/>
+          <w:rFonts w:ascii="Times New Roman" w:hAnsi="Times New Roman" w:cs="Times New Roman"/>
+        </w:rPr>
+        <w:t xml:space="preserve">, </w:t>
+      </w:r>
+      <w:r>
+        <w:rPr>
+          <w:rFonts w:ascii="Times New Roman" w:hAnsi="Times New Roman"/>
+          <w:b w:val="0"/>
+          <w:i/>
+          <w:color w:val="000000"/>
+          <w:sz w:val="24"/>
+          <w:rFonts w:ascii="Times New Roman" w:hAnsi="Times New Roman" w:cs="Times New Roman"/>
+        </w:rPr>
+        <w:t>Inertia.js</w:t>
+      </w:r>
+      <w:r>
+        <w:rPr>
+          <w:rFonts w:ascii="Times New Roman" w:hAnsi="Times New Roman"/>
+          <w:b w:val="0"/>
+          <w:i w:val="0"/>
+          <w:color w:val="000000"/>
+          <w:sz w:val="24"/>
+          <w:rFonts w:ascii="Times New Roman" w:hAnsi="Times New Roman" w:cs="Times New Roman"/>
+        </w:rPr>
+        <w:t xml:space="preserve">, dan </w:t>
+      </w:r>
+      <w:r>
+        <w:rPr>
+          <w:rFonts w:ascii="Times New Roman" w:hAnsi="Times New Roman"/>
+          <w:b w:val="0"/>
+          <w:i/>
+          <w:color w:val="000000"/>
+          <w:sz w:val="24"/>
+          <w:rFonts w:ascii="Times New Roman" w:hAnsi="Times New Roman" w:cs="Times New Roman"/>
+        </w:rPr>
+        <w:t>MySQL InnoDB</w:t>
+      </w:r>
+      <w:r>
+        <w:rPr>
+          <w:rFonts w:ascii="Times New Roman" w:hAnsi="Times New Roman"/>
+          <w:b w:val="0"/>
+          <w:i w:val="0"/>
+          <w:color w:val="000000"/>
+          <w:sz w:val="24"/>
+          <w:rFonts w:ascii="Times New Roman" w:hAnsi="Times New Roman" w:cs="Times New Roman"/>
+        </w:rPr>
+        <w:t xml:space="preserve"> yang dirancang untuk kebutuhan toko kelontong. Grossmart menerapkan antarmuka ramah lansia berstandar </w:t>
+      </w:r>
+      <w:r>
+        <w:rPr>
+          <w:rFonts w:ascii="Times New Roman" w:hAnsi="Times New Roman"/>
+          <w:b w:val="0"/>
+          <w:i/>
+          <w:color w:val="000000"/>
+          <w:sz w:val="24"/>
+          <w:rFonts w:ascii="Times New Roman" w:hAnsi="Times New Roman" w:cs="Times New Roman"/>
+        </w:rPr>
+        <w:t>WCAG 2.1 AAA</w:t>
+      </w:r>
+      <w:r>
+        <w:rPr>
+          <w:rFonts w:ascii="Times New Roman" w:hAnsi="Times New Roman"/>
+          <w:b w:val="0"/>
+          <w:i w:val="0"/>
+          <w:color w:val="000000"/>
+          <w:sz w:val="24"/>
+          <w:rFonts w:ascii="Times New Roman" w:hAnsi="Times New Roman" w:cs="Times New Roman"/>
+        </w:rPr>
+        <w:t xml:space="preserve"> dengan tombol sentuh berukuran minimal 56px, teks kontras tinggi, tombol cepat pecahan Rupiah, dan isyarat audio. Untuk mencegah manipulasi kas, sistem menggunakan alur tutup kasir buta (</w:t>
+      </w:r>
+      <w:r>
+        <w:rPr>
+          <w:rFonts w:ascii="Times New Roman" w:hAnsi="Times New Roman"/>
+          <w:b w:val="0"/>
+          <w:i/>
+          <w:color w:val="000000"/>
+          <w:sz w:val="24"/>
+          <w:rFonts w:ascii="Times New Roman" w:hAnsi="Times New Roman" w:cs="Times New Roman"/>
+        </w:rPr>
         <w:t>blind cash-up</w:t>
       </w:r>
       <w:r>
@@ -309,29 +463,7 @@
           <w:sz w:val="24"/>
           <w:rFonts w:ascii="Times New Roman" w:hAnsi="Times New Roman" w:cs="Times New Roman"/>
         </w:rPr>
-        <w:t xml:space="preserve">). Proposal ini mengusulkan </w:t>
-      </w:r>
-      <w:r>
-        <w:rPr>
-          <w:rFonts w:ascii="Times New Roman" w:hAnsi="Times New Roman"/>
-          <w:b/>
-          <w:i w:val="0"/>
-          <w:color w:val="000000"/>
-          <w:sz w:val="24"/>
-          <w:rFonts w:ascii="Times New Roman" w:hAnsi="Times New Roman" w:cs="Times New Roman"/>
-        </w:rPr>
-        <w:t>Grossmart</w:t>
-      </w:r>
-      <w:r>
-        <w:rPr>
-          <w:rFonts w:ascii="Times New Roman" w:hAnsi="Times New Roman"/>
-          <w:b w:val="0"/>
-          <w:i w:val="0"/>
-          <w:color w:val="000000"/>
-          <w:sz w:val="24"/>
-          <w:rFonts w:ascii="Times New Roman" w:hAnsi="Times New Roman" w:cs="Times New Roman"/>
-        </w:rPr>
-        <w:t>, aplikasi web kasir operasional mandiri (</w:t>
+        <w:t>) dengan kalkulator fisik lembaran uang tanpa menampilkan saldo sistem di layar kasir. Sistem juga memfasilitasi konversi kemasan dus ke eceran (</w:t>
       </w:r>
       <w:r>
         <w:rPr>
@@ -342,18 +474,18 @@
           <w:sz w:val="24"/>
           <w:rFonts w:ascii="Times New Roman" w:hAnsi="Times New Roman" w:cs="Times New Roman"/>
         </w:rPr>
-        <w:t>self-hosted</w:t>
-      </w:r>
-      <w:r>
-        <w:rPr>
-          <w:rFonts w:ascii="Times New Roman" w:hAnsi="Times New Roman"/>
-          <w:b w:val="0"/>
-          <w:i w:val="0"/>
-          <w:color w:val="000000"/>
-          <w:sz w:val="24"/>
-          <w:rFonts w:ascii="Times New Roman" w:hAnsi="Times New Roman" w:cs="Times New Roman"/>
-        </w:rPr>
-        <w:t xml:space="preserve">) berbasis </w:t>
+        <w:t>repack</w:t>
+      </w:r>
+      <w:r>
+        <w:rPr>
+          <w:rFonts w:ascii="Times New Roman" w:hAnsi="Times New Roman"/>
+          <w:b w:val="0"/>
+          <w:i w:val="0"/>
+          <w:color w:val="000000"/>
+          <w:sz w:val="24"/>
+          <w:rFonts w:ascii="Times New Roman" w:hAnsi="Times New Roman" w:cs="Times New Roman"/>
+        </w:rPr>
+        <w:t xml:space="preserve">), pencatatan bon utang langganan, dan penataan data barang titipan warga. Pengujian fungsional otomatis </w:t>
       </w:r>
       <w:r>
         <w:rPr>
@@ -364,18 +496,18 @@
           <w:sz w:val="24"/>
           <w:rFonts w:ascii="Times New Roman" w:hAnsi="Times New Roman" w:cs="Times New Roman"/>
         </w:rPr>
-        <w:t>Laravel 11</w:t>
-      </w:r>
-      <w:r>
-        <w:rPr>
-          <w:rFonts w:ascii="Times New Roman" w:hAnsi="Times New Roman"/>
-          <w:b w:val="0"/>
-          <w:i w:val="0"/>
-          <w:color w:val="000000"/>
-          <w:sz w:val="24"/>
-          <w:rFonts w:ascii="Times New Roman" w:hAnsi="Times New Roman" w:cs="Times New Roman"/>
-        </w:rPr>
-        <w:t xml:space="preserve">, </w:t>
+        <w:t>PHPUnit</w:t>
+      </w:r>
+      <w:r>
+        <w:rPr>
+          <w:rFonts w:ascii="Times New Roman" w:hAnsi="Times New Roman"/>
+          <w:b w:val="0"/>
+          <w:i w:val="0"/>
+          <w:color w:val="000000"/>
+          <w:sz w:val="24"/>
+          <w:rFonts w:ascii="Times New Roman" w:hAnsi="Times New Roman" w:cs="Times New Roman"/>
+        </w:rPr>
+        <w:t xml:space="preserve"> dan uji lapangan pada toko mitra menargetkan pemangkasan waktu rekap harian dari 60 menit menjadi di bawah 15 menit, penekanan selisih kas laci, serta capaian skor </w:t>
       </w:r>
       <w:r>
         <w:rPr>
@@ -386,138 +518,6 @@
           <w:sz w:val="24"/>
           <w:rFonts w:ascii="Times New Roman" w:hAnsi="Times New Roman" w:cs="Times New Roman"/>
         </w:rPr>
-        <w:t>React 18</w:t>
-      </w:r>
-      <w:r>
-        <w:rPr>
-          <w:rFonts w:ascii="Times New Roman" w:hAnsi="Times New Roman"/>
-          <w:b w:val="0"/>
-          <w:i w:val="0"/>
-          <w:color w:val="000000"/>
-          <w:sz w:val="24"/>
-          <w:rFonts w:ascii="Times New Roman" w:hAnsi="Times New Roman" w:cs="Times New Roman"/>
-        </w:rPr>
-        <w:t xml:space="preserve">, </w:t>
-      </w:r>
-      <w:r>
-        <w:rPr>
-          <w:rFonts w:ascii="Times New Roman" w:hAnsi="Times New Roman"/>
-          <w:b w:val="0"/>
-          <w:i/>
-          <w:color w:val="000000"/>
-          <w:sz w:val="24"/>
-          <w:rFonts w:ascii="Times New Roman" w:hAnsi="Times New Roman" w:cs="Times New Roman"/>
-        </w:rPr>
-        <w:t>Inertia.js</w:t>
-      </w:r>
-      <w:r>
-        <w:rPr>
-          <w:rFonts w:ascii="Times New Roman" w:hAnsi="Times New Roman"/>
-          <w:b w:val="0"/>
-          <w:i w:val="0"/>
-          <w:color w:val="000000"/>
-          <w:sz w:val="24"/>
-          <w:rFonts w:ascii="Times New Roman" w:hAnsi="Times New Roman" w:cs="Times New Roman"/>
-        </w:rPr>
-        <w:t xml:space="preserve">, dan </w:t>
-      </w:r>
-      <w:r>
-        <w:rPr>
-          <w:rFonts w:ascii="Times New Roman" w:hAnsi="Times New Roman"/>
-          <w:b w:val="0"/>
-          <w:i/>
-          <w:color w:val="000000"/>
-          <w:sz w:val="24"/>
-          <w:rFonts w:ascii="Times New Roman" w:hAnsi="Times New Roman" w:cs="Times New Roman"/>
-        </w:rPr>
-        <w:t>MySQL InnoDB</w:t>
-      </w:r>
-      <w:r>
-        <w:rPr>
-          <w:rFonts w:ascii="Times New Roman" w:hAnsi="Times New Roman"/>
-          <w:b w:val="0"/>
-          <w:i w:val="0"/>
-          <w:color w:val="000000"/>
-          <w:sz w:val="24"/>
-          <w:rFonts w:ascii="Times New Roman" w:hAnsi="Times New Roman" w:cs="Times New Roman"/>
-        </w:rPr>
-        <w:t xml:space="preserve"> yang dirancang khusus memenuhi kebutuhan warung tradisional. Grossmart memadukan antarmuka ramah lansia berstandar </w:t>
-      </w:r>
-      <w:r>
-        <w:rPr>
-          <w:rFonts w:ascii="Times New Roman" w:hAnsi="Times New Roman"/>
-          <w:b w:val="0"/>
-          <w:i/>
-          <w:color w:val="000000"/>
-          <w:sz w:val="24"/>
-          <w:rFonts w:ascii="Times New Roman" w:hAnsi="Times New Roman" w:cs="Times New Roman"/>
-        </w:rPr>
-        <w:t>WCAG 2.1 AAA</w:t>
-      </w:r>
-      <w:r>
-        <w:rPr>
-          <w:rFonts w:ascii="Times New Roman" w:hAnsi="Times New Roman"/>
-          <w:b w:val="0"/>
-          <w:i w:val="0"/>
-          <w:color w:val="000000"/>
-          <w:sz w:val="24"/>
-          <w:rFonts w:ascii="Times New Roman" w:hAnsi="Times New Roman" w:cs="Times New Roman"/>
-        </w:rPr>
-        <w:t xml:space="preserve"> (tombol sentuh lebar &gt;56px, kontras tinggi, tombol cepat pecahan Rupiah, isyarat suara), alur tutup kasir buta dengan kalkulator hitung fisik uang Rupiah tanpa saldo terbuka di layar, konversi otomatis kemasan dus ke eceran (</w:t>
-      </w:r>
-      <w:r>
-        <w:rPr>
-          <w:rFonts w:ascii="Times New Roman" w:hAnsi="Times New Roman"/>
-          <w:b w:val="0"/>
-          <w:i/>
-          <w:color w:val="000000"/>
-          <w:sz w:val="24"/>
-          <w:rFonts w:ascii="Times New Roman" w:hAnsi="Times New Roman" w:cs="Times New Roman"/>
-        </w:rPr>
-        <w:t>repack</w:t>
-      </w:r>
-      <w:r>
-        <w:rPr>
-          <w:rFonts w:ascii="Times New Roman" w:hAnsi="Times New Roman"/>
-          <w:b w:val="0"/>
-          <w:i w:val="0"/>
-          <w:color w:val="000000"/>
-          <w:sz w:val="24"/>
-          <w:rFonts w:ascii="Times New Roman" w:hAnsi="Times New Roman" w:cs="Times New Roman"/>
-        </w:rPr>
-        <w:t xml:space="preserve">), pencatatan bon utang langganan, serta fondasi data makanan titipan warga. Uji coba fungsional via </w:t>
-      </w:r>
-      <w:r>
-        <w:rPr>
-          <w:rFonts w:ascii="Times New Roman" w:hAnsi="Times New Roman"/>
-          <w:b w:val="0"/>
-          <w:i/>
-          <w:color w:val="000000"/>
-          <w:sz w:val="24"/>
-          <w:rFonts w:ascii="Times New Roman" w:hAnsi="Times New Roman" w:cs="Times New Roman"/>
-        </w:rPr>
-        <w:t>PHPUnit</w:t>
-      </w:r>
-      <w:r>
-        <w:rPr>
-          <w:rFonts w:ascii="Times New Roman" w:hAnsi="Times New Roman"/>
-          <w:b w:val="0"/>
-          <w:i w:val="0"/>
-          <w:color w:val="000000"/>
-          <w:sz w:val="24"/>
-          <w:rFonts w:ascii="Times New Roman" w:hAnsi="Times New Roman" w:cs="Times New Roman"/>
-        </w:rPr>
-        <w:t xml:space="preserve"> dan pengujian lapangan pada toko mitra disiapkan untuk memvalidasi bahwa Grossmart mampu memangkas waktu rekap harian dari 60 menit menjadi &lt;15 menit, meminimalkan selisih kas laci, serta mencapai skor </w:t>
-      </w:r>
-      <w:r>
-        <w:rPr>
-          <w:rFonts w:ascii="Times New Roman" w:hAnsi="Times New Roman"/>
-          <w:b w:val="0"/>
-          <w:i/>
-          <w:color w:val="000000"/>
-          <w:sz w:val="24"/>
-          <w:rFonts w:ascii="Times New Roman" w:hAnsi="Times New Roman" w:cs="Times New Roman"/>
-        </w:rPr>
         <w:t>System Usability Scale</w:t>
       </w:r>
       <w:r>
@@ -529,7 +529,7 @@
           <w:sz w:val="24"/>
           <w:rFonts w:ascii="Times New Roman" w:hAnsi="Times New Roman" w:cs="Times New Roman"/>
         </w:rPr>
-        <w:t xml:space="preserve"> (SUS) &gt; 75 pada kasir lansia.</w:t>
+        <w:t xml:space="preserve"> (SUS) di atas 75.</w:t>
       </w:r>
     </w:p>
     <w:p>
@@ -592,7 +592,7 @@
           <w:sz w:val="24"/>
           <w:rFonts w:ascii="Times New Roman" w:hAnsi="Times New Roman" w:cs="Times New Roman"/>
         </w:rPr>
-        <w:t xml:space="preserve">Proposal ini mengusung judul: </w:t>
+        <w:t xml:space="preserve">Proposal ini memilih judul: </w:t>
       </w:r>
       <w:r>
         <w:rPr>
@@ -631,7 +631,7 @@
           <w:sz w:val="24"/>
           <w:rFonts w:ascii="Times New Roman" w:hAnsi="Times New Roman" w:cs="Times New Roman"/>
         </w:rPr>
-        <w:t>Judul tersebut merangkum tiga fokus utama sistem:</w:t>
+        <w:t>Judul ini mencakup tiga fokus utama:</w:t>
       </w:r>
     </w:p>
     <w:p>
@@ -649,29 +649,7 @@
           <w:sz w:val="24"/>
           <w:rFonts w:ascii="Times New Roman" w:hAnsi="Times New Roman" w:cs="Times New Roman"/>
         </w:rPr>
-        <w:t xml:space="preserve">1. </w:t>
-      </w:r>
-      <w:r>
-        <w:rPr>
-          <w:rFonts w:ascii="Times New Roman" w:hAnsi="Times New Roman"/>
-          <w:b/>
-          <w:i w:val="0"/>
-          <w:color w:val="000000"/>
-          <w:sz w:val="24"/>
-          <w:rFonts w:ascii="Times New Roman" w:hAnsi="Times New Roman" w:cs="Times New Roman"/>
-        </w:rPr>
-        <w:t>Objek dan Sasaran Solusi:</w:t>
-      </w:r>
-      <w:r>
-        <w:rPr>
-          <w:rFonts w:ascii="Times New Roman" w:hAnsi="Times New Roman"/>
-          <w:b w:val="0"/>
-          <w:i w:val="0"/>
-          <w:color w:val="000000"/>
-          <w:sz w:val="24"/>
-          <w:rFonts w:ascii="Times New Roman" w:hAnsi="Times New Roman" w:cs="Times New Roman"/>
-        </w:rPr>
-        <w:t xml:space="preserve"> Toko kelontong mandiri tradisional, dengan fokus kemudahan bagi pemilik dan kasir lansia (50 tahun ke atas) yang mengalami penurunan daya lihat dan kelenturan gerak jari.</w:t>
+        <w:t>1. Sasaran pengguna: Toko kelontong mandiri yang dikelola pemilik dan kasir lanjut usia (50 tahun ke atas) dengan kendala penglihatan serta kelenturan jari.</w:t>
       </w:r>
     </w:p>
     <w:p>
@@ -689,29 +667,7 @@
           <w:sz w:val="24"/>
           <w:rFonts w:ascii="Times New Roman" w:hAnsi="Times New Roman" w:cs="Times New Roman"/>
         </w:rPr>
-        <w:t xml:space="preserve">2. </w:t>
-      </w:r>
-      <w:r>
-        <w:rPr>
-          <w:rFonts w:ascii="Times New Roman" w:hAnsi="Times New Roman"/>
-          <w:b/>
-          <w:i w:val="0"/>
-          <w:color w:val="000000"/>
-          <w:sz w:val="24"/>
-          <w:rFonts w:ascii="Times New Roman" w:hAnsi="Times New Roman" w:cs="Times New Roman"/>
-        </w:rPr>
-        <w:t>Pendekatan dan Pemanfaatan Teknologi:</w:t>
-      </w:r>
-      <w:r>
-        <w:rPr>
-          <w:rFonts w:ascii="Times New Roman" w:hAnsi="Times New Roman"/>
-          <w:b w:val="0"/>
-          <w:i w:val="0"/>
-          <w:color w:val="000000"/>
-          <w:sz w:val="24"/>
-          <w:rFonts w:ascii="Times New Roman" w:hAnsi="Times New Roman" w:cs="Times New Roman"/>
-        </w:rPr>
-        <w:t xml:space="preserve"> Aplikasi web monolitik modern berbasis </w:t>
+        <w:t xml:space="preserve">2. Landasan teknologi: Aplikasi web monolitik berbasis </w:t>
       </w:r>
       <w:r>
         <w:rPr>
@@ -799,29 +755,7 @@
           <w:sz w:val="24"/>
           <w:rFonts w:ascii="Times New Roman" w:hAnsi="Times New Roman" w:cs="Times New Roman"/>
         </w:rPr>
-        <w:t xml:space="preserve">, berformat </w:t>
-      </w:r>
-      <w:r>
-        <w:rPr>
-          <w:rFonts w:ascii="Times New Roman" w:hAnsi="Times New Roman"/>
-          <w:b w:val="0"/>
-          <w:i/>
-          <w:color w:val="000000"/>
-          <w:sz w:val="24"/>
-          <w:rFonts w:ascii="Times New Roman" w:hAnsi="Times New Roman" w:cs="Times New Roman"/>
-        </w:rPr>
-        <w:t>Progressive Web App</w:t>
-      </w:r>
-      <w:r>
-        <w:rPr>
-          <w:rFonts w:ascii="Times New Roman" w:hAnsi="Times New Roman"/>
-          <w:b w:val="0"/>
-          <w:i w:val="0"/>
-          <w:color w:val="000000"/>
-          <w:sz w:val="24"/>
-          <w:rFonts w:ascii="Times New Roman" w:hAnsi="Times New Roman" w:cs="Times New Roman"/>
-        </w:rPr>
-        <w:t xml:space="preserve"> (PWA) lokal mandiri tanpa biaya sewa bulanan.</w:t>
+        <w:t xml:space="preserve"> berformat PWA lokal mandiri tanpa biaya sewa bulanan.</w:t>
       </w:r>
     </w:p>
     <w:p>
@@ -839,29 +773,7 @@
           <w:sz w:val="24"/>
           <w:rFonts w:ascii="Times New Roman" w:hAnsi="Times New Roman" w:cs="Times New Roman"/>
         </w:rPr>
-        <w:t xml:space="preserve">3. </w:t>
-      </w:r>
-      <w:r>
-        <w:rPr>
-          <w:rFonts w:ascii="Times New Roman" w:hAnsi="Times New Roman"/>
-          <w:b/>
-          <w:i w:val="0"/>
-          <w:color w:val="000000"/>
-          <w:sz w:val="24"/>
-          <w:rFonts w:ascii="Times New Roman" w:hAnsi="Times New Roman" w:cs="Times New Roman"/>
-        </w:rPr>
-        <w:t>Tujuan dan Dampak Nyata:</w:t>
-      </w:r>
-      <w:r>
-        <w:rPr>
-          <w:rFonts w:ascii="Times New Roman" w:hAnsi="Times New Roman"/>
-          <w:b w:val="0"/>
-          <w:i w:val="0"/>
-          <w:color w:val="000000"/>
-          <w:sz w:val="24"/>
-          <w:rFonts w:ascii="Times New Roman" w:hAnsi="Times New Roman" w:cs="Times New Roman"/>
-        </w:rPr>
-        <w:t xml:space="preserve"> Mencegah salah hitung kembalian, meniadakan selisih kas laci lewat tutup kasir buta (</w:t>
+        <w:t>3. Target operasional: Mencegah salah hitung kembalian, meniadakan selisih uang laci lewat tutup kasir buta (</w:t>
       </w:r>
       <w:r>
         <w:rPr>
@@ -883,7 +795,7 @@
           <w:sz w:val="24"/>
           <w:rFonts w:ascii="Times New Roman" w:hAnsi="Times New Roman" w:cs="Times New Roman"/>
         </w:rPr>
-        <w:t>), merapikan catatan bon utang langganan dan fondasi pencatatan barang titipan warga, serta mewujudkan kemandirian digital bagi usaha mikro tradisional.</w:t>
+        <w:t>), serta menertibkan catatan bon utang langganan dan barang titipan warga.</w:t>
       </w:r>
     </w:p>
     <w:p>
@@ -918,7 +830,7 @@
           <w:sz w:val="24"/>
           <w:rFonts w:ascii="Times New Roman" w:hAnsi="Times New Roman" w:cs="Times New Roman"/>
         </w:rPr>
-        <w:t>Toko kelontong mandiri menjadi penopang utama perputaran belanja harian warga di kawasan permukiman. Data Asosiasi Pedagang mencatat sekitar 3,9 juta warung kelontong menopang distribusi sembako nasional. Namun, keberadaannya kian terdesak oleh jaringan minimarket waralaba modern dengan sistem kasir otomatis dan pengelolaan stok terpusat. Sebagian besar warung tradisional dikelola pedagang paruh baya hingga lanjut usia yang mengandalkan pembukuan kertas manual.</w:t>
+        <w:t>Toko kelontong mandiri menggerakkan perputaran belanja harian warga di kawasan permukiman. Data Asosiasi Pedagang mencatat sekitar 3,9 juta warung kelontong menopang distribusi sembako nasional. Namun, warung kelontong menghadapi persaingan ketat dari minimarket waralaba yang didukung sistem kasir terpadu dan pengelolaan stok terpusat. Sebagian besar warung tradisional dikelola pedagang paruh baya hingga lanjut usia yang masih mengandalkan pencatatan manual di buku kertas.</w:t>
       </w:r>
     </w:p>
     <w:p>
@@ -935,7 +847,7 @@
           <w:sz w:val="24"/>
           <w:rFonts w:ascii="Times New Roman" w:hAnsi="Times New Roman" w:cs="Times New Roman"/>
         </w:rPr>
-        <w:t>Hasil observasi lapangan pada toko mitra kami di RPTRA Jatinegara (unit gerai/koperasi kelontong komunitas warga, Jl. Swadaya No.12A 7, RT.7/RW.14, Jatinegara, Kec. Cakung, Jakarta Timur, beroperasi selama 10 tahun) yang dikelola oleh [DUMMY_REPLACE: H. Bambang Sudarsono] (58 tahun), mengidentifikasi empat kendala operasional utama:</w:t>
+        <w:t>Observasi lapangan pada toko mitra kami di RPTRA Jatinegara (unit gerai kelontong komunitas warga, Jl. Swadaya No.12A 7, RT.7/RW.14, Jatinegara, Kec. Cakung, Jakarta Timur, beroperasi selama 10 tahun) yang dikelola oleh [DUMMY_REPLACE: H. Bambang Sudarsono] (58 tahun), mengidentifikasi empat kendala operasional utama:</w:t>
       </w:r>
     </w:p>
     <w:p>
@@ -953,29 +865,7 @@
           <w:sz w:val="24"/>
           <w:rFonts w:ascii="Times New Roman" w:hAnsi="Times New Roman" w:cs="Times New Roman"/>
         </w:rPr>
-        <w:t xml:space="preserve">1. </w:t>
-      </w:r>
-      <w:r>
-        <w:rPr>
-          <w:rFonts w:ascii="Times New Roman" w:hAnsi="Times New Roman"/>
-          <w:b/>
-          <w:i w:val="0"/>
-          <w:color w:val="000000"/>
-          <w:sz w:val="24"/>
-          <w:rFonts w:ascii="Times New Roman" w:hAnsi="Times New Roman" w:cs="Times New Roman"/>
-        </w:rPr>
-        <w:t>Mata Cepat Lelah dan Risiko Salah Pencet Tombol:</w:t>
-      </w:r>
-      <w:r>
-        <w:rPr>
-          <w:rFonts w:ascii="Times New Roman" w:hAnsi="Times New Roman"/>
-          <w:b w:val="0"/>
-          <w:i w:val="0"/>
-          <w:color w:val="000000"/>
-          <w:sz w:val="24"/>
-          <w:rFonts w:ascii="Times New Roman" w:hAnsi="Times New Roman" w:cs="Times New Roman"/>
-        </w:rPr>
-        <w:t xml:space="preserve"> Kasir lansia kerap mengalami penurunan daya lihat jarak dekat (rabun dekat) serta kelenturan jari yang berkurang. Layar kalkulator kecil menyulitkan pembacaan angka saat jam ramai pembeli. Salah ketik nominal (misalnya Rp 10.000 terpencet Rp 100.000) atau salah kembalian langsung merugikan toko.</w:t>
+        <w:t>1. Penurunan daya lihat dan risiko salah tekan tombol: Kasir lanjut usia kerap mengalami rabun dekat dan kelenturan jari yang menurun. Layar kalkulator kecil menyulitkan pembacaan angka saat melayani pembeli di jam sibuk. Kesalahan input nominal (misalnya Rp 10.000 terpencet Rp 100.000) atau salah kembalian langsung menimbulkan kerugian bagi toko.</w:t>
       </w:r>
     </w:p>
     <w:p>
@@ -993,29 +883,7 @@
           <w:sz w:val="24"/>
           <w:rFonts w:ascii="Times New Roman" w:hAnsi="Times New Roman" w:cs="Times New Roman"/>
         </w:rPr>
-        <w:t xml:space="preserve">2. </w:t>
-      </w:r>
-      <w:r>
-        <w:rPr>
-          <w:rFonts w:ascii="Times New Roman" w:hAnsi="Times New Roman"/>
-          <w:b/>
-          <w:i w:val="0"/>
-          <w:color w:val="000000"/>
-          <w:sz w:val="24"/>
-          <w:rFonts w:ascii="Times New Roman" w:hAnsi="Times New Roman" w:cs="Times New Roman"/>
-        </w:rPr>
-        <w:t>Kelelahan Rekap Malam dan Selisih Uang Laci:</w:t>
-      </w:r>
-      <w:r>
-        <w:rPr>
-          <w:rFonts w:ascii="Times New Roman" w:hAnsi="Times New Roman"/>
-          <w:b w:val="0"/>
-          <w:i w:val="0"/>
-          <w:color w:val="000000"/>
-          <w:sz w:val="24"/>
-          <w:rFonts w:ascii="Times New Roman" w:hAnsi="Times New Roman" w:cs="Times New Roman"/>
-        </w:rPr>
-        <w:t xml:space="preserve"> Saat toko tutup pukul 21.00 WIB, pemilik menghabiskan 45–60 menit mencocokkan tumpukan nota kertas dengan uang tunai di laci kasir. Rekap manual dalam kondisi lelah kerap menimbulkan selisih uang laci yang sulit dilacak.</w:t>
+        <w:t>2. Beban rekapitulasi malam hari dan selisih uang laci: Saat toko tutup pukul 21.00 WIB, pemilik menghabiskan 45 hingga 60 menit mencocokkan tumpukan nota kertas dengan uang fisik di laci kasir. Rekapitulasi manual saat kondisi fisik lelah kerap menimbulkan selisih uang kas yang sulit dilacak sumber masalahnya.</w:t>
       </w:r>
     </w:p>
     <w:p>
@@ -1033,29 +901,7 @@
           <w:sz w:val="24"/>
           <w:rFonts w:ascii="Times New Roman" w:hAnsi="Times New Roman" w:cs="Times New Roman"/>
         </w:rPr>
-        <w:t xml:space="preserve">3. </w:t>
-      </w:r>
-      <w:r>
-        <w:rPr>
-          <w:rFonts w:ascii="Times New Roman" w:hAnsi="Times New Roman"/>
-          <w:b/>
-          <w:i w:val="0"/>
-          <w:color w:val="000000"/>
-          <w:sz w:val="24"/>
-          <w:rFonts w:ascii="Times New Roman" w:hAnsi="Times New Roman" w:cs="Times New Roman"/>
-        </w:rPr>
-        <w:t>Pencatatan Bon Utang Langganan yang Rawan Rusak dan Hilang:</w:t>
-      </w:r>
-      <w:r>
-        <w:rPr>
-          <w:rFonts w:ascii="Times New Roman" w:hAnsi="Times New Roman"/>
-          <w:b w:val="0"/>
-          <w:i w:val="0"/>
-          <w:color w:val="000000"/>
-          <w:sz w:val="24"/>
-          <w:rFonts w:ascii="Times New Roman" w:hAnsi="Times New Roman" w:cs="Times New Roman"/>
-        </w:rPr>
-        <w:t xml:space="preserve"> Belanja tempo (bon utang) adalah bentuk relasi sosial khas warung bagi tetangga sekitar. Namun, buku catatan kertas mudah basah, sobek, atau terselip. Pemilik kesulitan memantau total utang yang belum lunas dan tanggal jatuh tempo, sehingga modal belanja kulakan sering terganggu.</w:t>
+        <w:t>3. Pencatatan bon utang yang mudah rusak atau hilang: Pembelian tempo (bon utang) sudah menjadi kebiasaan transaksi warga sekitar dengan toko kelontong. Selama ini catatan utang hanya ditulis pada buku kertas yang mudah basah, sobek, atau terselip. Pemilik warung kesulitan memantau sisa utang dan tanggal jatuh tempo, sehingga perputaran modal kulakan sering terganggu.</w:t>
       </w:r>
     </w:p>
     <w:p>
@@ -1073,29 +919,7 @@
           <w:sz w:val="24"/>
           <w:rFonts w:ascii="Times New Roman" w:hAnsi="Times New Roman" w:cs="Times New Roman"/>
         </w:rPr>
-        <w:t xml:space="preserve">4. </w:t>
-      </w:r>
-      <w:r>
-        <w:rPr>
-          <w:rFonts w:ascii="Times New Roman" w:hAnsi="Times New Roman"/>
-          <w:b/>
-          <w:i w:val="0"/>
-          <w:color w:val="000000"/>
-          <w:sz w:val="24"/>
-          <w:rFonts w:ascii="Times New Roman" w:hAnsi="Times New Roman" w:cs="Times New Roman"/>
-        </w:rPr>
-        <w:t>Kerumitan Pembukuan Makanan Titipan Warga (Konsinyasi):</w:t>
-      </w:r>
-      <w:r>
-        <w:rPr>
-          <w:rFonts w:ascii="Times New Roman" w:hAnsi="Times New Roman"/>
-          <w:b w:val="0"/>
-          <w:i w:val="0"/>
-          <w:color w:val="000000"/>
-          <w:sz w:val="24"/>
-          <w:rFonts w:ascii="Times New Roman" w:hAnsi="Times New Roman" w:cs="Times New Roman"/>
-        </w:rPr>
-        <w:t xml:space="preserve"> Warung menjadi andalan warga sekitar untuk menitipkan makanan olahan rumahan (seperti kue basah, kerupuk, atau gorengan). Selama ini, jumlah titipan datang, barang laku, sisa retur, dan bagi hasil hanya dicatat di secarik kertas lepas yang rawan tercecer atau keliru hitung.</w:t>
+        <w:t>4. Pembukuan makanan titipan warga yang tidak teratur: Toko kelontong kerap menerima titipan makanan olahan rumahan dari warga sekitar (seperti kue basah, kerupuk, atau gorengan). Jumlah titipan masuk, barang laku, sisa retur, dan bagi hasil hanya dicatat pada secarik kertas lepas yang rawan hilang atau salah hitung.</w:t>
       </w:r>
     </w:p>
     <w:p>
@@ -1112,7 +936,29 @@
           <w:sz w:val="24"/>
           <w:rFonts w:ascii="Times New Roman" w:hAnsi="Times New Roman" w:cs="Times New Roman"/>
         </w:rPr>
-        <w:t>Aplikasi kasir komersial di pasaran belum cocok untuk warung kelontong karena mematok biaya sewa bulanan (</w:t>
+        <w:t xml:space="preserve">Aplikasi kasir komersial di pasaran belum sesuai untuk warung kelontong karena mengenakan biaya sewa bulanan yang memberatkan margin usaha, menyajikan menu rumit bagi orang tua, serta tidak memiliki mekanisme tutup kasir buta. </w:t>
+      </w:r>
+      <w:r>
+        <w:rPr>
+          <w:rFonts w:ascii="Times New Roman" w:hAnsi="Times New Roman"/>
+          <w:b/>
+          <w:i w:val="0"/>
+          <w:color w:val="000000"/>
+          <w:sz w:val="24"/>
+          <w:rFonts w:ascii="Times New Roman" w:hAnsi="Times New Roman" w:cs="Times New Roman"/>
+        </w:rPr>
+        <w:t>Grossmart</w:t>
+      </w:r>
+      <w:r>
+        <w:rPr>
+          <w:rFonts w:ascii="Times New Roman" w:hAnsi="Times New Roman"/>
+          <w:b w:val="0"/>
+          <w:i w:val="0"/>
+          <w:color w:val="000000"/>
+          <w:sz w:val="24"/>
+          <w:rFonts w:ascii="Times New Roman" w:hAnsi="Times New Roman" w:cs="Times New Roman"/>
+        </w:rPr>
+        <w:t xml:space="preserve"> dikembangkan sebagai sistem kasir mandiri (</w:t>
       </w:r>
       <w:r>
         <w:rPr>
@@ -1123,50 +969,6 @@
           <w:sz w:val="24"/>
           <w:rFonts w:ascii="Times New Roman" w:hAnsi="Times New Roman" w:cs="Times New Roman"/>
         </w:rPr>
-        <w:t>SaaS</w:t>
-      </w:r>
-      <w:r>
-        <w:rPr>
-          <w:rFonts w:ascii="Times New Roman" w:hAnsi="Times New Roman"/>
-          <w:b w:val="0"/>
-          <w:i w:val="0"/>
-          <w:color w:val="000000"/>
-          <w:sz w:val="24"/>
-          <w:rFonts w:ascii="Times New Roman" w:hAnsi="Times New Roman" w:cs="Times New Roman"/>
-        </w:rPr>
-        <w:t xml:space="preserve">) yang menggerus margin tipis pedagang, menyajikan menu rumit bagi orang tua, serta tidak memiliki mekanisme tutup kasir buta. </w:t>
-      </w:r>
-      <w:r>
-        <w:rPr>
-          <w:rFonts w:ascii="Times New Roman" w:hAnsi="Times New Roman"/>
-          <w:b/>
-          <w:i w:val="0"/>
-          <w:color w:val="000000"/>
-          <w:sz w:val="24"/>
-          <w:rFonts w:ascii="Times New Roman" w:hAnsi="Times New Roman" w:cs="Times New Roman"/>
-        </w:rPr>
-        <w:t>Grossmart</w:t>
-      </w:r>
-      <w:r>
-        <w:rPr>
-          <w:rFonts w:ascii="Times New Roman" w:hAnsi="Times New Roman"/>
-          <w:b w:val="0"/>
-          <w:i w:val="0"/>
-          <w:color w:val="000000"/>
-          <w:sz w:val="24"/>
-          <w:rFonts w:ascii="Times New Roman" w:hAnsi="Times New Roman" w:cs="Times New Roman"/>
-        </w:rPr>
-        <w:t xml:space="preserve"> dikembangkan sebagai sistem kasir mandiri (</w:t>
-      </w:r>
-      <w:r>
-        <w:rPr>
-          <w:rFonts w:ascii="Times New Roman" w:hAnsi="Times New Roman"/>
-          <w:b w:val="0"/>
-          <w:i/>
-          <w:color w:val="000000"/>
-          <w:sz w:val="24"/>
-          <w:rFonts w:ascii="Times New Roman" w:hAnsi="Times New Roman" w:cs="Times New Roman"/>
-        </w:rPr>
         <w:t>self-hosted</w:t>
       </w:r>
       <w:r>
@@ -1178,7 +980,7 @@
           <w:sz w:val="24"/>
           <w:rFonts w:ascii="Times New Roman" w:hAnsi="Times New Roman" w:cs="Times New Roman"/>
         </w:rPr>
-        <w:t>) yang memadukan pencatatan transaksi serentak yang aman (ACID) bebas biaya sewa, perlindungan kas laci lewat tutup kasir buta, dan antarmuka ramah lansia.</w:t>
+        <w:t>) tanpa biaya sewa berkala, yang memadukan transaksi aman berprinsip ACID, perlindungan uang kas lewat tutup kasir buta, dan antarmuka ramah pengguna lanjut usia.</w:t>
       </w:r>
     </w:p>
     <w:p>
@@ -1254,7 +1056,7 @@
           <w:sz w:val="24"/>
           <w:rFonts w:ascii="Times New Roman" w:hAnsi="Times New Roman" w:cs="Times New Roman"/>
         </w:rPr>
-        <w:t>) dan catatan riwayat (</w:t>
+        <w:t>) dan catatan aktivitas (</w:t>
       </w:r>
       <w:r>
         <w:rPr>
@@ -1316,7 +1118,7 @@
           <w:sz w:val="24"/>
           <w:rFonts w:ascii="Times New Roman" w:hAnsi="Times New Roman" w:cs="Times New Roman"/>
         </w:rPr>
-        <w:t xml:space="preserve"> dengan tombol sentuh lebar, tulisan kontras tinggi, dan isyarat suara yang mudah dipakai kasir lanjut usia?</w:t>
+        <w:t xml:space="preserve"> dengan tombol sentuh lebar, tulisan kontras tinggi, dan isyarat suara yang mudah digunakan kasir lanjut usia?</w:t>
       </w:r>
     </w:p>
     <w:p>
@@ -1352,29 +1154,7 @@
           <w:sz w:val="24"/>
           <w:rFonts w:ascii="Times New Roman" w:hAnsi="Times New Roman" w:cs="Times New Roman"/>
         </w:rPr>
-        <w:t xml:space="preserve">1. </w:t>
-      </w:r>
-      <w:r>
-        <w:rPr>
-          <w:rFonts w:ascii="Times New Roman" w:hAnsi="Times New Roman"/>
-          <w:b/>
-          <w:i w:val="0"/>
-          <w:color w:val="000000"/>
-          <w:sz w:val="24"/>
-          <w:rFonts w:ascii="Times New Roman" w:hAnsi="Times New Roman" w:cs="Times New Roman"/>
-        </w:rPr>
-        <w:t>Lingkup Entitas:</w:t>
-      </w:r>
-      <w:r>
-        <w:rPr>
-          <w:rFonts w:ascii="Times New Roman" w:hAnsi="Times New Roman"/>
-          <w:b w:val="0"/>
-          <w:i w:val="0"/>
-          <w:color w:val="000000"/>
-          <w:sz w:val="24"/>
-          <w:rFonts w:ascii="Times New Roman" w:hAnsi="Times New Roman" w:cs="Times New Roman"/>
-        </w:rPr>
-        <w:t xml:space="preserve"> Difokuskan pada operasional satu toko fisik mandiri dengan sistem akun lokal (pemilik dan kasir); tidak mencakup jaringan multi-cabang atau waralaba korporat.</w:t>
+        <w:t>1. Lingkup operasional: Difokuskan pada operasional satu toko fisik mandiri dengan sistem akun lokal (pemilik dan kasir), tanpa mencakup sistem multi-cabang atau waralaba korporat.</w:t>
       </w:r>
     </w:p>
     <w:p>
@@ -1392,29 +1172,7 @@
           <w:sz w:val="24"/>
           <w:rFonts w:ascii="Times New Roman" w:hAnsi="Times New Roman" w:cs="Times New Roman"/>
         </w:rPr>
-        <w:t xml:space="preserve">2. </w:t>
-      </w:r>
-      <w:r>
-        <w:rPr>
-          <w:rFonts w:ascii="Times New Roman" w:hAnsi="Times New Roman"/>
-          <w:b/>
-          <w:i w:val="0"/>
-          <w:color w:val="000000"/>
-          <w:sz w:val="24"/>
-          <w:rFonts w:ascii="Times New Roman" w:hAnsi="Times New Roman" w:cs="Times New Roman"/>
-        </w:rPr>
-        <w:t>Infrastruktur Jaringan:</w:t>
-      </w:r>
-      <w:r>
-        <w:rPr>
-          <w:rFonts w:ascii="Times New Roman" w:hAnsi="Times New Roman"/>
-          <w:b w:val="0"/>
-          <w:i w:val="0"/>
-          <w:color w:val="000000"/>
-          <w:sz w:val="24"/>
-          <w:rFonts w:ascii="Times New Roman" w:hAnsi="Times New Roman" w:cs="Times New Roman"/>
-        </w:rPr>
-        <w:t xml:space="preserve"> Beroperasi pada arsitektur web mandiri via jaringan lokal toko (Wi-Fi/LAN) atau peladen privat; verifikasi transaksi diproses terpusat di peladen.</w:t>
+        <w:t>2. Infrastruktur jaringan: Berjalan pada jaringan lokal toko (Wi-Fi/LAN) atau peladen privat mandiri, dengan verifikasi transaksi diproses terpusat di peladen.</w:t>
       </w:r>
     </w:p>
     <w:p>
@@ -1432,29 +1190,7 @@
           <w:sz w:val="24"/>
           <w:rFonts w:ascii="Times New Roman" w:hAnsi="Times New Roman" w:cs="Times New Roman"/>
         </w:rPr>
-        <w:t xml:space="preserve">3. </w:t>
-      </w:r>
-      <w:r>
-        <w:rPr>
-          <w:rFonts w:ascii="Times New Roman" w:hAnsi="Times New Roman"/>
-          <w:b/>
-          <w:i w:val="0"/>
-          <w:color w:val="000000"/>
-          <w:sz w:val="24"/>
-          <w:rFonts w:ascii="Times New Roman" w:hAnsi="Times New Roman" w:cs="Times New Roman"/>
-        </w:rPr>
-        <w:t>Penyimpanan Transaksi:</w:t>
-      </w:r>
-      <w:r>
-        <w:rPr>
-          <w:rFonts w:ascii="Times New Roman" w:hAnsi="Times New Roman"/>
-          <w:b w:val="0"/>
-          <w:i w:val="0"/>
-          <w:color w:val="000000"/>
-          <w:sz w:val="24"/>
-          <w:rFonts w:ascii="Times New Roman" w:hAnsi="Times New Roman" w:cs="Times New Roman"/>
-        </w:rPr>
-        <w:t xml:space="preserve"> </w:t>
+        <w:t xml:space="preserve">3. Penanganan transaksi: </w:t>
       </w:r>
       <w:r>
         <w:rPr>
@@ -1476,7 +1212,7 @@
           <w:sz w:val="24"/>
           <w:rFonts w:ascii="Times New Roman" w:hAnsi="Times New Roman" w:cs="Times New Roman"/>
         </w:rPr>
-        <w:t xml:space="preserve"> PWA difungsikan untuk pemuatan cepat aset statis; setiap pembayaran kasir diverifikasi peladen guna menjamin integritas stok dan kas laci.</w:t>
+        <w:t xml:space="preserve"> PWA difungsikan untuk pemuatan cepat aset statis antarmuka, sedangkan setiap pembayaran kasir diverifikasi langsung oleh peladen guna menjamin integritas stok dan kas laci.</w:t>
       </w:r>
     </w:p>
     <w:p>
@@ -1529,7 +1265,7 @@
           <w:sz w:val="24"/>
           <w:rFonts w:ascii="Times New Roman" w:hAnsi="Times New Roman" w:cs="Times New Roman"/>
         </w:rPr>
-        <w:t>Tujuan rekayasa perangkat lunak Grossmart adalah:</w:t>
+        <w:t>Tujuan perancangan dan implementasi Grossmart adalah:</w:t>
       </w:r>
     </w:p>
     <w:p>
@@ -1547,29 +1283,7 @@
           <w:sz w:val="24"/>
           <w:rFonts w:ascii="Times New Roman" w:hAnsi="Times New Roman" w:cs="Times New Roman"/>
         </w:rPr>
-        <w:t xml:space="preserve">1. </w:t>
-      </w:r>
-      <w:r>
-        <w:rPr>
-          <w:rFonts w:ascii="Times New Roman" w:hAnsi="Times New Roman"/>
-          <w:b/>
-          <w:i w:val="0"/>
-          <w:color w:val="000000"/>
-          <w:sz w:val="24"/>
-          <w:rFonts w:ascii="Times New Roman" w:hAnsi="Times New Roman" w:cs="Times New Roman"/>
-        </w:rPr>
-        <w:t>Membangun Sistem Kasir Operasional Mandiri:</w:t>
-      </w:r>
-      <w:r>
-        <w:rPr>
-          <w:rFonts w:ascii="Times New Roman" w:hAnsi="Times New Roman"/>
-          <w:b w:val="0"/>
-          <w:i w:val="0"/>
-          <w:color w:val="000000"/>
-          <w:sz w:val="24"/>
-          <w:rFonts w:ascii="Times New Roman" w:hAnsi="Times New Roman" w:cs="Times New Roman"/>
-        </w:rPr>
-        <w:t xml:space="preserve"> Mengembangkan aplikasi web berbasis </w:t>
+        <w:t xml:space="preserve">1. Mengembangkan aplikasi kasir operasional mandiri berbasis </w:t>
       </w:r>
       <w:r>
         <w:rPr>
@@ -1657,7 +1371,7 @@
           <w:sz w:val="24"/>
           <w:rFonts w:ascii="Times New Roman" w:hAnsi="Times New Roman" w:cs="Times New Roman"/>
         </w:rPr>
-        <w:t xml:space="preserve"> yang memadukan transaksi kasir cepat, pengelolaan stok, pembukuan bon utang langganan, serta fondasi data barang titipan warga tanpa biaya sewa bulanan.</w:t>
+        <w:t xml:space="preserve"> yang memadukan transaksi kasir cepat, pengelolaan persediaan, pencatatan bon utang langganan, serta fondasi data barang titipan warga tanpa biaya sewa bulanan.</w:t>
       </w:r>
     </w:p>
     <w:p>
@@ -1675,29 +1389,29 @@
           <w:sz w:val="24"/>
           <w:rFonts w:ascii="Times New Roman" w:hAnsi="Times New Roman" w:cs="Times New Roman"/>
         </w:rPr>
-        <w:t xml:space="preserve">2. </w:t>
-      </w:r>
-      <w:r>
-        <w:rPr>
-          <w:rFonts w:ascii="Times New Roman" w:hAnsi="Times New Roman"/>
-          <w:b/>
-          <w:i w:val="0"/>
-          <w:color w:val="000000"/>
-          <w:sz w:val="24"/>
-          <w:rFonts w:ascii="Times New Roman" w:hAnsi="Times New Roman" w:cs="Times New Roman"/>
-        </w:rPr>
-        <w:t>Menghadirkan Perlindungan Uang Laci lewat Tutup Kasir Buta (*Blind Cash-Up*):</w:t>
-      </w:r>
-      <w:r>
-        <w:rPr>
-          <w:rFonts w:ascii="Times New Roman" w:hAnsi="Times New Roman"/>
-          <w:b w:val="0"/>
-          <w:i w:val="0"/>
-          <w:color w:val="000000"/>
-          <w:sz w:val="24"/>
-          <w:rFonts w:ascii="Times New Roman" w:hAnsi="Times New Roman" w:cs="Times New Roman"/>
-        </w:rPr>
-        <w:t xml:space="preserve"> Menerapkan mekanisme tutup kasir di mana saldo akhir sistem disembunyikan dari layar kasir, mewajibkan kasir menghitung fisik uang tunai lembar per lembar pada kalkulator pecahan Rupiah demi menjaga keteraturan dan kejujuran laci kasir.</w:t>
+        <w:t>2. Menerapkan perlindungan uang laci melalui alur tutup kasir buta (</w:t>
+      </w:r>
+      <w:r>
+        <w:rPr>
+          <w:rFonts w:ascii="Times New Roman" w:hAnsi="Times New Roman"/>
+          <w:b w:val="0"/>
+          <w:i/>
+          <w:color w:val="000000"/>
+          <w:sz w:val="24"/>
+          <w:rFonts w:ascii="Times New Roman" w:hAnsi="Times New Roman" w:cs="Times New Roman"/>
+        </w:rPr>
+        <w:t>blind cash-up</w:t>
+      </w:r>
+      <w:r>
+        <w:rPr>
+          <w:rFonts w:ascii="Times New Roman" w:hAnsi="Times New Roman"/>
+          <w:b w:val="0"/>
+          <w:i w:val="0"/>
+          <w:color w:val="000000"/>
+          <w:sz w:val="24"/>
+          <w:rFonts w:ascii="Times New Roman" w:hAnsi="Times New Roman" w:cs="Times New Roman"/>
+        </w:rPr>
+        <w:t>), di mana kasir menghitung fisik lembaran uang tunai menggunakan kalkulator pecahan Rupiah tanpa melihat saldo akhir sistem di layar.</w:t>
       </w:r>
     </w:p>
     <w:p>
@@ -1715,29 +1429,29 @@
           <w:sz w:val="24"/>
           <w:rFonts w:ascii="Times New Roman" w:hAnsi="Times New Roman" w:cs="Times New Roman"/>
         </w:rPr>
-        <w:t xml:space="preserve">3. </w:t>
-      </w:r>
-      <w:r>
-        <w:rPr>
-          <w:rFonts w:ascii="Times New Roman" w:hAnsi="Times New Roman"/>
-          <w:b/>
-          <w:i w:val="0"/>
-          <w:color w:val="000000"/>
-          <w:sz w:val="24"/>
-          <w:rFonts w:ascii="Times New Roman" w:hAnsi="Times New Roman" w:cs="Times New Roman"/>
-        </w:rPr>
-        <w:t>Menerapkan Standar Kemudahan bagi Kasir Lansia (*WCAG 2.1 AAA*):</w:t>
-      </w:r>
-      <w:r>
-        <w:rPr>
-          <w:rFonts w:ascii="Times New Roman" w:hAnsi="Times New Roman"/>
-          <w:b w:val="0"/>
-          <w:i w:val="0"/>
-          <w:color w:val="000000"/>
-          <w:sz w:val="24"/>
-          <w:rFonts w:ascii="Times New Roman" w:hAnsi="Times New Roman" w:cs="Times New Roman"/>
-        </w:rPr>
-        <w:t xml:space="preserve"> Merancang antarmuka ergonomis dengan tombol sentuh minimal 56–64px, huruf dan angka kontras tinggi hingga 44px, tombol cepat lembaran Rupiah, serta isyarat suara penanda aksi bagi kasir berusia 50 tahun ke atas.</w:t>
+        <w:t xml:space="preserve">3. Merancang antarmuka ramah lansia berstandar </w:t>
+      </w:r>
+      <w:r>
+        <w:rPr>
+          <w:rFonts w:ascii="Times New Roman" w:hAnsi="Times New Roman"/>
+          <w:b w:val="0"/>
+          <w:i/>
+          <w:color w:val="000000"/>
+          <w:sz w:val="24"/>
+          <w:rFonts w:ascii="Times New Roman" w:hAnsi="Times New Roman" w:cs="Times New Roman"/>
+        </w:rPr>
+        <w:t>WCAG 2.1 AAA</w:t>
+      </w:r>
+      <w:r>
+        <w:rPr>
+          <w:rFonts w:ascii="Times New Roman" w:hAnsi="Times New Roman"/>
+          <w:b w:val="0"/>
+          <w:i w:val="0"/>
+          <w:color w:val="000000"/>
+          <w:sz w:val="24"/>
+          <w:rFonts w:ascii="Times New Roman" w:hAnsi="Times New Roman" w:cs="Times New Roman"/>
+        </w:rPr>
+        <w:t xml:space="preserve"> dengan tombol sentuh minimal 56–64px, huruf dan angka kontras tinggi hingga 44px, tombol cepat lembaran Rupiah, serta isyarat suara penanda aksi bagi kasir berusia 50 tahun ke atas.</w:t>
       </w:r>
     </w:p>
     <w:p>
@@ -1755,29 +1469,7 @@
           <w:sz w:val="24"/>
           <w:rFonts w:ascii="Times New Roman" w:hAnsi="Times New Roman" w:cs="Times New Roman"/>
         </w:rPr>
-        <w:t xml:space="preserve">4. </w:t>
-      </w:r>
-      <w:r>
-        <w:rPr>
-          <w:rFonts w:ascii="Times New Roman" w:hAnsi="Times New Roman"/>
-          <w:b/>
-          <w:i w:val="0"/>
-          <w:color w:val="000000"/>
-          <w:sz w:val="24"/>
-          <w:rFonts w:ascii="Times New Roman" w:hAnsi="Times New Roman" w:cs="Times New Roman"/>
-        </w:rPr>
-        <w:t>Memvalidasi Keandalan Sistem dan Kepuasan Pengguna:</w:t>
-      </w:r>
-      <w:r>
-        <w:rPr>
-          <w:rFonts w:ascii="Times New Roman" w:hAnsi="Times New Roman"/>
-          <w:b w:val="0"/>
-          <w:i w:val="0"/>
-          <w:color w:val="000000"/>
-          <w:sz w:val="24"/>
-          <w:rFonts w:ascii="Times New Roman" w:hAnsi="Times New Roman" w:cs="Times New Roman"/>
-        </w:rPr>
-        <w:t xml:space="preserve"> Menguji keandalan pencatatan transaksi serentak lewat uji kode otomatis </w:t>
+        <w:t xml:space="preserve">4. Menguji keandalan pencatatan transaksi serentak melalui pengujian otomatis </w:t>
       </w:r>
       <w:r>
         <w:rPr>
@@ -1799,7 +1491,7 @@
           <w:sz w:val="24"/>
           <w:rFonts w:ascii="Times New Roman" w:hAnsi="Times New Roman" w:cs="Times New Roman"/>
         </w:rPr>
-        <w:t xml:space="preserve">, serta mengukur kemudahan penggunaan langsung di warung mitra hingga mencapai target skor </w:t>
+        <w:t xml:space="preserve">, serta mengukur kemudahan operasional langsung di warung mitra hingga mencapai target skor </w:t>
       </w:r>
       <w:r>
         <w:rPr>
@@ -1857,29 +1549,7 @@
           <w:sz w:val="24"/>
           <w:rFonts w:ascii="Times New Roman" w:hAnsi="Times New Roman" w:cs="Times New Roman"/>
         </w:rPr>
-        <w:t xml:space="preserve">1. </w:t>
-      </w:r>
-      <w:r>
-        <w:rPr>
-          <w:rFonts w:ascii="Times New Roman" w:hAnsi="Times New Roman"/>
-          <w:b/>
-          <w:i w:val="0"/>
-          <w:color w:val="000000"/>
-          <w:sz w:val="24"/>
-          <w:rFonts w:ascii="Times New Roman" w:hAnsi="Times New Roman" w:cs="Times New Roman"/>
-        </w:rPr>
-        <w:t>Bagi Pemilik Warung Kelontong:</w:t>
-      </w:r>
-      <w:r>
-        <w:rPr>
-          <w:rFonts w:ascii="Times New Roman" w:hAnsi="Times New Roman"/>
-          <w:b w:val="0"/>
-          <w:i w:val="0"/>
-          <w:color w:val="000000"/>
-          <w:sz w:val="24"/>
-          <w:rFonts w:ascii="Times New Roman" w:hAnsi="Times New Roman" w:cs="Times New Roman"/>
-        </w:rPr>
-        <w:t xml:space="preserve"> Memangkas waktu rekap malam dari 60 menit menjadi &lt;15 menit; mencegah selisih uang laci tanpa jejak; memantau stok menipis dan peringatan barang habis; serta mengamankan perputaran modal usaha lewat catatan bon utang yang tertib.</w:t>
+        <w:t>1. Bagi Pemilik Warung Kelontong: Memangkas durasi rekap malam dari 60 menit menjadi &lt;15 menit, mencegah selisih uang laci yang tidak terlacak, memantau persediaan menipis, serta mengamankan perputaran modal usaha lewat catatan bon utang yang tertib.</w:t>
       </w:r>
     </w:p>
     <w:p>
@@ -1897,29 +1567,7 @@
           <w:sz w:val="24"/>
           <w:rFonts w:ascii="Times New Roman" w:hAnsi="Times New Roman" w:cs="Times New Roman"/>
         </w:rPr>
-        <w:t xml:space="preserve">2. </w:t>
-      </w:r>
-      <w:r>
-        <w:rPr>
-          <w:rFonts w:ascii="Times New Roman" w:hAnsi="Times New Roman"/>
-          <w:b/>
-          <w:i w:val="0"/>
-          <w:color w:val="000000"/>
-          <w:sz w:val="24"/>
-          <w:rFonts w:ascii="Times New Roman" w:hAnsi="Times New Roman" w:cs="Times New Roman"/>
-        </w:rPr>
-        <w:t>Bagi Kasir Berusia Lanjut:</w:t>
-      </w:r>
-      <w:r>
-        <w:rPr>
-          <w:rFonts w:ascii="Times New Roman" w:hAnsi="Times New Roman"/>
-          <w:b w:val="0"/>
-          <w:i w:val="0"/>
-          <w:color w:val="000000"/>
-          <w:sz w:val="24"/>
-          <w:rFonts w:ascii="Times New Roman" w:hAnsi="Times New Roman" w:cs="Times New Roman"/>
-        </w:rPr>
-        <w:t xml:space="preserve"> Mengurangi ketegangan mata dan rasa panik saat melayani pembeli di jam ramai; mencegah salah hitung kembalian lewat tombol uang pas dan pecahan Rupiah; serta melindungi nama baik kasir dari kecurigaan selisih laci.</w:t>
+        <w:t>2. Bagi Kasir Berusia Lanjut: Mengurangi ketegangan mata dan rasa panik saat melayani pembeli di jam ramai, mencegah salah hitung kembalian lewat tombol uang pas dan pecahan Rupiah, serta memberikan rasa tenang karena perhitungan kas laci terverifikasi transparan.</w:t>
       </w:r>
     </w:p>
     <w:p>
@@ -1937,29 +1585,7 @@
           <w:sz w:val="24"/>
           <w:rFonts w:ascii="Times New Roman" w:hAnsi="Times New Roman" w:cs="Times New Roman"/>
         </w:rPr>
-        <w:t xml:space="preserve">3. </w:t>
-      </w:r>
-      <w:r>
-        <w:rPr>
-          <w:rFonts w:ascii="Times New Roman" w:hAnsi="Times New Roman"/>
-          <w:b/>
-          <w:i w:val="0"/>
-          <w:color w:val="000000"/>
-          <w:sz w:val="24"/>
-          <w:rFonts w:ascii="Times New Roman" w:hAnsi="Times New Roman" w:cs="Times New Roman"/>
-        </w:rPr>
-        <w:t>Bagi Warga Penitip Dagangan:</w:t>
-      </w:r>
-      <w:r>
-        <w:rPr>
-          <w:rFonts w:ascii="Times New Roman" w:hAnsi="Times New Roman"/>
-          <w:b w:val="0"/>
-          <w:i w:val="0"/>
-          <w:color w:val="000000"/>
-          <w:sz w:val="24"/>
-          <w:rFonts w:ascii="Times New Roman" w:hAnsi="Times New Roman" w:cs="Times New Roman"/>
-        </w:rPr>
-        <w:t xml:space="preserve"> Memberikan kepastian hitungan barang titipan yang laku dan pembagian hasil penjualan yang rapi serta tepat waktu.</w:t>
+        <w:t>3. Bagi Warga Penitip Dagangan: Memberikan catatan yang pasti mengenai barang titipan yang laku dan pembagian hasil penjualan yang rapi serta tepat waktu.</w:t>
       </w:r>
     </w:p>
     <w:p>
@@ -1977,29 +1603,7 @@
           <w:sz w:val="24"/>
           <w:rFonts w:ascii="Times New Roman" w:hAnsi="Times New Roman" w:cs="Times New Roman"/>
         </w:rPr>
-        <w:t xml:space="preserve">4. </w:t>
-      </w:r>
-      <w:r>
-        <w:rPr>
-          <w:rFonts w:ascii="Times New Roman" w:hAnsi="Times New Roman"/>
-          <w:b/>
-          <w:i w:val="0"/>
-          <w:color w:val="000000"/>
-          <w:sz w:val="24"/>
-          <w:rFonts w:ascii="Times New Roman" w:hAnsi="Times New Roman" w:cs="Times New Roman"/>
-        </w:rPr>
-        <w:t>Bagi Kemandirian Digital Usaha Mikro:</w:t>
-      </w:r>
-      <w:r>
-        <w:rPr>
-          <w:rFonts w:ascii="Times New Roman" w:hAnsi="Times New Roman"/>
-          <w:b w:val="0"/>
-          <w:i w:val="0"/>
-          <w:color w:val="000000"/>
-          <w:sz w:val="24"/>
-          <w:rFonts w:ascii="Times New Roman" w:hAnsi="Times New Roman" w:cs="Times New Roman"/>
-        </w:rPr>
-        <w:t xml:space="preserve"> Menjadi model penerapan teknologi tepat guna bagi warung kelontong mandiri berbasis perangkat lunak terbuka dan kendali penuh atas data transaksi toko sendiri.</w:t>
+        <w:t>4. Bagi Kemandirian Usaha Mikro: Memberikan alternatif solusi digital mandiri berbasis perangkat lunak terbuka tanpa ketergantungan biaya langganan bulanan.</w:t>
       </w:r>
     </w:p>
     <w:p>
@@ -2056,7 +1660,7 @@
           <w:sz w:val="24"/>
           <w:rFonts w:ascii="Times New Roman" w:hAnsi="Times New Roman" w:cs="Times New Roman"/>
         </w:rPr>
-        <w:t xml:space="preserve"> / POS) komersial di Indonesia umumnya berorientasi pada kafe, restoran, butik pakaian, atau minimarket waralaba. Karakteristik warung kelontong tradisional—perputaran uang receh, margin tipis sembako, buku bon utang warga, dan kasir lansia—kerap luput dari perancangan sistem komersial.</w:t>
+        <w:t xml:space="preserve"> / POS) komersial di Indonesia umumnya dirancang untuk kafe, restoran, butik pakaian, atau minimarket waralaba. Karakteristik warung kelontong tradisional, seperti perputaran uang receh, margin tipis sembako, kebiasaan bon utang warga, dan pengelola yang berusia lanjut, jarang diakomodasi oleh sistem komersial.</w:t>
       </w:r>
     </w:p>
     <w:p>
@@ -2073,7 +1677,7 @@
           <w:sz w:val="24"/>
           <w:rFonts w:ascii="Times New Roman" w:hAnsi="Times New Roman" w:cs="Times New Roman"/>
         </w:rPr>
-        <w:t>Berikut tinjauan kritis terhadap lima penyedia aplikasi kasir di Indonesia:</w:t>
+        <w:t>Berikut tinjauan ringkas terhadap lima penyedia aplikasi kasir di Indonesia:</w:t>
       </w:r>
     </w:p>
     <w:p>
@@ -2091,51 +1695,7 @@
           <w:sz w:val="24"/>
           <w:rFonts w:ascii="Times New Roman" w:hAnsi="Times New Roman" w:cs="Times New Roman"/>
         </w:rPr>
-        <w:t xml:space="preserve">1. </w:t>
-      </w:r>
-      <w:r>
-        <w:rPr>
-          <w:rFonts w:ascii="Times New Roman" w:hAnsi="Times New Roman"/>
-          <w:b/>
-          <w:i w:val="0"/>
-          <w:color w:val="000000"/>
-          <w:sz w:val="24"/>
-          <w:rFonts w:ascii="Times New Roman" w:hAnsi="Times New Roman" w:cs="Times New Roman"/>
-        </w:rPr>
-        <w:t>Moka POS (PT Moka Teknologi Indonesia):</w:t>
-      </w:r>
-      <w:r>
-        <w:rPr>
-          <w:rFonts w:ascii="Times New Roman" w:hAnsi="Times New Roman"/>
-          <w:b w:val="0"/>
-          <w:i w:val="0"/>
-          <w:color w:val="000000"/>
-          <w:sz w:val="24"/>
-          <w:rFonts w:ascii="Times New Roman" w:hAnsi="Times New Roman" w:cs="Times New Roman"/>
-        </w:rPr>
-        <w:t xml:space="preserve"> Menawarkan fitur analitik bisnis dan multi-cabang berbasis </w:t>
-      </w:r>
-      <w:r>
-        <w:rPr>
-          <w:rFonts w:ascii="Times New Roman" w:hAnsi="Times New Roman"/>
-          <w:b w:val="0"/>
-          <w:i/>
-          <w:color w:val="000000"/>
-          <w:sz w:val="24"/>
-          <w:rFonts w:ascii="Times New Roman" w:hAnsi="Times New Roman" w:cs="Times New Roman"/>
-        </w:rPr>
-        <w:t>cloud</w:t>
-      </w:r>
-      <w:r>
-        <w:rPr>
-          <w:rFonts w:ascii="Times New Roman" w:hAnsi="Times New Roman"/>
-          <w:b w:val="0"/>
-          <w:i w:val="0"/>
-          <w:color w:val="000000"/>
-          <w:sz w:val="24"/>
-          <w:rFonts w:ascii="Times New Roman" w:hAnsi="Times New Roman" w:cs="Times New Roman"/>
-        </w:rPr>
-        <w:t>. Biaya sewa bulanan (mulai Rp 299.000/bulan) sangat membebani warung. Ketergantungan pada tablet premium (iPad/Android kelas atas) dan tampilan padat menjadikannya tidak ramah bagi pedagang lansia.</w:t>
+        <w:t>1. Moka POS (PT Moka Teknologi Indonesia): Menawarkan fitur analitik bisnis dan pengelolaan multi-cabang berbasis cloud. Biaya sewa bulanan mulai dari Rp 299.000 memberatkan warung berpenghasilan harian. Ketergantungan pada perangkat tablet premium serta tampilan menu yang padat menyulitkan pedagang lanjut usia.</w:t>
       </w:r>
     </w:p>
     <w:p>
@@ -2153,29 +1713,7 @@
           <w:sz w:val="24"/>
           <w:rFonts w:ascii="Times New Roman" w:hAnsi="Times New Roman" w:cs="Times New Roman"/>
         </w:rPr>
-        <w:t xml:space="preserve">2. </w:t>
-      </w:r>
-      <w:r>
-        <w:rPr>
-          <w:rFonts w:ascii="Times New Roman" w:hAnsi="Times New Roman"/>
-          <w:b/>
-          <w:i w:val="0"/>
-          <w:color w:val="000000"/>
-          <w:sz w:val="24"/>
-          <w:rFonts w:ascii="Times New Roman" w:hAnsi="Times New Roman" w:cs="Times New Roman"/>
-        </w:rPr>
-        <w:t>Majoo (PT Majoo Teknologi Indonesia):</w:t>
-      </w:r>
-      <w:r>
-        <w:rPr>
-          <w:rFonts w:ascii="Times New Roman" w:hAnsi="Times New Roman"/>
-          <w:b w:val="0"/>
-          <w:i w:val="0"/>
-          <w:color w:val="000000"/>
-          <w:sz w:val="24"/>
-          <w:rFonts w:ascii="Times New Roman" w:hAnsi="Times New Roman" w:cs="Times New Roman"/>
-        </w:rPr>
-        <w:t xml:space="preserve"> Menyediakan paket aplikasi wirausaha lengkap (kasir, absensi, akuntansi). Kendalanya bagi warung adalah banyaknya menu kafe/resto yang tidak dibutuhkan sehingga membingungkan kasir lansia, skema sewa rutin, serta alur tutup kasir terbuka yang tidak mencegah manipulasi laci kasir.</w:t>
+        <w:t>2. Majoo (PT Majoo Teknologi Indonesia): Menyediakan paket aplikasi wirausaha lengkap (kasir, absensi, akuntansi). Modul kafe dan restoran yang tidak dibutuhkan justru membingungkan kasir warung. Skema sewa rutin dan alur tutup kasir terbuka juga belum mencegah kecocokan saldo kas buatan.</w:t>
       </w:r>
     </w:p>
     <w:p>
@@ -2193,29 +1731,7 @@
           <w:sz w:val="24"/>
           <w:rFonts w:ascii="Times New Roman" w:hAnsi="Times New Roman" w:cs="Times New Roman"/>
         </w:rPr>
-        <w:t xml:space="preserve">3. </w:t>
-      </w:r>
-      <w:r>
-        <w:rPr>
-          <w:rFonts w:ascii="Times New Roman" w:hAnsi="Times New Roman"/>
-          <w:b/>
-          <w:i w:val="0"/>
-          <w:color w:val="000000"/>
-          <w:sz w:val="24"/>
-          <w:rFonts w:ascii="Times New Roman" w:hAnsi="Times New Roman" w:cs="Times New Roman"/>
-        </w:rPr>
-        <w:t>Kasir Pintar (PT Kasir Pintar Internasional):</w:t>
-      </w:r>
-      <w:r>
-        <w:rPr>
-          <w:rFonts w:ascii="Times New Roman" w:hAnsi="Times New Roman"/>
-          <w:b w:val="0"/>
-          <w:i w:val="0"/>
-          <w:color w:val="000000"/>
-          <w:sz w:val="24"/>
-          <w:rFonts w:ascii="Times New Roman" w:hAnsi="Times New Roman" w:cs="Times New Roman"/>
-        </w:rPr>
-        <w:t xml:space="preserve"> Aplikasi kasir ponsel berskema gratis terbatas (</w:t>
+        <w:t>3. Kasir Pintar (PT Kasir Pintar Internasional): Aplikasi kasir ponsel berskema freemium. Versi gratis membatasi katalog hingga 1.000 item barang, padahal variasi sembako warung mencapai 1.500 hingga 3.000 item. Layar ponsel yang sempit dengan tombol rapat membuat kasir lanjut usia rentan salah tekan (</w:t>
       </w:r>
       <w:r>
         <w:rPr>
@@ -2226,28 +1742,6 @@
           <w:sz w:val="24"/>
           <w:rFonts w:ascii="Times New Roman" w:hAnsi="Times New Roman" w:cs="Times New Roman"/>
         </w:rPr>
-        <w:t>freemium</w:t>
-      </w:r>
-      <w:r>
-        <w:rPr>
-          <w:rFonts w:ascii="Times New Roman" w:hAnsi="Times New Roman"/>
-          <w:b w:val="0"/>
-          <w:i w:val="0"/>
-          <w:color w:val="000000"/>
-          <w:sz w:val="24"/>
-          <w:rFonts w:ascii="Times New Roman" w:hAnsi="Times New Roman" w:cs="Times New Roman"/>
-        </w:rPr>
-        <w:t>). Versi gratis membatasi kuota barang (maksimal 1.000 item), padahal variasi sembako warung mencapai 1.500–3.000 item. Layar ponsel sempit dengan tombol rapat menyulitkan jari kasir lansia sehingga rawan salah sentuh tombol (</w:t>
-      </w:r>
-      <w:r>
-        <w:rPr>
-          <w:rFonts w:ascii="Times New Roman" w:hAnsi="Times New Roman"/>
-          <w:b w:val="0"/>
-          <w:i/>
-          <w:color w:val="000000"/>
-          <w:sz w:val="24"/>
-          <w:rFonts w:ascii="Times New Roman" w:hAnsi="Times New Roman" w:cs="Times New Roman"/>
-        </w:rPr>
         <w:t>fat-finger</w:t>
       </w:r>
       <w:r>
@@ -2259,7 +1753,7 @@
           <w:sz w:val="24"/>
           <w:rFonts w:ascii="Times New Roman" w:hAnsi="Times New Roman" w:cs="Times New Roman"/>
         </w:rPr>
-        <w:t>), serta belum memiliki modul pembukuan jajan titipan warga.</w:t>
+        <w:t>), serta belum memiliki modul pencatatan barang titipan warga.</w:t>
       </w:r>
     </w:p>
     <w:p>
@@ -2277,29 +1771,7 @@
           <w:sz w:val="24"/>
           <w:rFonts w:ascii="Times New Roman" w:hAnsi="Times New Roman" w:cs="Times New Roman"/>
         </w:rPr>
-        <w:t xml:space="preserve">4. </w:t>
-      </w:r>
-      <w:r>
-        <w:rPr>
-          <w:rFonts w:ascii="Times New Roman" w:hAnsi="Times New Roman"/>
-          <w:b/>
-          <w:i w:val="0"/>
-          <w:color w:val="000000"/>
-          <w:sz w:val="24"/>
-          <w:rFonts w:ascii="Times New Roman" w:hAnsi="Times New Roman" w:cs="Times New Roman"/>
-        </w:rPr>
-        <w:t>iReap POS (PT Sterling Tulus Cemerlang):</w:t>
-      </w:r>
-      <w:r>
-        <w:rPr>
-          <w:rFonts w:ascii="Times New Roman" w:hAnsi="Times New Roman"/>
-          <w:b w:val="0"/>
-          <w:i w:val="0"/>
-          <w:color w:val="000000"/>
-          <w:sz w:val="24"/>
-          <w:rFonts w:ascii="Times New Roman" w:hAnsi="Times New Roman" w:cs="Times New Roman"/>
-        </w:rPr>
-        <w:t xml:space="preserve"> Solusi kasir ritel berbasis Android. Versi gratis tidak mendukung kasir multi-perangkat tersinkronisasi di satu toko, antarmukanya standar ritel umum tanpa penyesuaian untuk kasir lansia yang mengalami rabun dekat, dan tidak memiliki buku bon utang langganan.</w:t>
+        <w:t>4. iReap POS (PT Sterling Tulus Cemerlang): Solusi kasir ritel berbasis Android. Versi gratis belum mendukung sinkronisasi multi-perangkat di satu toko, antarmuka standar belum disesuaikan untuk pengguna yang mengalami rabun dekat, dan belum memiliki fitur bon utang langganan.</w:t>
       </w:r>
     </w:p>
     <w:p>
@@ -2317,29 +1789,7 @@
           <w:sz w:val="24"/>
           <w:rFonts w:ascii="Times New Roman" w:hAnsi="Times New Roman" w:cs="Times New Roman"/>
         </w:rPr>
-        <w:t xml:space="preserve">5. </w:t>
-      </w:r>
-      <w:r>
-        <w:rPr>
-          <w:rFonts w:ascii="Times New Roman" w:hAnsi="Times New Roman"/>
-          <w:b/>
-          <w:i w:val="0"/>
-          <w:color w:val="000000"/>
-          <w:sz w:val="24"/>
-          <w:rFonts w:ascii="Times New Roman" w:hAnsi="Times New Roman" w:cs="Times New Roman"/>
-        </w:rPr>
-        <w:t>Pawoon (PT Pawoon Solusi Ritel):</w:t>
-      </w:r>
-      <w:r>
-        <w:rPr>
-          <w:rFonts w:ascii="Times New Roman" w:hAnsi="Times New Roman"/>
-          <w:b w:val="0"/>
-          <w:i w:val="0"/>
-          <w:color w:val="000000"/>
-          <w:sz w:val="24"/>
-          <w:rFonts w:ascii="Times New Roman" w:hAnsi="Times New Roman" w:cs="Times New Roman"/>
-        </w:rPr>
-        <w:t xml:space="preserve"> Platform kasir berbasis </w:t>
+        <w:t>5. Pawoon (PT Pawoon Solusi Ritel): Platform kasir berbasis cloud dengan sewa bulanan yang memerlukan koneksi internet stabil sepanjang waktu. Aplikasi ini tidak memiliki fitur pemecahan kemasan eceran dari dus ke saset (</w:t>
       </w:r>
       <w:r>
         <w:rPr>
@@ -2350,28 +1800,6 @@
           <w:sz w:val="24"/>
           <w:rFonts w:ascii="Times New Roman" w:hAnsi="Times New Roman" w:cs="Times New Roman"/>
         </w:rPr>
-        <w:t>cloud</w:t>
-      </w:r>
-      <w:r>
-        <w:rPr>
-          <w:rFonts w:ascii="Times New Roman" w:hAnsi="Times New Roman"/>
-          <w:b w:val="0"/>
-          <w:i w:val="0"/>
-          <w:color w:val="000000"/>
-          <w:sz w:val="24"/>
-          <w:rFonts w:ascii="Times New Roman" w:hAnsi="Times New Roman" w:cs="Times New Roman"/>
-        </w:rPr>
-        <w:t xml:space="preserve"> dengan sewa bulanan. Keterbatasannya mencakup keharusan sambungan internet tanpa henti, tidak ada fitur pemecahan kemasan eceran dari dus ke saset (</w:t>
-      </w:r>
-      <w:r>
-        <w:rPr>
-          <w:rFonts w:ascii="Times New Roman" w:hAnsi="Times New Roman"/>
-          <w:b w:val="0"/>
-          <w:i/>
-          <w:color w:val="000000"/>
-          <w:sz w:val="24"/>
-          <w:rFonts w:ascii="Times New Roman" w:hAnsi="Times New Roman" w:cs="Times New Roman"/>
-        </w:rPr>
         <w:t>repack</w:t>
       </w:r>
       <w:r>
@@ -2383,7 +1811,7 @@
           <w:sz w:val="24"/>
           <w:rFonts w:ascii="Times New Roman" w:hAnsi="Times New Roman" w:cs="Times New Roman"/>
         </w:rPr>
-        <w:t>), dan tiadanya alur tutup kasir buta.</w:t>
+        <w:t>) maupun alur tutup kasir buta.</w:t>
       </w:r>
     </w:p>
     <w:p>
@@ -2436,29 +1864,7 @@
           <w:sz w:val="24"/>
           <w:rFonts w:ascii="Times New Roman" w:hAnsi="Times New Roman" w:cs="Times New Roman"/>
         </w:rPr>
-        <w:t xml:space="preserve">1. </w:t>
-      </w:r>
-      <w:r>
-        <w:rPr>
-          <w:rFonts w:ascii="Times New Roman" w:hAnsi="Times New Roman"/>
-          <w:b/>
-          <w:i w:val="0"/>
-          <w:color w:val="000000"/>
-          <w:sz w:val="24"/>
-          <w:rFonts w:ascii="Times New Roman" w:hAnsi="Times New Roman" w:cs="Times New Roman"/>
-        </w:rPr>
-        <w:t>Tiadanya Tutup Kasir Buta:</w:t>
-      </w:r>
-      <w:r>
-        <w:rPr>
-          <w:rFonts w:ascii="Times New Roman" w:hAnsi="Times New Roman"/>
-          <w:b w:val="0"/>
-          <w:i w:val="0"/>
-          <w:color w:val="000000"/>
-          <w:sz w:val="24"/>
-          <w:rFonts w:ascii="Times New Roman" w:hAnsi="Times New Roman" w:cs="Times New Roman"/>
-        </w:rPr>
-        <w:t xml:space="preserve"> Aplikasi komersial menampilkan ringkasan uang masuk sebelum kasir menghitung fisik kas, membuka celah kasir menyamakan hitungan laci agar cocok dengan sistem.</w:t>
+        <w:t>1. Ketiadaan fitur tutup kasir buta: Aplikasi komersial menampilkan ringkasan uang masuk sebelum kasir menghitung fisik uang, membuka peluang penyesuaian hitungan laci agar cocok dengan angka sistem.</w:t>
       </w:r>
     </w:p>
     <w:p>
@@ -2476,29 +1882,7 @@
           <w:sz w:val="24"/>
           <w:rFonts w:ascii="Times New Roman" w:hAnsi="Times New Roman" w:cs="Times New Roman"/>
         </w:rPr>
-        <w:t xml:space="preserve">2. </w:t>
-      </w:r>
-      <w:r>
-        <w:rPr>
-          <w:rFonts w:ascii="Times New Roman" w:hAnsi="Times New Roman"/>
-          <w:b/>
-          <w:i w:val="0"/>
-          <w:color w:val="000000"/>
-          <w:sz w:val="24"/>
-          <w:rFonts w:ascii="Times New Roman" w:hAnsi="Times New Roman" w:cs="Times New Roman"/>
-        </w:rPr>
-        <w:t>Beban Biaya Sewa Bulanan:</w:t>
-      </w:r>
-      <w:r>
-        <w:rPr>
-          <w:rFonts w:ascii="Times New Roman" w:hAnsi="Times New Roman"/>
-          <w:b w:val="0"/>
-          <w:i w:val="0"/>
-          <w:color w:val="000000"/>
-          <w:sz w:val="24"/>
-          <w:rFonts w:ascii="Times New Roman" w:hAnsi="Times New Roman" w:cs="Times New Roman"/>
-        </w:rPr>
-        <w:t xml:space="preserve"> Skema langganan menyedot margin tipis warung. Pedagang membutuhkan solusi mandiri sekali pasang (</w:t>
+        <w:t>2. Beban biaya langganan bulanan: Skema sewa berkala menggerus margin tipis warung. Pedagang memerlukan solusi mandiri (</w:t>
       </w:r>
       <w:r>
         <w:rPr>
@@ -2520,7 +1904,7 @@
           <w:sz w:val="24"/>
           <w:rFonts w:ascii="Times New Roman" w:hAnsi="Times New Roman" w:cs="Times New Roman"/>
         </w:rPr>
-        <w:t>) tanpa biaya sewa berkala.</w:t>
+        <w:t>) tanpa beban biaya sewa rutin.</w:t>
       </w:r>
     </w:p>
     <w:p>
@@ -2538,29 +1922,7 @@
           <w:sz w:val="24"/>
           <w:rFonts w:ascii="Times New Roman" w:hAnsi="Times New Roman" w:cs="Times New Roman"/>
         </w:rPr>
-        <w:t xml:space="preserve">3. </w:t>
-      </w:r>
-      <w:r>
-        <w:rPr>
-          <w:rFonts w:ascii="Times New Roman" w:hAnsi="Times New Roman"/>
-          <w:b/>
-          <w:i w:val="0"/>
-          <w:color w:val="000000"/>
-          <w:sz w:val="24"/>
-          <w:rFonts w:ascii="Times New Roman" w:hAnsi="Times New Roman" w:cs="Times New Roman"/>
-        </w:rPr>
-        <w:t>Aksesibilitas Lansia Terabaikan:</w:t>
-      </w:r>
-      <w:r>
-        <w:rPr>
-          <w:rFonts w:ascii="Times New Roman" w:hAnsi="Times New Roman"/>
-          <w:b w:val="0"/>
-          <w:i w:val="0"/>
-          <w:color w:val="000000"/>
-          <w:sz w:val="24"/>
-          <w:rFonts w:ascii="Times New Roman" w:hAnsi="Times New Roman" w:cs="Times New Roman"/>
-        </w:rPr>
-        <w:t xml:space="preserve"> Belum ada aplikasi komersial yang menerapkan standar </w:t>
+        <w:t xml:space="preserve">3. Aksesibilitas bagi pengguna lanjut usia belum diakomodasi: Belum ada aplikasi komersial yang menerapkan standar </w:t>
       </w:r>
       <w:r>
         <w:rPr>
@@ -2582,7 +1944,7 @@
           <w:sz w:val="24"/>
           <w:rFonts w:ascii="Times New Roman" w:hAnsi="Times New Roman" w:cs="Times New Roman"/>
         </w:rPr>
-        <w:t xml:space="preserve"> dengan tombol sentuh lebar &gt;56px, teks nominal besar hingga 44px, tombol cepat pecahan Rupiah, dan isyarat suara.</w:t>
+        <w:t>, seperti tombol sentuh lebar &gt;56px, teks nominal hingga 44px, tombol cepat pecahan Rupiah, dan isyarat suara.</w:t>
       </w:r>
     </w:p>
     <w:p>
@@ -2600,29 +1962,7 @@
           <w:sz w:val="24"/>
           <w:rFonts w:ascii="Times New Roman" w:hAnsi="Times New Roman" w:cs="Times New Roman"/>
         </w:rPr>
-        <w:t xml:space="preserve">4. </w:t>
-      </w:r>
-      <w:r>
-        <w:rPr>
-          <w:rFonts w:ascii="Times New Roman" w:hAnsi="Times New Roman"/>
-          <w:b/>
-          <w:i w:val="0"/>
-          <w:color w:val="000000"/>
-          <w:sz w:val="24"/>
-          <w:rFonts w:ascii="Times New Roman" w:hAnsi="Times New Roman" w:cs="Times New Roman"/>
-        </w:rPr>
-        <w:t>Absennya Fitur Khas Warung:</w:t>
-      </w:r>
-      <w:r>
-        <w:rPr>
-          <w:rFonts w:ascii="Times New Roman" w:hAnsi="Times New Roman"/>
-          <w:b w:val="0"/>
-          <w:i w:val="0"/>
-          <w:color w:val="000000"/>
-          <w:sz w:val="24"/>
-          <w:rFonts w:ascii="Times New Roman" w:hAnsi="Times New Roman" w:cs="Times New Roman"/>
-        </w:rPr>
-        <w:t xml:space="preserve"> Transaksi makanan titipan warga, buku bon utang langganan, dan pemecahan kemasan dus ke eceran belum terfasilitasi secara memadai.</w:t>
+        <w:t>4. Kebutuhan operasional khas warung belum terfasilitasi: Transaksi makanan titipan warga, buku bon utang langganan, dan pemecahan kemasan dus ke eceran belum terintegrasi secara praktis.</w:t>
       </w:r>
     </w:p>
     <w:p>
@@ -4724,29 +4064,7 @@
           <w:sz w:val="24"/>
           <w:rFonts w:ascii="Times New Roman" w:hAnsi="Times New Roman" w:cs="Times New Roman"/>
         </w:rPr>
-        <w:t xml:space="preserve">1. </w:t>
-      </w:r>
-      <w:r>
-        <w:rPr>
-          <w:rFonts w:ascii="Times New Roman" w:hAnsi="Times New Roman"/>
-          <w:b/>
-          <w:i w:val="0"/>
-          <w:color w:val="000000"/>
-          <w:sz w:val="24"/>
-          <w:rFonts w:ascii="Times New Roman" w:hAnsi="Times New Roman" w:cs="Times New Roman"/>
-        </w:rPr>
-        <w:t>Desain Ramah Kasir Lanjut Usia:</w:t>
-      </w:r>
-      <w:r>
-        <w:rPr>
-          <w:rFonts w:ascii="Times New Roman" w:hAnsi="Times New Roman"/>
-          <w:b w:val="0"/>
-          <w:i w:val="0"/>
-          <w:color w:val="000000"/>
-          <w:sz w:val="24"/>
-          <w:rFonts w:ascii="Times New Roman" w:hAnsi="Times New Roman" w:cs="Times New Roman"/>
-        </w:rPr>
-        <w:t xml:space="preserve"> Mengadopsi tampilan yang nyaman dengan tombol sentuh besar (56–64px), kontras warna tinggi (rasio &gt;7:1), tombol cepat pecahan resmi Rupiah, serta nada denting bel dan penanda audio (</w:t>
+        <w:t>1. Desain ramah kasir lanjut usia: Mengadopsi tata letak dengan tombol sentuh berukuran 56–64px, rasio kontras warna di atas 7:1, tombol cepat pecahan resmi Rupiah, serta isyarat audio (</w:t>
       </w:r>
       <w:r>
         <w:rPr>
@@ -4812,7 +4130,7 @@
           <w:sz w:val="24"/>
           <w:rFonts w:ascii="Times New Roman" w:hAnsi="Times New Roman" w:cs="Times New Roman"/>
         </w:rPr>
-        <w:t>) guna menuntun kasir lansia secara percaya diri.</w:t>
+        <w:t>) guna memandu kasir lanjut usia bertransaksi secara mudah dan akurat.</w:t>
       </w:r>
     </w:p>
     <w:p>
@@ -4830,29 +4148,29 @@
           <w:sz w:val="24"/>
           <w:rFonts w:ascii="Times New Roman" w:hAnsi="Times New Roman" w:cs="Times New Roman"/>
         </w:rPr>
-        <w:t xml:space="preserve">2. </w:t>
-      </w:r>
-      <w:r>
-        <w:rPr>
-          <w:rFonts w:ascii="Times New Roman" w:hAnsi="Times New Roman"/>
-          <w:b/>
-          <w:i w:val="0"/>
-          <w:color w:val="000000"/>
-          <w:sz w:val="24"/>
-          <w:rFonts w:ascii="Times New Roman" w:hAnsi="Times New Roman" w:cs="Times New Roman"/>
-        </w:rPr>
-        <w:t>Perlindungan Kas Laci lewat Tutup Kasir Buta (*Blind Cash-Up*):</w:t>
-      </w:r>
-      <w:r>
-        <w:rPr>
-          <w:rFonts w:ascii="Times New Roman" w:hAnsi="Times New Roman"/>
-          <w:b w:val="0"/>
-          <w:i w:val="0"/>
-          <w:color w:val="000000"/>
-          <w:sz w:val="24"/>
-          <w:rFonts w:ascii="Times New Roman" w:hAnsi="Times New Roman" w:cs="Times New Roman"/>
-        </w:rPr>
-        <w:t xml:space="preserve"> Kasir menghitung fisik uang tunai dan memasukkan jumlah lembaran ke kalkulator sistem tanpa melihat total saldo sistem di layar, sehingga pencocokan uang kas berlangsung jujur dan transparan bagi pemilik warung.</w:t>
+        <w:t>2. Perlindungan uang kas lewat tutup kasir buta (</w:t>
+      </w:r>
+      <w:r>
+        <w:rPr>
+          <w:rFonts w:ascii="Times New Roman" w:hAnsi="Times New Roman"/>
+          <w:b w:val="0"/>
+          <w:i/>
+          <w:color w:val="000000"/>
+          <w:sz w:val="24"/>
+          <w:rFonts w:ascii="Times New Roman" w:hAnsi="Times New Roman" w:cs="Times New Roman"/>
+        </w:rPr>
+        <w:t>blind cash-up</w:t>
+      </w:r>
+      <w:r>
+        <w:rPr>
+          <w:rFonts w:ascii="Times New Roman" w:hAnsi="Times New Roman"/>
+          <w:b w:val="0"/>
+          <w:i w:val="0"/>
+          <w:color w:val="000000"/>
+          <w:sz w:val="24"/>
+          <w:rFonts w:ascii="Times New Roman" w:hAnsi="Times New Roman" w:cs="Times New Roman"/>
+        </w:rPr>
+        <w:t>): Kasir menghitung fisik uang tunai dan menginput jumlah lembaran ke kalkulator sistem tanpa melihat total saldo sistem di layar, sehingga verifikasi kas laci berlangsung transparan.</w:t>
       </w:r>
     </w:p>
     <w:p>
@@ -4870,29 +4188,7 @@
           <w:sz w:val="24"/>
           <w:rFonts w:ascii="Times New Roman" w:hAnsi="Times New Roman" w:cs="Times New Roman"/>
         </w:rPr>
-        <w:t xml:space="preserve">3. </w:t>
-      </w:r>
-      <w:r>
-        <w:rPr>
-          <w:rFonts w:ascii="Times New Roman" w:hAnsi="Times New Roman"/>
-          <w:b/>
-          <w:i w:val="0"/>
-          <w:color w:val="000000"/>
-          <w:sz w:val="24"/>
-          <w:rFonts w:ascii="Times New Roman" w:hAnsi="Times New Roman" w:cs="Times New Roman"/>
-        </w:rPr>
-        <w:t>Mengakomodasi Praktik Niaga Asli Warung:</w:t>
-      </w:r>
-      <w:r>
-        <w:rPr>
-          <w:rFonts w:ascii="Times New Roman" w:hAnsi="Times New Roman"/>
-          <w:b w:val="0"/>
-          <w:i w:val="0"/>
-          <w:color w:val="000000"/>
-          <w:sz w:val="24"/>
-          <w:rFonts w:ascii="Times New Roman" w:hAnsi="Times New Roman" w:cs="Times New Roman"/>
-        </w:rPr>
-        <w:t xml:space="preserve"> Memfasilitasi fondasi data makanan titipan warga, pencatatan bon utang kasir terhubung pengingat WhatsApp, serta konversi stok dus ke saset eceran secara otomatis.</w:t>
+        <w:t>3. Mengakomodasi operasional khas warung: Mendukung pencatatan makanan titipan warga, buku bon utang kasir yang terhubung dengan pengingat WhatsApp, serta konversi stok otomatis dari kemasan dus ke saset eceran.</w:t>
       </w:r>
     </w:p>
     <w:p>
@@ -4910,29 +4206,7 @@
           <w:sz w:val="24"/>
           <w:rFonts w:ascii="Times New Roman" w:hAnsi="Times New Roman" w:cs="Times New Roman"/>
         </w:rPr>
-        <w:t xml:space="preserve">4. </w:t>
-      </w:r>
-      <w:r>
-        <w:rPr>
-          <w:rFonts w:ascii="Times New Roman" w:hAnsi="Times New Roman"/>
-          <w:b/>
-          <w:i w:val="0"/>
-          <w:color w:val="000000"/>
-          <w:sz w:val="24"/>
-          <w:rFonts w:ascii="Times New Roman" w:hAnsi="Times New Roman" w:cs="Times New Roman"/>
-        </w:rPr>
-        <w:t>Kemandirian Sistem dan Keamanan Data Toko:</w:t>
-      </w:r>
-      <w:r>
-        <w:rPr>
-          <w:rFonts w:ascii="Times New Roman" w:hAnsi="Times New Roman"/>
-          <w:b w:val="0"/>
-          <w:i w:val="0"/>
-          <w:color w:val="000000"/>
-          <w:sz w:val="24"/>
-          <w:rFonts w:ascii="Times New Roman" w:hAnsi="Times New Roman" w:cs="Times New Roman"/>
-        </w:rPr>
-        <w:t xml:space="preserve"> Beroperasi sebagai aplikasi web pada perangkat lokal di warung, bebas biaya sewa berkala, dan menjamin kerahasiaan riwayat transaksi pedagang.</w:t>
+        <w:t>4. Kemandirian sistem dan keamanan data toko: Beroperasi sebagai aplikasi web pada perangkat lokal di warung tanpa biaya langganan berkala, sehingga seluruh riwayat transaksi tersimpan mandiri di komputer toko.</w:t>
       </w:r>
     </w:p>
     <w:p>
@@ -4967,7 +4241,7 @@
           <w:sz w:val="24"/>
           <w:rFonts w:ascii="Times New Roman" w:hAnsi="Times New Roman" w:cs="Times New Roman"/>
         </w:rPr>
-        <w:t xml:space="preserve">Grossmart adalah aplikasi kasir berbasis web yang menggabungkan backend </w:t>
+        <w:t xml:space="preserve">Grossmart adalah aplikasi kasir berbasis web yang memadukan backend </w:t>
       </w:r>
       <w:r>
         <w:rPr>
@@ -5033,7 +4307,7 @@
           <w:sz w:val="24"/>
           <w:rFonts w:ascii="Times New Roman" w:hAnsi="Times New Roman" w:cs="Times New Roman"/>
         </w:rPr>
-        <w:t xml:space="preserve">. Integrasi </w:t>
+        <w:t xml:space="preserve">. Pemanfaatan </w:t>
       </w:r>
       <w:r>
         <w:rPr>
@@ -5055,7 +4329,7 @@
           <w:sz w:val="24"/>
           <w:rFonts w:ascii="Times New Roman" w:hAnsi="Times New Roman" w:cs="Times New Roman"/>
         </w:rPr>
-        <w:t xml:space="preserve"> menghadirkan navigasi halaman tunggal yang gesit tanpa kerumitan pengelolaan API terpisah. Basis data </w:t>
+        <w:t xml:space="preserve"> menghadirkan navigasi halaman tunggal yang responsif tanpa kerumitan pengelolaan API terpisah. Basis data </w:t>
       </w:r>
       <w:r>
         <w:rPr>
@@ -5156,7 +4430,7 @@
           <w:sz w:val="24"/>
           <w:rFonts w:ascii="Times New Roman" w:hAnsi="Times New Roman" w:cs="Times New Roman"/>
         </w:rPr>
-        <w:t xml:space="preserve">Arsitektur Grossmart terbagi menjadi lima komponen terpadu (diagram lengkap pada </w:t>
+        <w:t xml:space="preserve">Arsitektur Grossmart terbagi menjadi lima komponen (diagram lengkap pada </w:t>
       </w:r>
       <w:r>
         <w:rPr>
@@ -5196,29 +4470,7 @@
           <w:sz w:val="24"/>
           <w:rFonts w:ascii="Times New Roman" w:hAnsi="Times New Roman" w:cs="Times New Roman"/>
         </w:rPr>
-        <w:t xml:space="preserve">1. </w:t>
-      </w:r>
-      <w:r>
-        <w:rPr>
-          <w:rFonts w:ascii="Times New Roman" w:hAnsi="Times New Roman"/>
-          <w:b/>
-          <w:i w:val="0"/>
-          <w:color w:val="000000"/>
-          <w:sz w:val="24"/>
-          <w:rFonts w:ascii="Times New Roman" w:hAnsi="Times New Roman" w:cs="Times New Roman"/>
-        </w:rPr>
-        <w:t>Lapisan Antarmuka Pengguna:</w:t>
-      </w:r>
-      <w:r>
-        <w:rPr>
-          <w:rFonts w:ascii="Times New Roman" w:hAnsi="Times New Roman"/>
-          <w:b w:val="0"/>
-          <w:i w:val="0"/>
-          <w:color w:val="000000"/>
-          <w:sz w:val="24"/>
-          <w:rFonts w:ascii="Times New Roman" w:hAnsi="Times New Roman" w:cs="Times New Roman"/>
-        </w:rPr>
-        <w:t xml:space="preserve"> Komponen </w:t>
+        <w:t xml:space="preserve">1. Lapisan antarmuka pengguna: Komponen </w:t>
       </w:r>
       <w:r>
         <w:rPr>
@@ -5240,7 +4492,7 @@
           <w:sz w:val="24"/>
           <w:rFonts w:ascii="Times New Roman" w:hAnsi="Times New Roman" w:cs="Times New Roman"/>
         </w:rPr>
-        <w:t xml:space="preserve"> ramah lansia, tata letak multi-perangkat (komputer kasir, tablet, ponsel), pemindai barcode USB/kamera, dan isyarat suara </w:t>
+        <w:t xml:space="preserve"> ramah lansia, tata letak multi-perangkat (komputer kasir, tablet, ponsel), pemindai barcode USB/kamera, dan isyarat audio </w:t>
       </w:r>
       <w:r>
         <w:rPr>
@@ -5280,29 +4532,7 @@
           <w:sz w:val="24"/>
           <w:rFonts w:ascii="Times New Roman" w:hAnsi="Times New Roman" w:cs="Times New Roman"/>
         </w:rPr>
-        <w:t xml:space="preserve">2. </w:t>
-      </w:r>
-      <w:r>
-        <w:rPr>
-          <w:rFonts w:ascii="Times New Roman" w:hAnsi="Times New Roman"/>
-          <w:b/>
-          <w:i w:val="0"/>
-          <w:color w:val="000000"/>
-          <w:sz w:val="24"/>
-          <w:rFonts w:ascii="Times New Roman" w:hAnsi="Times New Roman" w:cs="Times New Roman"/>
-        </w:rPr>
-        <w:t>Lapisan Akselerasi Cepat (PWA):</w:t>
-      </w:r>
-      <w:r>
-        <w:rPr>
-          <w:rFonts w:ascii="Times New Roman" w:hAnsi="Times New Roman"/>
-          <w:b w:val="0"/>
-          <w:i w:val="0"/>
-          <w:color w:val="000000"/>
-          <w:sz w:val="24"/>
-          <w:rFonts w:ascii="Times New Roman" w:hAnsi="Times New Roman" w:cs="Times New Roman"/>
-        </w:rPr>
-        <w:t xml:space="preserve"> </w:t>
+        <w:t xml:space="preserve">2. Lapisan akselerasi PWA: </w:t>
       </w:r>
       <w:r>
         <w:rPr>
@@ -5342,29 +4572,7 @@
           <w:sz w:val="24"/>
           <w:rFonts w:ascii="Times New Roman" w:hAnsi="Times New Roman" w:cs="Times New Roman"/>
         </w:rPr>
-        <w:t xml:space="preserve">3. </w:t>
-      </w:r>
-      <w:r>
-        <w:rPr>
-          <w:rFonts w:ascii="Times New Roman" w:hAnsi="Times New Roman"/>
-          <w:b/>
-          <w:i w:val="0"/>
-          <w:color w:val="000000"/>
-          <w:sz w:val="24"/>
-          <w:rFonts w:ascii="Times New Roman" w:hAnsi="Times New Roman" w:cs="Times New Roman"/>
-        </w:rPr>
-        <w:t>Lapisan Logika Bisnis (Backend Laravel 11):</w:t>
-      </w:r>
-      <w:r>
-        <w:rPr>
-          <w:rFonts w:ascii="Times New Roman" w:hAnsi="Times New Roman"/>
-          <w:b w:val="0"/>
-          <w:i w:val="0"/>
-          <w:color w:val="000000"/>
-          <w:sz w:val="24"/>
-          <w:rFonts w:ascii="Times New Roman" w:hAnsi="Times New Roman" w:cs="Times New Roman"/>
-        </w:rPr>
-        <w:t xml:space="preserve"> Menangani validasi formulir sisi peladen, pembagian hak akses (</w:t>
+        <w:t>3. Lapisan logika bisnis (Backend Laravel 11): Menangani validasi formulir sisi peladen melalui 21 controller terstruktur (mencakup modul kasir POS, kontrol shift dan laci kas, modul pemilik toko, manajemen profil, serta autentikasi pengguna), pembagian hak akses (</w:t>
       </w:r>
       <w:r>
         <w:rPr>
@@ -5408,29 +4616,7 @@
           <w:sz w:val="24"/>
           <w:rFonts w:ascii="Times New Roman" w:hAnsi="Times New Roman" w:cs="Times New Roman"/>
         </w:rPr>
-        <w:t xml:space="preserve">) dan laba kotor berbasis </w:t>
-      </w:r>
-      <w:r>
-        <w:rPr>
-          <w:rFonts w:ascii="Times New Roman" w:hAnsi="Times New Roman"/>
-          <w:b w:val="0"/>
-          <w:i/>
-          <w:color w:val="000000"/>
-          <w:sz w:val="24"/>
-          <w:rFonts w:ascii="Times New Roman" w:hAnsi="Times New Roman" w:cs="Times New Roman"/>
-        </w:rPr>
-        <w:t>snapshot</w:t>
-      </w:r>
-      <w:r>
-        <w:rPr>
-          <w:rFonts w:ascii="Times New Roman" w:hAnsi="Times New Roman"/>
-          <w:b w:val="0"/>
-          <w:i w:val="0"/>
-          <w:color w:val="000000"/>
-          <w:sz w:val="24"/>
-          <w:rFonts w:ascii="Times New Roman" w:hAnsi="Times New Roman" w:cs="Times New Roman"/>
-        </w:rPr>
-        <w:t xml:space="preserve"> modal transaksi, transaksi serentak ACID, dan catatan riwayat aktivitas (</w:t>
+        <w:t>) dan laba kotor berbasis snapshot modal transaksi, transaksi serentak ACID, dan catatan riwayat aktivitas (</w:t>
       </w:r>
       <w:r>
         <w:rPr>
@@ -5470,29 +4656,7 @@
           <w:sz w:val="24"/>
           <w:rFonts w:ascii="Times New Roman" w:hAnsi="Times New Roman" w:cs="Times New Roman"/>
         </w:rPr>
-        <w:t xml:space="preserve">4. </w:t>
-      </w:r>
-      <w:r>
-        <w:rPr>
-          <w:rFonts w:ascii="Times New Roman" w:hAnsi="Times New Roman"/>
-          <w:b/>
-          <w:i w:val="0"/>
-          <w:color w:val="000000"/>
-          <w:sz w:val="24"/>
-          <w:rFonts w:ascii="Times New Roman" w:hAnsi="Times New Roman" w:cs="Times New Roman"/>
-        </w:rPr>
-        <w:t>Lapisan Basis Data Relasional (MySQL InnoDB):</w:t>
-      </w:r>
-      <w:r>
-        <w:rPr>
-          <w:rFonts w:ascii="Times New Roman" w:hAnsi="Times New Roman"/>
-          <w:b w:val="0"/>
-          <w:i w:val="0"/>
-          <w:color w:val="000000"/>
-          <w:sz w:val="24"/>
-          <w:rFonts w:ascii="Times New Roman" w:hAnsi="Times New Roman" w:cs="Times New Roman"/>
-        </w:rPr>
-        <w:t xml:space="preserve"> Menyimpan 31 tabel kebutuhan domain warung (plus 8 tabel framework Laravel) dengan penegakan integritas kunci asing (</w:t>
+        <w:t>4. Lapisan basis data relasional (MySQL InnoDB): Menyimpan 31 tabel kebutuhan domain warung (plus 8 tabel framework Laravel) dengan penegakan integritas kunci asing (</w:t>
       </w:r>
       <w:r>
         <w:rPr>
@@ -5554,29 +4718,7 @@
           <w:sz w:val="24"/>
           <w:rFonts w:ascii="Times New Roman" w:hAnsi="Times New Roman" w:cs="Times New Roman"/>
         </w:rPr>
-        <w:t xml:space="preserve">5. </w:t>
-      </w:r>
-      <w:r>
-        <w:rPr>
-          <w:rFonts w:ascii="Times New Roman" w:hAnsi="Times New Roman"/>
-          <w:b/>
-          <w:i w:val="0"/>
-          <w:color w:val="000000"/>
-          <w:sz w:val="24"/>
-          <w:rFonts w:ascii="Times New Roman" w:hAnsi="Times New Roman" w:cs="Times New Roman"/>
-        </w:rPr>
-        <w:t>Lapisan Pembatasan Hak Akses:</w:t>
-      </w:r>
-      <w:r>
-        <w:rPr>
-          <w:rFonts w:ascii="Times New Roman" w:hAnsi="Times New Roman"/>
-          <w:b w:val="0"/>
-          <w:i w:val="0"/>
-          <w:color w:val="000000"/>
-          <w:sz w:val="24"/>
-          <w:rFonts w:ascii="Times New Roman" w:hAnsi="Times New Roman" w:cs="Times New Roman"/>
-        </w:rPr>
-        <w:t xml:space="preserve"> Membatasi wewenang Pemilik (</w:t>
+        <w:t>5. Lapisan pembatasan hak akses: Membatasi wewenang Pemilik (</w:t>
       </w:r>
       <w:r>
         <w:rPr>
@@ -6159,7 +5301,7 @@
                 <w:sz w:val="20"/>
                 <w:rFonts w:ascii="Times New Roman" w:hAnsi="Times New Roman" w:cs="Times New Roman"/>
               </w:rPr>
-              <w:t>Laravel 11 + Inertia.js</w:t>
+              <w:t>Laravel 11 + Inertia.js (21 Controller)</w:t>
             </w:r>
           </w:p>
         </w:tc>
@@ -6570,29 +5712,7 @@
           <w:sz w:val="24"/>
           <w:rFonts w:ascii="Times New Roman" w:hAnsi="Times New Roman" w:cs="Times New Roman"/>
         </w:rPr>
-        <w:t xml:space="preserve">1. </w:t>
-      </w:r>
-      <w:r>
-        <w:rPr>
-          <w:rFonts w:ascii="Times New Roman" w:hAnsi="Times New Roman"/>
-          <w:b/>
-          <w:i w:val="0"/>
-          <w:color w:val="000000"/>
-          <w:sz w:val="24"/>
-          <w:rFonts w:ascii="Times New Roman" w:hAnsi="Times New Roman" w:cs="Times New Roman"/>
-        </w:rPr>
-        <w:t>Modul Transaksi Kasir POS:</w:t>
-      </w:r>
-      <w:r>
-        <w:rPr>
-          <w:rFonts w:ascii="Times New Roman" w:hAnsi="Times New Roman"/>
-          <w:b w:val="0"/>
-          <w:i w:val="0"/>
-          <w:color w:val="000000"/>
-          <w:sz w:val="24"/>
-          <w:rFonts w:ascii="Times New Roman" w:hAnsi="Times New Roman" w:cs="Times New Roman"/>
-        </w:rPr>
-        <w:t xml:space="preserve"> Pemindaian barcode cepat, pencarian nama barang praktis, simpan keranjang sementara (tombol F3 saat pembeli menambah belanjaan), serta dialog pembayaran dengan tombol uang pas dan pecahan lembaran Rupiah.</w:t>
+        <w:t>1. Modul Transaksi Kasir POS: Pemindaian barcode cepat, pencarian nama barang praktis, simpan keranjang sementara (tombol F3 saat pembeli menambah belanjaan), serta dialog pembayaran dengan tombol uang pas dan pecahan lembaran Rupiah.</w:t>
       </w:r>
     </w:p>
     <w:p>
@@ -6610,29 +5730,29 @@
           <w:sz w:val="24"/>
           <w:rFonts w:ascii="Times New Roman" w:hAnsi="Times New Roman" w:cs="Times New Roman"/>
         </w:rPr>
-        <w:t xml:space="preserve">2. </w:t>
-      </w:r>
-      <w:r>
-        <w:rPr>
-          <w:rFonts w:ascii="Times New Roman" w:hAnsi="Times New Roman"/>
-          <w:b/>
-          <w:i w:val="0"/>
-          <w:color w:val="000000"/>
-          <w:sz w:val="24"/>
-          <w:rFonts w:ascii="Times New Roman" w:hAnsi="Times New Roman" w:cs="Times New Roman"/>
-        </w:rPr>
-        <w:t>Modul Shift dan Tutup Kasir Buta (*Blind Cash-Up*):</w:t>
-      </w:r>
-      <w:r>
-        <w:rPr>
-          <w:rFonts w:ascii="Times New Roman" w:hAnsi="Times New Roman"/>
-          <w:b w:val="0"/>
-          <w:i w:val="0"/>
-          <w:color w:val="000000"/>
-          <w:sz w:val="24"/>
-          <w:rFonts w:ascii="Times New Roman" w:hAnsi="Times New Roman" w:cs="Times New Roman"/>
-        </w:rPr>
-        <w:t xml:space="preserve"> Buka shift dengan mencatat modal awal receh di laci, setor kas aman ke pemilik (</w:t>
+        <w:t>2. Modul Shift dan Tutup Kasir Buta (</w:t>
+      </w:r>
+      <w:r>
+        <w:rPr>
+          <w:rFonts w:ascii="Times New Roman" w:hAnsi="Times New Roman"/>
+          <w:b w:val="0"/>
+          <w:i/>
+          <w:color w:val="000000"/>
+          <w:sz w:val="24"/>
+          <w:rFonts w:ascii="Times New Roman" w:hAnsi="Times New Roman" w:cs="Times New Roman"/>
+        </w:rPr>
+        <w:t>Blind Cash-Up</w:t>
+      </w:r>
+      <w:r>
+        <w:rPr>
+          <w:rFonts w:ascii="Times New Roman" w:hAnsi="Times New Roman"/>
+          <w:b w:val="0"/>
+          <w:i w:val="0"/>
+          <w:color w:val="000000"/>
+          <w:sz w:val="24"/>
+          <w:rFonts w:ascii="Times New Roman" w:hAnsi="Times New Roman" w:cs="Times New Roman"/>
+        </w:rPr>
+        <w:t>): Buka shift dengan mencatat modal awal receh di laci, setor kas aman ke pemilik (</w:t>
       </w:r>
       <w:r>
         <w:rPr>
@@ -6672,29 +5792,29 @@
           <w:sz w:val="24"/>
           <w:rFonts w:ascii="Times New Roman" w:hAnsi="Times New Roman" w:cs="Times New Roman"/>
         </w:rPr>
-        <w:t xml:space="preserve">3. </w:t>
-      </w:r>
-      <w:r>
-        <w:rPr>
-          <w:rFonts w:ascii="Times New Roman" w:hAnsi="Times New Roman"/>
-          <w:b/>
-          <w:i w:val="0"/>
-          <w:color w:val="000000"/>
-          <w:sz w:val="24"/>
-          <w:rFonts w:ascii="Times New Roman" w:hAnsi="Times New Roman" w:cs="Times New Roman"/>
-        </w:rPr>
-        <w:t>Modul Pengelolaan Barang dan Eceran (*Repack*):</w:t>
-      </w:r>
-      <w:r>
-        <w:rPr>
-          <w:rFonts w:ascii="Times New Roman" w:hAnsi="Times New Roman"/>
-          <w:b w:val="0"/>
-          <w:i w:val="0"/>
-          <w:color w:val="000000"/>
-          <w:sz w:val="24"/>
-          <w:rFonts w:ascii="Times New Roman" w:hAnsi="Times New Roman" w:cs="Times New Roman"/>
-        </w:rPr>
-        <w:t xml:space="preserve"> Pengelolaan katalog sembako, harga grosir bertingkat, pemecahan kemasan dus ke saset eceran otomatis, serta pencatatan buku barang rusak dan kedaluwarsa.</w:t>
+        <w:t>3. Modul Pengelolaan Barang dan Eceran (</w:t>
+      </w:r>
+      <w:r>
+        <w:rPr>
+          <w:rFonts w:ascii="Times New Roman" w:hAnsi="Times New Roman"/>
+          <w:b w:val="0"/>
+          <w:i/>
+          <w:color w:val="000000"/>
+          <w:sz w:val="24"/>
+          <w:rFonts w:ascii="Times New Roman" w:hAnsi="Times New Roman" w:cs="Times New Roman"/>
+        </w:rPr>
+        <w:t>Repack</w:t>
+      </w:r>
+      <w:r>
+        <w:rPr>
+          <w:rFonts w:ascii="Times New Roman" w:hAnsi="Times New Roman"/>
+          <w:b w:val="0"/>
+          <w:i w:val="0"/>
+          <w:color w:val="000000"/>
+          <w:sz w:val="24"/>
+          <w:rFonts w:ascii="Times New Roman" w:hAnsi="Times New Roman" w:cs="Times New Roman"/>
+        </w:rPr>
+        <w:t>): Pengelolaan katalog sembako, harga grosir bertingkat, pemecahan kemasan dus ke saset eceran otomatis, serta pencatatan barang rusak dan kedaluwarsa.</w:t>
       </w:r>
     </w:p>
     <w:p>
@@ -6712,29 +5832,7 @@
           <w:sz w:val="24"/>
           <w:rFonts w:ascii="Times New Roman" w:hAnsi="Times New Roman" w:cs="Times New Roman"/>
         </w:rPr>
-        <w:t xml:space="preserve">4. </w:t>
-      </w:r>
-      <w:r>
-        <w:rPr>
-          <w:rFonts w:ascii="Times New Roman" w:hAnsi="Times New Roman"/>
-          <w:b/>
-          <w:i w:val="0"/>
-          <w:color w:val="000000"/>
-          <w:sz w:val="24"/>
-          <w:rFonts w:ascii="Times New Roman" w:hAnsi="Times New Roman" w:cs="Times New Roman"/>
-        </w:rPr>
-        <w:t>Fondasi Data Makanan Titipan Warga (Konsinyasi):</w:t>
-      </w:r>
-      <w:r>
-        <w:rPr>
-          <w:rFonts w:ascii="Times New Roman" w:hAnsi="Times New Roman"/>
-          <w:b w:val="0"/>
-          <w:i w:val="0"/>
-          <w:color w:val="000000"/>
-          <w:sz w:val="24"/>
-          <w:rFonts w:ascii="Times New Roman" w:hAnsi="Times New Roman" w:cs="Times New Roman"/>
-        </w:rPr>
-        <w:t xml:space="preserve"> Skema data relasional untuk mencatat warga yang menitip, harga titip, komisi warung, dan bagi hasil penjualan yang disiapkan untuk tahap antarmuka lanjutan.</w:t>
+        <w:t>4. Fondasi Data Makanan Titipan Warga (Konsinyasi): Skema data relasional untuk mencatat warga yang menitip, harga titip, komisi warung, dan bagi hasil penjualan yang disiapkan untuk tahap antarmuka lanjutan.</w:t>
       </w:r>
     </w:p>
     <w:p>
@@ -6752,29 +5850,7 @@
           <w:sz w:val="24"/>
           <w:rFonts w:ascii="Times New Roman" w:hAnsi="Times New Roman" w:cs="Times New Roman"/>
         </w:rPr>
-        <w:t xml:space="preserve">5. </w:t>
-      </w:r>
-      <w:r>
-        <w:rPr>
-          <w:rFonts w:ascii="Times New Roman" w:hAnsi="Times New Roman"/>
-          <w:b/>
-          <w:i w:val="0"/>
-          <w:color w:val="000000"/>
-          <w:sz w:val="24"/>
-          <w:rFonts w:ascii="Times New Roman" w:hAnsi="Times New Roman" w:cs="Times New Roman"/>
-        </w:rPr>
-        <w:t>Modul Buku Bon Utang Langganan (Piutang):</w:t>
-      </w:r>
-      <w:r>
-        <w:rPr>
-          <w:rFonts w:ascii="Times New Roman" w:hAnsi="Times New Roman"/>
-          <w:b w:val="0"/>
-          <w:i w:val="0"/>
-          <w:color w:val="000000"/>
-          <w:sz w:val="24"/>
-          <w:rFonts w:ascii="Times New Roman" w:hAnsi="Times New Roman" w:cs="Times New Roman"/>
-        </w:rPr>
-        <w:t xml:space="preserve"> Pencatatan bon utang langsung di layar kasir, pengingat jatuh tempo via WhatsApp, dengan skema cicilan bertahap yang disiapkan pada basis data.</w:t>
+        <w:t>5. Modul Buku Bon Utang Langganan (Piutang): Pencatatan bon utang langsung di layar kasir, pengingat jatuh tempo via WhatsApp, dengan skema cicilan bertahap yang disiapkan pada basis data.</w:t>
       </w:r>
     </w:p>
     <w:p>
@@ -6792,29 +5868,7 @@
           <w:sz w:val="24"/>
           <w:rFonts w:ascii="Times New Roman" w:hAnsi="Times New Roman" w:cs="Times New Roman"/>
         </w:rPr>
-        <w:t xml:space="preserve">6. </w:t>
-      </w:r>
-      <w:r>
-        <w:rPr>
-          <w:rFonts w:ascii="Times New Roman" w:hAnsi="Times New Roman"/>
-          <w:b/>
-          <w:i w:val="0"/>
-          <w:color w:val="000000"/>
-          <w:sz w:val="24"/>
-          <w:rFonts w:ascii="Times New Roman" w:hAnsi="Times New Roman" w:cs="Times New Roman"/>
-        </w:rPr>
-        <w:t>Modul Dasbor dan Laporan Pemilik:</w:t>
-      </w:r>
-      <w:r>
-        <w:rPr>
-          <w:rFonts w:ascii="Times New Roman" w:hAnsi="Times New Roman"/>
-          <w:b w:val="0"/>
-          <w:i w:val="0"/>
-          <w:color w:val="000000"/>
-          <w:sz w:val="24"/>
-          <w:rFonts w:ascii="Times New Roman" w:hAnsi="Times New Roman" w:cs="Times New Roman"/>
-        </w:rPr>
-        <w:t xml:space="preserve"> Ringkasan omzet harian, laba kotor toko, laporan selisih kas shift, mutasi keluar-masuk stok, serta rekaman audit operasional toko.</w:t>
+        <w:t>6. Modul Dasbor dan Laporan Pemilik: Ringkasan omzet harian, laba kotor toko, laporan selisih kas shift, mutasi keluar-masuk stok, serta rekaman audit operasional toko.</w:t>
       </w:r>
     </w:p>
     <w:p>
@@ -6849,7 +5903,7 @@
           <w:sz w:val="24"/>
           <w:rFonts w:ascii="Times New Roman" w:hAnsi="Times New Roman" w:cs="Times New Roman"/>
         </w:rPr>
-        <w:t>Sistem mengelola 32 model Eloquent yang memetakan 31 tabel domain bisnis (plus 8 tabel framework Laravel):</w:t>
+        <w:t>Sistem mengelola 32 model Eloquent yang memetakan 31 tabel kebutuhan domain warung (plus 8 tabel framework Laravel):</w:t>
       </w:r>
     </w:p>
     <w:p>
@@ -6867,29 +5921,7 @@
           <w:sz w:val="24"/>
           <w:rFonts w:ascii="Times New Roman" w:hAnsi="Times New Roman" w:cs="Times New Roman"/>
         </w:rPr>
-        <w:t xml:space="preserve">• </w:t>
-      </w:r>
-      <w:r>
-        <w:rPr>
-          <w:rFonts w:ascii="Times New Roman" w:hAnsi="Times New Roman"/>
-          <w:b/>
-          <w:i w:val="0"/>
-          <w:color w:val="000000"/>
-          <w:sz w:val="24"/>
-          <w:rFonts w:ascii="Times New Roman" w:hAnsi="Times New Roman" w:cs="Times New Roman"/>
-        </w:rPr>
-        <w:t>Transaksi &amp; Pembayaran:</w:t>
-      </w:r>
-      <w:r>
-        <w:rPr>
-          <w:rFonts w:ascii="Times New Roman" w:hAnsi="Times New Roman"/>
-          <w:b w:val="0"/>
-          <w:i w:val="0"/>
-          <w:color w:val="000000"/>
-          <w:sz w:val="24"/>
-          <w:rFonts w:ascii="Times New Roman" w:hAnsi="Times New Roman" w:cs="Times New Roman"/>
-        </w:rPr>
-        <w:t xml:space="preserve"> </w:t>
+        <w:t xml:space="preserve">• Transaksi dan pembayaran: </w:t>
       </w:r>
       <w:r>
         <w:rPr>
@@ -7017,29 +6049,7 @@
           <w:sz w:val="24"/>
           <w:rFonts w:ascii="Times New Roman" w:hAnsi="Times New Roman" w:cs="Times New Roman"/>
         </w:rPr>
-        <w:t xml:space="preserve">• </w:t>
-      </w:r>
-      <w:r>
-        <w:rPr>
-          <w:rFonts w:ascii="Times New Roman" w:hAnsi="Times New Roman"/>
-          <w:b/>
-          <w:i w:val="0"/>
-          <w:color w:val="000000"/>
-          <w:sz w:val="24"/>
-          <w:rFonts w:ascii="Times New Roman" w:hAnsi="Times New Roman" w:cs="Times New Roman"/>
-        </w:rPr>
-        <w:t>Kasir &amp; Kontrol Shift:</w:t>
-      </w:r>
-      <w:r>
-        <w:rPr>
-          <w:rFonts w:ascii="Times New Roman" w:hAnsi="Times New Roman"/>
-          <w:b w:val="0"/>
-          <w:i w:val="0"/>
-          <w:color w:val="000000"/>
-          <w:sz w:val="24"/>
-          <w:rFonts w:ascii="Times New Roman" w:hAnsi="Times New Roman" w:cs="Times New Roman"/>
-        </w:rPr>
-        <w:t xml:space="preserve"> </w:t>
+        <w:t xml:space="preserve">• Kasir dan kontrol shift: </w:t>
       </w:r>
       <w:r>
         <w:rPr>
@@ -7145,29 +6155,7 @@
           <w:sz w:val="24"/>
           <w:rFonts w:ascii="Times New Roman" w:hAnsi="Times New Roman" w:cs="Times New Roman"/>
         </w:rPr>
-        <w:t xml:space="preserve">• </w:t>
-      </w:r>
-      <w:r>
-        <w:rPr>
-          <w:rFonts w:ascii="Times New Roman" w:hAnsi="Times New Roman"/>
-          <w:b/>
-          <w:i w:val="0"/>
-          <w:color w:val="000000"/>
-          <w:sz w:val="24"/>
-          <w:rFonts w:ascii="Times New Roman" w:hAnsi="Times New Roman" w:cs="Times New Roman"/>
-        </w:rPr>
-        <w:t>Produk &amp; Stok:</w:t>
-      </w:r>
-      <w:r>
-        <w:rPr>
-          <w:rFonts w:ascii="Times New Roman" w:hAnsi="Times New Roman"/>
-          <w:b w:val="0"/>
-          <w:i w:val="0"/>
-          <w:color w:val="000000"/>
-          <w:sz w:val="24"/>
-          <w:rFonts w:ascii="Times New Roman" w:hAnsi="Times New Roman" w:cs="Times New Roman"/>
-        </w:rPr>
-        <w:t xml:space="preserve"> </w:t>
+        <w:t xml:space="preserve">• Produk dan stok: </w:t>
       </w:r>
       <w:r>
         <w:rPr>
@@ -7361,29 +6349,7 @@
           <w:sz w:val="24"/>
           <w:rFonts w:ascii="Times New Roman" w:hAnsi="Times New Roman" w:cs="Times New Roman"/>
         </w:rPr>
-        <w:t xml:space="preserve">• </w:t>
-      </w:r>
-      <w:r>
-        <w:rPr>
-          <w:rFonts w:ascii="Times New Roman" w:hAnsi="Times New Roman"/>
-          <w:b/>
-          <w:i w:val="0"/>
-          <w:color w:val="000000"/>
-          <w:sz w:val="24"/>
-          <w:rFonts w:ascii="Times New Roman" w:hAnsi="Times New Roman" w:cs="Times New Roman"/>
-        </w:rPr>
-        <w:t>Kulakan &amp; Pembelian:</w:t>
-      </w:r>
-      <w:r>
-        <w:rPr>
-          <w:rFonts w:ascii="Times New Roman" w:hAnsi="Times New Roman"/>
-          <w:b w:val="0"/>
-          <w:i w:val="0"/>
-          <w:color w:val="000000"/>
-          <w:sz w:val="24"/>
-          <w:rFonts w:ascii="Times New Roman" w:hAnsi="Times New Roman" w:cs="Times New Roman"/>
-        </w:rPr>
-        <w:t xml:space="preserve"> </w:t>
+        <w:t xml:space="preserve">• Kulakan dan pembelian: </w:t>
       </w:r>
       <w:r>
         <w:rPr>
@@ -7533,29 +6499,7 @@
           <w:sz w:val="24"/>
           <w:rFonts w:ascii="Times New Roman" w:hAnsi="Times New Roman" w:cs="Times New Roman"/>
         </w:rPr>
-        <w:t xml:space="preserve">• </w:t>
-      </w:r>
-      <w:r>
-        <w:rPr>
-          <w:rFonts w:ascii="Times New Roman" w:hAnsi="Times New Roman"/>
-          <w:b/>
-          <w:i w:val="0"/>
-          <w:color w:val="000000"/>
-          <w:sz w:val="24"/>
-          <w:rFonts w:ascii="Times New Roman" w:hAnsi="Times New Roman" w:cs="Times New Roman"/>
-        </w:rPr>
-        <w:t>Pelanggan &amp; Bon Utang:</w:t>
-      </w:r>
-      <w:r>
-        <w:rPr>
-          <w:rFonts w:ascii="Times New Roman" w:hAnsi="Times New Roman"/>
-          <w:b w:val="0"/>
-          <w:i w:val="0"/>
-          <w:color w:val="000000"/>
-          <w:sz w:val="24"/>
-          <w:rFonts w:ascii="Times New Roman" w:hAnsi="Times New Roman" w:cs="Times New Roman"/>
-        </w:rPr>
-        <w:t xml:space="preserve"> </w:t>
+        <w:t xml:space="preserve">• Pelanggan dan bon utang: </w:t>
       </w:r>
       <w:r>
         <w:rPr>
@@ -7661,29 +6605,7 @@
           <w:sz w:val="24"/>
           <w:rFonts w:ascii="Times New Roman" w:hAnsi="Times New Roman" w:cs="Times New Roman"/>
         </w:rPr>
-        <w:t xml:space="preserve">• </w:t>
-      </w:r>
-      <w:r>
-        <w:rPr>
-          <w:rFonts w:ascii="Times New Roman" w:hAnsi="Times New Roman"/>
-          <w:b/>
-          <w:i w:val="0"/>
-          <w:color w:val="000000"/>
-          <w:sz w:val="24"/>
-          <w:rFonts w:ascii="Times New Roman" w:hAnsi="Times New Roman" w:cs="Times New Roman"/>
-        </w:rPr>
-        <w:t>Makanan Titipan Warga:</w:t>
-      </w:r>
-      <w:r>
-        <w:rPr>
-          <w:rFonts w:ascii="Times New Roman" w:hAnsi="Times New Roman"/>
-          <w:b w:val="0"/>
-          <w:i w:val="0"/>
-          <w:color w:val="000000"/>
-          <w:sz w:val="24"/>
-          <w:rFonts w:ascii="Times New Roman" w:hAnsi="Times New Roman" w:cs="Times New Roman"/>
-        </w:rPr>
-        <w:t xml:space="preserve"> </w:t>
+        <w:t xml:space="preserve">• Makanan titipan warga: </w:t>
       </w:r>
       <w:r>
         <w:rPr>
@@ -7767,29 +6689,7 @@
           <w:sz w:val="24"/>
           <w:rFonts w:ascii="Times New Roman" w:hAnsi="Times New Roman" w:cs="Times New Roman"/>
         </w:rPr>
-        <w:t xml:space="preserve">• </w:t>
-      </w:r>
-      <w:r>
-        <w:rPr>
-          <w:rFonts w:ascii="Times New Roman" w:hAnsi="Times New Roman"/>
-          <w:b/>
-          <w:i w:val="0"/>
-          <w:color w:val="000000"/>
-          <w:sz w:val="24"/>
-          <w:rFonts w:ascii="Times New Roman" w:hAnsi="Times New Roman" w:cs="Times New Roman"/>
-        </w:rPr>
-        <w:t>Biaya &amp; Pengguna:</w:t>
-      </w:r>
-      <w:r>
-        <w:rPr>
-          <w:rFonts w:ascii="Times New Roman" w:hAnsi="Times New Roman"/>
-          <w:b w:val="0"/>
-          <w:i w:val="0"/>
-          <w:color w:val="000000"/>
-          <w:sz w:val="24"/>
-          <w:rFonts w:ascii="Times New Roman" w:hAnsi="Times New Roman" w:cs="Times New Roman"/>
-        </w:rPr>
-        <w:t xml:space="preserve"> </w:t>
+        <w:t xml:space="preserve">• Biaya dan pengguna: </w:t>
       </w:r>
       <w:r>
         <w:rPr>
@@ -7868,7 +6768,7 @@
           <w:sz w:val="24"/>
           <w:rFonts w:ascii="Times New Roman" w:hAnsi="Times New Roman" w:cs="Times New Roman"/>
         </w:rPr>
-        <w:t>Alur kerja harian dimulai pukul 06.00 WIB saat kasir masuk ke aplikasi (</w:t>
+        <w:t>Alur operasional harian dimulai pukul 06.00 WIB saat kasir masuk ke aplikasi (</w:t>
       </w:r>
       <w:r>
         <w:rPr>
@@ -7890,7 +6790,7 @@
           <w:sz w:val="24"/>
           <w:rFonts w:ascii="Times New Roman" w:hAnsi="Times New Roman" w:cs="Times New Roman"/>
         </w:rPr>
-        <w:t>) dan memasukkan modal awal uang receh di laci kasir. Kasir melayani transaksi penjualan atau mencatat bon utang belanjaan pelanggan tetap. Jika uang di laci menumpuk, kasir melakukan setor kas aman ke pemilik (</w:t>
+        <w:t>) dan memasukkan modal awal uang receh di laci kasir. Kasir melayani transaksi penjualan atau mencatat belanjaan tempo pelanggan tetap. Saat uang di laci mulai menumpuk, kasir melakukan setor kas aman ke pemilik (</w:t>
       </w:r>
       <w:r>
         <w:rPr>
@@ -7912,7 +6812,7 @@
           <w:sz w:val="24"/>
           <w:rFonts w:ascii="Times New Roman" w:hAnsi="Times New Roman" w:cs="Times New Roman"/>
         </w:rPr>
-        <w:t>). Pukul 21.00 WIB saat toko bersiap tutup, kasir menghitung lembar dan koin fisik uang laci pada kalkulator pecahan dan menekan tombol tutup shift. Pemilik warung kemudian memeriksa ringkasan omzet harian, memverifikasi selisih kas shift, dan meninjau log aktivitas sistem (</w:t>
+        <w:t>). Pukul 21.00 WIB saat toko bersiap tutup, kasir menghitung lembaran dan koin fisik uang di laci pada kalkulator pecahan dan menekan tombol tutup shift. Pemilik warung kemudian memeriksa ringkasan omzet harian, memverifikasi laporan selisih kas shift, dan meninjau log aktivitas sistem (</w:t>
       </w:r>
       <w:r>
         <w:rPr>
@@ -7969,7 +6869,7 @@
           <w:sz w:val="24"/>
           <w:rFonts w:ascii="Times New Roman" w:hAnsi="Times New Roman" w:cs="Times New Roman"/>
         </w:rPr>
-        <w:t>Pengembangan Grossmart menerapkan metodologi Rekayasa Perangkat Lunak Berpusat pada Pengguna (</w:t>
+        <w:t>Pengembangan Grossmart menerapkan tahapan rekayasa perangkat lunak berorientasi pengguna (</w:t>
       </w:r>
       <w:r>
         <w:rPr>
@@ -7991,7 +6891,7 @@
           <w:sz w:val="24"/>
           <w:rFonts w:ascii="Times New Roman" w:hAnsi="Times New Roman" w:cs="Times New Roman"/>
         </w:rPr>
-        <w:t>) dalam enam tahapan terstruktur:</w:t>
+        <w:t>) dalam enam langkah terstruktur:</w:t>
       </w:r>
     </w:p>
     <w:p>
@@ -8009,51 +6909,7 @@
           <w:sz w:val="24"/>
           <w:rFonts w:ascii="Times New Roman" w:hAnsi="Times New Roman" w:cs="Times New Roman"/>
         </w:rPr>
-        <w:t xml:space="preserve">1. </w:t>
-      </w:r>
-      <w:r>
-        <w:rPr>
-          <w:rFonts w:ascii="Times New Roman" w:hAnsi="Times New Roman"/>
-          <w:b/>
-          <w:i w:val="0"/>
-          <w:color w:val="000000"/>
-          <w:sz w:val="24"/>
-          <w:rFonts w:ascii="Times New Roman" w:hAnsi="Times New Roman" w:cs="Times New Roman"/>
-        </w:rPr>
-        <w:t>Analisis Kebutuhan &amp; Pemodelan Domain:</w:t>
-      </w:r>
-      <w:r>
-        <w:rPr>
-          <w:rFonts w:ascii="Times New Roman" w:hAnsi="Times New Roman"/>
-          <w:b w:val="0"/>
-          <w:i w:val="0"/>
-          <w:color w:val="000000"/>
-          <w:sz w:val="24"/>
-          <w:rFonts w:ascii="Times New Roman" w:hAnsi="Times New Roman" w:cs="Times New Roman"/>
-        </w:rPr>
-        <w:t xml:space="preserve"> Observasi mendalam pada warung mitra memetakan alur transaksi manual, kendala kas laci, dan praktik bon utang, menghasilkan spesifikasi kebutuhan, kamus data, dan </w:t>
-      </w:r>
-      <w:r>
-        <w:rPr>
-          <w:rFonts w:ascii="Times New Roman" w:hAnsi="Times New Roman"/>
-          <w:b w:val="0"/>
-          <w:i/>
-          <w:color w:val="000000"/>
-          <w:sz w:val="24"/>
-          <w:rFonts w:ascii="Times New Roman" w:hAnsi="Times New Roman" w:cs="Times New Roman"/>
-        </w:rPr>
-        <w:t>ERD</w:t>
-      </w:r>
-      <w:r>
-        <w:rPr>
-          <w:rFonts w:ascii="Times New Roman" w:hAnsi="Times New Roman"/>
-          <w:b w:val="0"/>
-          <w:i w:val="0"/>
-          <w:color w:val="000000"/>
-          <w:sz w:val="24"/>
-          <w:rFonts w:ascii="Times New Roman" w:hAnsi="Times New Roman" w:cs="Times New Roman"/>
-        </w:rPr>
-        <w:t xml:space="preserve"> 39 tabel.</w:t>
+        <w:t>1. Analisis kebutuhan dan pemodelan domain: Observasi langsung di warung mitra untuk memetakan alur transaksi manual, kendala uang laci, dan pencatatan bon utang, menghasilkan spesifikasi kebutuhan, kamus data, dan diagram relasi entitas 39 tabel.</w:t>
       </w:r>
     </w:p>
     <w:p>
@@ -8071,29 +6927,7 @@
           <w:sz w:val="24"/>
           <w:rFonts w:ascii="Times New Roman" w:hAnsi="Times New Roman" w:cs="Times New Roman"/>
         </w:rPr>
-        <w:t xml:space="preserve">2. </w:t>
-      </w:r>
-      <w:r>
-        <w:rPr>
-          <w:rFonts w:ascii="Times New Roman" w:hAnsi="Times New Roman"/>
-          <w:b/>
-          <w:i w:val="0"/>
-          <w:color w:val="000000"/>
-          <w:sz w:val="24"/>
-          <w:rFonts w:ascii="Times New Roman" w:hAnsi="Times New Roman" w:cs="Times New Roman"/>
-        </w:rPr>
-        <w:t>Perancangan Antarmuka Ramah Lansia:</w:t>
-      </w:r>
-      <w:r>
-        <w:rPr>
-          <w:rFonts w:ascii="Times New Roman" w:hAnsi="Times New Roman"/>
-          <w:b w:val="0"/>
-          <w:i w:val="0"/>
-          <w:color w:val="000000"/>
-          <w:sz w:val="24"/>
-          <w:rFonts w:ascii="Times New Roman" w:hAnsi="Times New Roman" w:cs="Times New Roman"/>
-        </w:rPr>
-        <w:t xml:space="preserve"> Penyusunan wireframe berstandar </w:t>
+        <w:t xml:space="preserve">2. Perancangan antarmuka ramah lansia: Penyusunan wireframe berstandar </w:t>
       </w:r>
       <w:r>
         <w:rPr>
@@ -8115,7 +6949,7 @@
           <w:sz w:val="24"/>
           <w:rFonts w:ascii="Times New Roman" w:hAnsi="Times New Roman" w:cs="Times New Roman"/>
         </w:rPr>
-        <w:t xml:space="preserve"> dengan tombol besar, tulisan kontras tinggi, palet warna tegas, dan isyarat audio penanda aksi.</w:t>
+        <w:t xml:space="preserve"> dengan tombol berukuran besar, teks kontras tinggi, susunan warna tegas, dan isyarat audio penanda aksi.</w:t>
       </w:r>
     </w:p>
     <w:p>
@@ -8133,29 +6967,7 @@
           <w:sz w:val="24"/>
           <w:rFonts w:ascii="Times New Roman" w:hAnsi="Times New Roman" w:cs="Times New Roman"/>
         </w:rPr>
-        <w:t xml:space="preserve">3. </w:t>
-      </w:r>
-      <w:r>
-        <w:rPr>
-          <w:rFonts w:ascii="Times New Roman" w:hAnsi="Times New Roman"/>
-          <w:b/>
-          <w:i w:val="0"/>
-          <w:color w:val="000000"/>
-          <w:sz w:val="24"/>
-          <w:rFonts w:ascii="Times New Roman" w:hAnsi="Times New Roman" w:cs="Times New Roman"/>
-        </w:rPr>
-        <w:t>Pembangunan Kode dan Integrasi Sistem:</w:t>
-      </w:r>
-      <w:r>
-        <w:rPr>
-          <w:rFonts w:ascii="Times New Roman" w:hAnsi="Times New Roman"/>
-          <w:b w:val="0"/>
-          <w:i w:val="0"/>
-          <w:color w:val="000000"/>
-          <w:sz w:val="24"/>
-          <w:rFonts w:ascii="Times New Roman" w:hAnsi="Times New Roman" w:cs="Times New Roman"/>
-        </w:rPr>
-        <w:t xml:space="preserve"> Pembangunan backend </w:t>
+        <w:t xml:space="preserve">3. Implementasi kode dan integrasi sistem: Pengembangan backend </w:t>
       </w:r>
       <w:r>
         <w:rPr>
@@ -8221,7 +7033,7 @@
           <w:sz w:val="24"/>
           <w:rFonts w:ascii="Times New Roman" w:hAnsi="Times New Roman" w:cs="Times New Roman"/>
         </w:rPr>
-        <w:t xml:space="preserve">. Mengimplementasikan alur kasir cepat, tutup kasir buta, konversi stok eceran, penataan data makanan titipan warga, dan caching PWA </w:t>
+        <w:t xml:space="preserve">. Mengimplementasikan alur kasir cepat, tutup kasir buta, konversi stok eceran, penataan data makanan titipan warga, dan caching PWA melalui </w:t>
       </w:r>
       <w:r>
         <w:rPr>
@@ -8261,29 +7073,7 @@
           <w:sz w:val="24"/>
           <w:rFonts w:ascii="Times New Roman" w:hAnsi="Times New Roman" w:cs="Times New Roman"/>
         </w:rPr>
-        <w:t xml:space="preserve">4. </w:t>
-      </w:r>
-      <w:r>
-        <w:rPr>
-          <w:rFonts w:ascii="Times New Roman" w:hAnsi="Times New Roman"/>
-          <w:b/>
-          <w:i w:val="0"/>
-          <w:color w:val="000000"/>
-          <w:sz w:val="24"/>
-          <w:rFonts w:ascii="Times New Roman" w:hAnsi="Times New Roman" w:cs="Times New Roman"/>
-        </w:rPr>
-        <w:t>Pengujian Fungsional Otomatis:</w:t>
-      </w:r>
-      <w:r>
-        <w:rPr>
-          <w:rFonts w:ascii="Times New Roman" w:hAnsi="Times New Roman"/>
-          <w:b w:val="0"/>
-          <w:i w:val="0"/>
-          <w:color w:val="000000"/>
-          <w:sz w:val="24"/>
-          <w:rFonts w:ascii="Times New Roman" w:hAnsi="Times New Roman" w:cs="Times New Roman"/>
-        </w:rPr>
-        <w:t xml:space="preserve"> Penulisan uji otomatis </w:t>
+        <w:t xml:space="preserve">4. Pengujian fungsional otomatis: Penulisan uji otomatis </w:t>
       </w:r>
       <w:r>
         <w:rPr>
@@ -8305,7 +7095,7 @@
           <w:sz w:val="24"/>
           <w:rFonts w:ascii="Times New Roman" w:hAnsi="Times New Roman" w:cs="Times New Roman"/>
         </w:rPr>
-        <w:t xml:space="preserve"> guna memvalidasi transaksi di peladen: integritas transaksi serentak dan pengurangan stok di peladen melalui penguncian baris (</w:t>
+        <w:t xml:space="preserve"> untuk memvalidasi transaksi di sisi peladen: konsistensi transaksi serentak dan pengurangan stok melalui penguncian baris (</w:t>
       </w:r>
       <w:r>
         <w:rPr>
@@ -8349,7 +7139,7 @@
           <w:sz w:val="24"/>
           <w:rFonts w:ascii="Times New Roman" w:hAnsi="Times New Roman" w:cs="Times New Roman"/>
         </w:rPr>
-        <w:t xml:space="preserve">) tanpa otorisasi sesi pemilik (RBAC </w:t>
+        <w:t xml:space="preserve">) tanpa otorisasi pemilik (RBAC </w:t>
       </w:r>
       <w:r>
         <w:rPr>
@@ -8371,7 +7161,7 @@
           <w:sz w:val="24"/>
           <w:rFonts w:ascii="Times New Roman" w:hAnsi="Times New Roman" w:cs="Times New Roman"/>
         </w:rPr>
-        <w:t>), dan perhitungan selisih kas shift.</w:t>
+        <w:t>), dan kalkulasi selisih kas shift.</w:t>
       </w:r>
     </w:p>
     <w:p>
@@ -8389,29 +7179,7 @@
           <w:sz w:val="24"/>
           <w:rFonts w:ascii="Times New Roman" w:hAnsi="Times New Roman" w:cs="Times New Roman"/>
         </w:rPr>
-        <w:t xml:space="preserve">5. </w:t>
-      </w:r>
-      <w:r>
-        <w:rPr>
-          <w:rFonts w:ascii="Times New Roman" w:hAnsi="Times New Roman"/>
-          <w:b/>
-          <w:i w:val="0"/>
-          <w:color w:val="000000"/>
-          <w:sz w:val="24"/>
-          <w:rFonts w:ascii="Times New Roman" w:hAnsi="Times New Roman" w:cs="Times New Roman"/>
-        </w:rPr>
-        <w:t>Audit Keamanan Aplikasi dan Penguatan Peladen:</w:t>
-      </w:r>
-      <w:r>
-        <w:rPr>
-          <w:rFonts w:ascii="Times New Roman" w:hAnsi="Times New Roman"/>
-          <w:b w:val="0"/>
-          <w:i w:val="0"/>
-          <w:color w:val="000000"/>
-          <w:sz w:val="24"/>
-          <w:rFonts w:ascii="Times New Roman" w:hAnsi="Times New Roman" w:cs="Times New Roman"/>
-        </w:rPr>
-        <w:t xml:space="preserve"> Pengujian terhadap kerentanan web (</w:t>
+        <w:t>5. Audit keamanan aplikasi dan penguatan peladen: Pengujian terhadap kerentanan aplikasi web (</w:t>
       </w:r>
       <w:r>
         <w:rPr>
@@ -8433,7 +7201,7 @@
           <w:sz w:val="24"/>
           <w:rFonts w:ascii="Times New Roman" w:hAnsi="Times New Roman" w:cs="Times New Roman"/>
         </w:rPr>
-        <w:t xml:space="preserve">): mitigasi SQL injection via </w:t>
+        <w:t xml:space="preserve">): pencegahan SQL injection melalui </w:t>
       </w:r>
       <w:r>
         <w:rPr>
@@ -8455,7 +7223,7 @@
           <w:sz w:val="24"/>
           <w:rFonts w:ascii="Times New Roman" w:hAnsi="Times New Roman" w:cs="Times New Roman"/>
         </w:rPr>
-        <w:t xml:space="preserve">, pembersihan data tampilan anti-XSS via React, validasi token </w:t>
+        <w:t xml:space="preserve">, sanitasi output anti-XSS melalui React, validasi token </w:t>
       </w:r>
       <w:r>
         <w:rPr>
@@ -8477,7 +7245,7 @@
           <w:sz w:val="24"/>
           <w:rFonts w:ascii="Times New Roman" w:hAnsi="Times New Roman" w:cs="Times New Roman"/>
         </w:rPr>
-        <w:t>, otorisasi data antar pengguna, pembatasan laju login salah (</w:t>
+        <w:t>, otorisasi data antar pengguna, pembatasan laju login (</w:t>
       </w:r>
       <w:r>
         <w:rPr>
@@ -8499,7 +7267,7 @@
           <w:sz w:val="24"/>
           <w:rFonts w:ascii="Times New Roman" w:hAnsi="Times New Roman" w:cs="Times New Roman"/>
         </w:rPr>
-        <w:t>), dan isolasi data sensitif modal toko (</w:t>
+        <w:t>), dan isolasi data modal toko (</w:t>
       </w:r>
       <w:r>
         <w:rPr>
@@ -8539,29 +7307,7 @@
           <w:sz w:val="24"/>
           <w:rFonts w:ascii="Times New Roman" w:hAnsi="Times New Roman" w:cs="Times New Roman"/>
         </w:rPr>
-        <w:t xml:space="preserve">6. </w:t>
-      </w:r>
-      <w:r>
-        <w:rPr>
-          <w:rFonts w:ascii="Times New Roman" w:hAnsi="Times New Roman"/>
-          <w:b/>
-          <w:i w:val="0"/>
-          <w:color w:val="000000"/>
-          <w:sz w:val="24"/>
-          <w:rFonts w:ascii="Times New Roman" w:hAnsi="Times New Roman" w:cs="Times New Roman"/>
-        </w:rPr>
-        <w:t>Evaluasi Usability dan Uji Lapangan (Pilot):</w:t>
-      </w:r>
-      <w:r>
-        <w:rPr>
-          <w:rFonts w:ascii="Times New Roman" w:hAnsi="Times New Roman"/>
-          <w:b w:val="0"/>
-          <w:i w:val="0"/>
-          <w:color w:val="000000"/>
-          <w:sz w:val="24"/>
-          <w:rFonts w:ascii="Times New Roman" w:hAnsi="Times New Roman" w:cs="Times New Roman"/>
-        </w:rPr>
-        <w:t xml:space="preserve"> Penerapan sistem di toko mitra menguji kemudahan kasir lansia via kuesioner baku </w:t>
+        <w:t xml:space="preserve">6. Evaluasi kegunaan dan uji lapangan: Penerapan sistem di toko mitra untuk menguji kemudahan kasir lanjut usia menggunakan kuesioner baku </w:t>
       </w:r>
       <w:r>
         <w:rPr>
@@ -8618,7 +7364,7 @@
           <w:sz w:val="24"/>
           <w:rFonts w:ascii="Times New Roman" w:hAnsi="Times New Roman" w:cs="Times New Roman"/>
         </w:rPr>
-        <w:t>Setiap transaksi penjualan melibatkan pembaruan terpadu pada nota (</w:t>
+        <w:t>Setiap transaksi penjualan mencakup pembaruan serentak pada data nota (</w:t>
       </w:r>
       <w:r>
         <w:rPr>
@@ -8684,7 +7430,7 @@
           <w:sz w:val="24"/>
           <w:rFonts w:ascii="Times New Roman" w:hAnsi="Times New Roman" w:cs="Times New Roman"/>
         </w:rPr>
-        <w:t>), dan mutasi stok (</w:t>
+        <w:t>), dan mutasi persediaan (</w:t>
       </w:r>
       <w:r>
         <w:rPr>
@@ -8706,7 +7452,7 @@
           <w:sz w:val="24"/>
           <w:rFonts w:ascii="Times New Roman" w:hAnsi="Times New Roman" w:cs="Times New Roman"/>
         </w:rPr>
-        <w:t>). Logika ini dibungkus dalam transaksi basis data (</w:t>
+        <w:t>). Alur ini dijalankan dalam transaksi basis data (</w:t>
       </w:r>
       <w:r>
         <w:rPr>
@@ -8728,7 +7474,7 @@
           <w:sz w:val="24"/>
           <w:rFonts w:ascii="Times New Roman" w:hAnsi="Times New Roman" w:cs="Times New Roman"/>
         </w:rPr>
-        <w:t>). Jika terjadi gangguan sistem, seluruh operasi dibatalkan otomatis (</w:t>
+        <w:t>). Jika terjadi gangguan sistem di tengah proses, seluruh perubahan dibatalkan secara otomatis (</w:t>
       </w:r>
       <w:r>
         <w:rPr>
@@ -8772,7 +7518,7 @@
           <w:sz w:val="24"/>
           <w:rFonts w:ascii="Times New Roman" w:hAnsi="Times New Roman" w:cs="Times New Roman"/>
         </w:rPr>
-        <w:t>) diterapkan pada stok barang guna menjamin akurasi kuantitas saat dua kasir melayani transaksi bersamaan.</w:t>
+        <w:t>) diterapkan pada pencatatan stok guna menjaga akurasi kuantitas saat dua kasir melayani pembeli secara bersamaan.</w:t>
       </w:r>
     </w:p>
     <w:p>
@@ -8807,7 +7553,7 @@
           <w:sz w:val="24"/>
           <w:rFonts w:ascii="Times New Roman" w:hAnsi="Times New Roman" w:cs="Times New Roman"/>
         </w:rPr>
-        <w:t>Sistem menerapkan pembatasan hak akses langsung dari sisi peladen:</w:t>
+        <w:t>Sistem membatasi wewenang pengguna langsung dari sisi peladen:</w:t>
       </w:r>
     </w:p>
     <w:p>
@@ -8825,29 +7571,7 @@
           <w:sz w:val="24"/>
           <w:rFonts w:ascii="Times New Roman" w:hAnsi="Times New Roman" w:cs="Times New Roman"/>
         </w:rPr>
-        <w:t xml:space="preserve">• </w:t>
-      </w:r>
-      <w:r>
-        <w:rPr>
-          <w:rFonts w:ascii="Times New Roman" w:hAnsi="Times New Roman"/>
-          <w:b/>
-          <w:i w:val="0"/>
-          <w:color w:val="000000"/>
-          <w:sz w:val="24"/>
-          <w:rFonts w:ascii="Times New Roman" w:hAnsi="Times New Roman" w:cs="Times New Roman"/>
-        </w:rPr>
-        <w:t>Peran Pemilik (*Owner*):</w:t>
-      </w:r>
-      <w:r>
-        <w:rPr>
-          <w:rFonts w:ascii="Times New Roman" w:hAnsi="Times New Roman"/>
-          <w:b w:val="0"/>
-          <w:i w:val="0"/>
-          <w:color w:val="000000"/>
-          <w:sz w:val="24"/>
-          <w:rFonts w:ascii="Times New Roman" w:hAnsi="Times New Roman" w:cs="Times New Roman"/>
-        </w:rPr>
-        <w:t xml:space="preserve"> Akses penuh mengelola katalog sembako, harga modal belanja (HPP), laporan laba kotor, persetujuan pembatalan transaksi (</w:t>
+        <w:t>• Peran Pemilik (</w:t>
       </w:r>
       <w:r>
         <w:rPr>
@@ -8858,6 +7582,28 @@
           <w:sz w:val="24"/>
           <w:rFonts w:ascii="Times New Roman" w:hAnsi="Times New Roman" w:cs="Times New Roman"/>
         </w:rPr>
+        <w:t>Owner</w:t>
+      </w:r>
+      <w:r>
+        <w:rPr>
+          <w:rFonts w:ascii="Times New Roman" w:hAnsi="Times New Roman"/>
+          <w:b w:val="0"/>
+          <w:i w:val="0"/>
+          <w:color w:val="000000"/>
+          <w:sz w:val="24"/>
+          <w:rFonts w:ascii="Times New Roman" w:hAnsi="Times New Roman" w:cs="Times New Roman"/>
+        </w:rPr>
+        <w:t>): Memiliki akses penuh mengelola katalog barang, harga modal kulakan (HPP), laporan laba kotor, persetujuan pembatalan nota (</w:t>
+      </w:r>
+      <w:r>
+        <w:rPr>
+          <w:rFonts w:ascii="Times New Roman" w:hAnsi="Times New Roman"/>
+          <w:b w:val="0"/>
+          <w:i/>
+          <w:color w:val="000000"/>
+          <w:sz w:val="24"/>
+          <w:rFonts w:ascii="Times New Roman" w:hAnsi="Times New Roman" w:cs="Times New Roman"/>
+        </w:rPr>
         <w:t>void</w:t>
       </w:r>
       <w:r>
@@ -8869,7 +7615,7 @@
           <w:sz w:val="24"/>
           <w:rFonts w:ascii="Times New Roman" w:hAnsi="Times New Roman" w:cs="Times New Roman"/>
         </w:rPr>
-        <w:t>), pengaturan akun toko, dan peninjauan buku riwayat aktivitas (</w:t>
+        <w:t>), pengaturan akun toko, dan peninjauan riwayat aktivitas (</w:t>
       </w:r>
       <w:r>
         <w:rPr>
@@ -8909,29 +7655,29 @@
           <w:sz w:val="24"/>
           <w:rFonts w:ascii="Times New Roman" w:hAnsi="Times New Roman" w:cs="Times New Roman"/>
         </w:rPr>
-        <w:t xml:space="preserve">• </w:t>
-      </w:r>
-      <w:r>
-        <w:rPr>
-          <w:rFonts w:ascii="Times New Roman" w:hAnsi="Times New Roman"/>
-          <w:b/>
-          <w:i w:val="0"/>
-          <w:color w:val="000000"/>
-          <w:sz w:val="24"/>
-          <w:rFonts w:ascii="Times New Roman" w:hAnsi="Times New Roman" w:cs="Times New Roman"/>
-        </w:rPr>
-        <w:t>Peran Kasir (*Cashier*):</w:t>
-      </w:r>
-      <w:r>
-        <w:rPr>
-          <w:rFonts w:ascii="Times New Roman" w:hAnsi="Times New Roman"/>
-          <w:b w:val="0"/>
-          <w:i w:val="0"/>
-          <w:color w:val="000000"/>
-          <w:sz w:val="24"/>
-          <w:rFonts w:ascii="Times New Roman" w:hAnsi="Times New Roman" w:cs="Times New Roman"/>
-        </w:rPr>
-        <w:t xml:space="preserve"> Berfokus melayani penjualan, simpan keranjang sementara, buka shift laci, setor kas aman ke pemilik, dan tutup kasir buta. Seluruh halaman dan data modal kulakan dikunci rapat di tingkat peladen sehingga kasir tidak dapat melihat rahasia modal maupun laba toko.</w:t>
+        <w:t>• Peran Kasir (</w:t>
+      </w:r>
+      <w:r>
+        <w:rPr>
+          <w:rFonts w:ascii="Times New Roman" w:hAnsi="Times New Roman"/>
+          <w:b w:val="0"/>
+          <w:i/>
+          <w:color w:val="000000"/>
+          <w:sz w:val="24"/>
+          <w:rFonts w:ascii="Times New Roman" w:hAnsi="Times New Roman" w:cs="Times New Roman"/>
+        </w:rPr>
+        <w:t>Cashier</w:t>
+      </w:r>
+      <w:r>
+        <w:rPr>
+          <w:rFonts w:ascii="Times New Roman" w:hAnsi="Times New Roman"/>
+          <w:b w:val="0"/>
+          <w:i w:val="0"/>
+          <w:color w:val="000000"/>
+          <w:sz w:val="24"/>
+          <w:rFonts w:ascii="Times New Roman" w:hAnsi="Times New Roman" w:cs="Times New Roman"/>
+        </w:rPr>
+        <w:t>): Berfokus melayani penjualan, simpan keranjang sementara, buka shift laci, setor kas aman ke pemilik, dan tutup kasir buta. Seluruh halaman dan data harga modal toko dikunci di tingkat peladen sehingga kasir tidak dapat melihat informasi modal maupun margin laba.</w:t>
       </w:r>
     </w:p>
     <w:p>
@@ -8966,7 +7712,7 @@
           <w:sz w:val="24"/>
           <w:rFonts w:ascii="Times New Roman" w:hAnsi="Times New Roman" w:cs="Times New Roman"/>
         </w:rPr>
-        <w:t>Pengembangan Grossmart menempatkan kebiasaan nyata pedagang sebagai acuan desain. Profil persona berikut dirumuskan berdasarkan observasi di toko mitra:</w:t>
+        <w:t>Perancangan Grossmart menempatkan rutinitas kerja pedagang sebagai acuan utama. Profil persona pengguna dirumuskan berdasarkan hasil observasi di toko mitra:</w:t>
       </w:r>
     </w:p>
     <w:p>
@@ -9563,7 +8309,7 @@
           <w:sz w:val="24"/>
           <w:rFonts w:ascii="Times New Roman" w:hAnsi="Times New Roman" w:cs="Times New Roman"/>
         </w:rPr>
-        <w:t xml:space="preserve">Guna mengatasi penurunan fungsi visual dan kelenturan jari kasir lansia, antarmuka Grossmart mematuhi standar </w:t>
+        <w:t xml:space="preserve">Untuk mengantisipasi penurunan daya lihat dan kelenturan gerak jari kasir lanjut usia, antarmuka Grossmart mematuhi standar </w:t>
       </w:r>
       <w:r>
         <w:rPr>
@@ -9603,51 +8349,7 @@
           <w:sz w:val="24"/>
           <w:rFonts w:ascii="Times New Roman" w:hAnsi="Times New Roman" w:cs="Times New Roman"/>
         </w:rPr>
-        <w:t xml:space="preserve">1. </w:t>
-      </w:r>
-      <w:r>
-        <w:rPr>
-          <w:rFonts w:ascii="Times New Roman" w:hAnsi="Times New Roman"/>
-          <w:b/>
-          <w:i w:val="0"/>
-          <w:color w:val="000000"/>
-          <w:sz w:val="24"/>
-          <w:rFonts w:ascii="Times New Roman" w:hAnsi="Times New Roman" w:cs="Times New Roman"/>
-        </w:rPr>
-        <w:t>Skala Tipografi Ekstra Besar:</w:t>
-      </w:r>
-      <w:r>
-        <w:rPr>
-          <w:rFonts w:ascii="Times New Roman" w:hAnsi="Times New Roman"/>
-          <w:b w:val="0"/>
-          <w:i w:val="0"/>
-          <w:color w:val="000000"/>
-          <w:sz w:val="24"/>
-          <w:rFonts w:ascii="Times New Roman" w:hAnsi="Times New Roman" w:cs="Times New Roman"/>
-        </w:rPr>
-        <w:t xml:space="preserve"> Teks barang minimal 16–20px berbobot tebal. Nominal total belanja dan kembalian disajikan sangat besar (32–44px, </w:t>
-      </w:r>
-      <w:r>
-        <w:rPr>
-          <w:rFonts w:ascii="Times New Roman" w:hAnsi="Times New Roman"/>
-          <w:b w:val="0"/>
-          <w:i/>
-          <w:color w:val="000000"/>
-          <w:sz w:val="24"/>
-          <w:rFonts w:ascii="Times New Roman" w:hAnsi="Times New Roman" w:cs="Times New Roman"/>
-        </w:rPr>
-        <w:t>font-extrabold</w:t>
-      </w:r>
-      <w:r>
-        <w:rPr>
-          <w:rFonts w:ascii="Times New Roman" w:hAnsi="Times New Roman"/>
-          <w:b w:val="0"/>
-          <w:i w:val="0"/>
-          <w:color w:val="000000"/>
-          <w:sz w:val="24"/>
-          <w:rFonts w:ascii="Times New Roman" w:hAnsi="Times New Roman" w:cs="Times New Roman"/>
-        </w:rPr>
-        <w:t>) agar jelas terbaca tanpa kacamata baca.</w:t>
+        <w:t>1. Ukuran teks besar: Nama barang menggunakan ukuran minimal 16–20px berbobot tebal. Angka total belanja dan kembalian disajikan sangat besar (32–44px tebal) agar jelas terbaca tanpa kacamata baca.</w:t>
       </w:r>
     </w:p>
     <w:p>
@@ -9665,29 +8367,7 @@
           <w:sz w:val="24"/>
           <w:rFonts w:ascii="Times New Roman" w:hAnsi="Times New Roman" w:cs="Times New Roman"/>
         </w:rPr>
-        <w:t xml:space="preserve">2. </w:t>
-      </w:r>
-      <w:r>
-        <w:rPr>
-          <w:rFonts w:ascii="Times New Roman" w:hAnsi="Times New Roman"/>
-          <w:b/>
-          <w:i w:val="0"/>
-          <w:color w:val="000000"/>
-          <w:sz w:val="24"/>
-          <w:rFonts w:ascii="Times New Roman" w:hAnsi="Times New Roman" w:cs="Times New Roman"/>
-        </w:rPr>
-        <w:t>Kontras Visual Tinggi (&gt;7:1):</w:t>
-      </w:r>
-      <w:r>
-        <w:rPr>
-          <w:rFonts w:ascii="Times New Roman" w:hAnsi="Times New Roman"/>
-          <w:b w:val="0"/>
-          <w:i w:val="0"/>
-          <w:color w:val="000000"/>
-          <w:sz w:val="24"/>
-          <w:rFonts w:ascii="Times New Roman" w:hAnsi="Times New Roman" w:cs="Times New Roman"/>
-        </w:rPr>
-        <w:t xml:space="preserve"> Menggunakan teks hitam (#111827) di atas putih (#FFFFFF), serta nominal belanja Hijau Zamrud (#047857) berkontras 7.5:1 terhadap latar belakang.</w:t>
+        <w:t>2. Kontras visual tinggi (&gt;7:1): Teks utama menggunakan warna hitam (#111827) di atas latar putih (#FFFFFF), dan nominal belanja menggunakan warna hijau zamrud (#047857) dengan rasio kontras 7.5:1 terhadap latar belakang.</w:t>
       </w:r>
     </w:p>
     <w:p>
@@ -9705,51 +8385,7 @@
           <w:sz w:val="24"/>
           <w:rFonts w:ascii="Times New Roman" w:hAnsi="Times New Roman" w:cs="Times New Roman"/>
         </w:rPr>
-        <w:t xml:space="preserve">3. </w:t>
-      </w:r>
-      <w:r>
-        <w:rPr>
-          <w:rFonts w:ascii="Times New Roman" w:hAnsi="Times New Roman"/>
-          <w:b/>
-          <w:i w:val="0"/>
-          <w:color w:val="000000"/>
-          <w:sz w:val="24"/>
-          <w:rFonts w:ascii="Times New Roman" w:hAnsi="Times New Roman" w:cs="Times New Roman"/>
-        </w:rPr>
-        <w:t>Target Sentuh Lebar (&gt;56px):</w:t>
-      </w:r>
-      <w:r>
-        <w:rPr>
-          <w:rFonts w:ascii="Times New Roman" w:hAnsi="Times New Roman"/>
-          <w:b w:val="0"/>
-          <w:i w:val="0"/>
-          <w:color w:val="000000"/>
-          <w:sz w:val="24"/>
-          <w:rFonts w:ascii="Times New Roman" w:hAnsi="Times New Roman" w:cs="Times New Roman"/>
-        </w:rPr>
-        <w:t xml:space="preserve"> Tombol aksi utama (BAYAR, SIMPAN, CARI, HAPUS) dirancang setinggi 56–64px dengan jeda 16px (</w:t>
-      </w:r>
-      <w:r>
-        <w:rPr>
-          <w:rFonts w:ascii="Times New Roman" w:hAnsi="Times New Roman"/>
-          <w:b w:val="0"/>
-          <w:i/>
-          <w:color w:val="000000"/>
-          <w:sz w:val="24"/>
-          <w:rFonts w:ascii="Times New Roman" w:hAnsi="Times New Roman" w:cs="Times New Roman"/>
-        </w:rPr>
-        <w:t>gap-4</w:t>
-      </w:r>
-      <w:r>
-        <w:rPr>
-          <w:rFonts w:ascii="Times New Roman" w:hAnsi="Times New Roman"/>
-          <w:b w:val="0"/>
-          <w:i w:val="0"/>
-          <w:color w:val="000000"/>
-          <w:sz w:val="24"/>
-          <w:rFonts w:ascii="Times New Roman" w:hAnsi="Times New Roman" w:cs="Times New Roman"/>
-        </w:rPr>
-        <w:t>) guna mencegah salah sentuh tombol di sebelahnya (</w:t>
+        <w:t>3. Target sentuh lebar (&gt;56px): Tombol aksi utama (BAYAR, SIMPAN, CARI, HAPUS) dirancang dengan tinggi 56–64px dan jarak antartombol 16px untuk mencegah salah sentuh tombol di sebelahnya (</w:t>
       </w:r>
       <w:r>
         <w:rPr>
@@ -9789,7 +8425,7 @@
           <w:sz w:val="24"/>
           <w:rFonts w:ascii="Times New Roman" w:hAnsi="Times New Roman" w:cs="Times New Roman"/>
         </w:rPr>
-        <w:t xml:space="preserve">4. </w:t>
+        <w:t xml:space="preserve">4. Tombol cepat pecahan resmi Rupiah: Menyediakan tombol instan </w:t>
       </w:r>
       <w:r>
         <w:rPr>
@@ -9800,28 +8436,6 @@
           <w:sz w:val="24"/>
           <w:rFonts w:ascii="Times New Roman" w:hAnsi="Times New Roman" w:cs="Times New Roman"/>
         </w:rPr>
-        <w:t>Tombol Cepat Pecahan Resmi Rupiah:</w:t>
-      </w:r>
-      <w:r>
-        <w:rPr>
-          <w:rFonts w:ascii="Times New Roman" w:hAnsi="Times New Roman"/>
-          <w:b w:val="0"/>
-          <w:i w:val="0"/>
-          <w:color w:val="000000"/>
-          <w:sz w:val="24"/>
-          <w:rFonts w:ascii="Times New Roman" w:hAnsi="Times New Roman" w:cs="Times New Roman"/>
-        </w:rPr>
-        <w:t xml:space="preserve"> Menyediakan tombol instan </w:t>
-      </w:r>
-      <w:r>
-        <w:rPr>
-          <w:rFonts w:ascii="Times New Roman" w:hAnsi="Times New Roman"/>
-          <w:b/>
-          <w:i w:val="0"/>
-          <w:color w:val="000000"/>
-          <w:sz w:val="24"/>
-          <w:rFonts w:ascii="Times New Roman" w:hAnsi="Times New Roman" w:cs="Times New Roman"/>
-        </w:rPr>
         <w:t>UANG PAS</w:t>
       </w:r>
       <w:r>
@@ -9833,7 +8447,7 @@
           <w:sz w:val="24"/>
           <w:rFonts w:ascii="Times New Roman" w:hAnsi="Times New Roman" w:cs="Times New Roman"/>
         </w:rPr>
-        <w:t xml:space="preserve"> dan tombol lembaran resmi Rupiah: </w:t>
+        <w:t xml:space="preserve"> dan tombol pecahan resmi lembaran Rupiah: </w:t>
       </w:r>
       <w:r>
         <w:rPr>
@@ -9939,29 +8553,7 @@
           <w:sz w:val="24"/>
           <w:rFonts w:ascii="Times New Roman" w:hAnsi="Times New Roman" w:cs="Times New Roman"/>
         </w:rPr>
-        <w:t xml:space="preserve">5. </w:t>
-      </w:r>
-      <w:r>
-        <w:rPr>
-          <w:rFonts w:ascii="Times New Roman" w:hAnsi="Times New Roman"/>
-          <w:b/>
-          <w:i w:val="0"/>
-          <w:color w:val="000000"/>
-          <w:sz w:val="24"/>
-          <w:rFonts w:ascii="Times New Roman" w:hAnsi="Times New Roman" w:cs="Times New Roman"/>
-        </w:rPr>
-        <w:t>Umpan Balik Nada Audio Penanda Aksi:</w:t>
-      </w:r>
-      <w:r>
-        <w:rPr>
-          <w:rFonts w:ascii="Times New Roman" w:hAnsi="Times New Roman"/>
-          <w:b w:val="0"/>
-          <w:i w:val="0"/>
-          <w:color w:val="000000"/>
-          <w:sz w:val="24"/>
-          <w:rFonts w:ascii="Times New Roman" w:hAnsi="Times New Roman" w:cs="Times New Roman"/>
-        </w:rPr>
-        <w:t xml:space="preserve"> Mengintegrasikan isyarat suara fungsional via </w:t>
+        <w:t xml:space="preserve">5. Isyarat audio penanda aksi: Memanfaatkan </w:t>
       </w:r>
       <w:r>
         <w:rPr>
@@ -9983,7 +8575,7 @@
           <w:sz w:val="24"/>
           <w:rFonts w:ascii="Times New Roman" w:hAnsi="Times New Roman" w:cs="Times New Roman"/>
         </w:rPr>
-        <w:t xml:space="preserve">: nada </w:t>
+        <w:t xml:space="preserve"> untuk memberikan umpan balik suara: nada </w:t>
       </w:r>
       <w:r>
         <w:rPr>
@@ -10005,7 +8597,7 @@
           <w:sz w:val="24"/>
           <w:rFonts w:ascii="Times New Roman" w:hAnsi="Times New Roman" w:cs="Times New Roman"/>
         </w:rPr>
-        <w:t xml:space="preserve"> saat barcode terpindai, denting bel (</w:t>
+        <w:t xml:space="preserve"> saat barcode terbaca, denting lonceng (</w:t>
       </w:r>
       <w:r>
         <w:rPr>
@@ -10027,7 +8619,7 @@
           <w:sz w:val="24"/>
           <w:rFonts w:ascii="Times New Roman" w:hAnsi="Times New Roman" w:cs="Times New Roman"/>
         </w:rPr>
-        <w:t>) saat transaksi berhasil, dan dengung (</w:t>
+        <w:t>) saat transaksi berhasil, dan nada peringatan (</w:t>
       </w:r>
       <w:r>
         <w:rPr>
@@ -10049,7 +8641,7 @@
           <w:sz w:val="24"/>
           <w:rFonts w:ascii="Times New Roman" w:hAnsi="Times New Roman" w:cs="Times New Roman"/>
         </w:rPr>
-        <w:t>) bila salah menekan tombol.</w:t>
+        <w:t>) bila terjadi salah tekan tombol.</w:t>
       </w:r>
     </w:p>
     <w:p>
@@ -10067,29 +8659,7 @@
           <w:sz w:val="24"/>
           <w:rFonts w:ascii="Times New Roman" w:hAnsi="Times New Roman" w:cs="Times New Roman"/>
         </w:rPr>
-        <w:t xml:space="preserve">6. </w:t>
-      </w:r>
-      <w:r>
-        <w:rPr>
-          <w:rFonts w:ascii="Times New Roman" w:hAnsi="Times New Roman"/>
-          <w:b/>
-          <w:i w:val="0"/>
-          <w:color w:val="000000"/>
-          <w:sz w:val="24"/>
-          <w:rFonts w:ascii="Times New Roman" w:hAnsi="Times New Roman" w:cs="Times New Roman"/>
-        </w:rPr>
-        <w:t>Bahasa Warung Sehari-hari yang Akrab:</w:t>
-      </w:r>
-      <w:r>
-        <w:rPr>
-          <w:rFonts w:ascii="Times New Roman" w:hAnsi="Times New Roman"/>
-          <w:b w:val="0"/>
-          <w:i w:val="0"/>
-          <w:color w:val="000000"/>
-          <w:sz w:val="24"/>
-          <w:rFonts w:ascii="Times New Roman" w:hAnsi="Times New Roman" w:cs="Times New Roman"/>
-        </w:rPr>
-        <w:t xml:space="preserve"> Menghindari istilah teknis asing yang membingungkan kasir dengan memakai kata-kata yang lazim di warung: </w:t>
+        <w:t xml:space="preserve">6. Bahasa warung yang mudah dipahami: Menghindari istilah teknis asing yang membingungkan kasir dengan menggunakan kata-kata yang lazim di warung: </w:t>
       </w:r>
       <w:r>
         <w:rPr>
@@ -11163,7 +9733,7 @@
           <w:sz w:val="24"/>
           <w:rFonts w:ascii="Times New Roman" w:hAnsi="Times New Roman" w:cs="Times New Roman"/>
         </w:rPr>
-        <w:t>Penerapan Grossmart dirancang memberikan dampak positif pada efisiensi waktu, transparansi finansial, dan keberlanjutan usaha warung kelontong tradisional.</w:t>
+        <w:t>Penerapan Grossmart ditujukan untuk meningkatkan efisiensi waktu, keteraturan pencatatan keuangan, dan ketahanan usaha warung kelontong tradisional.</w:t>
       </w:r>
     </w:p>
     <w:p>
@@ -11198,7 +9768,7 @@
           <w:sz w:val="24"/>
           <w:rFonts w:ascii="Times New Roman" w:hAnsi="Times New Roman" w:cs="Times New Roman"/>
         </w:rPr>
-        <w:t>Efektivitas operasional Grossmart diukur melalui empat metrik kuantitatif terukur di toko mitra (Tabel 5):</w:t>
+        <w:t>Efektivitas operasional Grossmart diukur melalui empat metrik kuantitatif di toko mitra (Tabel 5):</w:t>
       </w:r>
     </w:p>
     <w:p>
@@ -11873,7 +10443,7 @@
           <w:sz w:val="24"/>
           <w:rFonts w:ascii="Times New Roman" w:hAnsi="Times New Roman" w:cs="Times New Roman"/>
         </w:rPr>
-        <w:t xml:space="preserve">Kemudahan penggunaan kasir lansia diuji dengan kuesioner baku </w:t>
+        <w:t xml:space="preserve">Kemudahan penggunaan bagi kasir lanjut usia dievaluasi menggunakan kuesioner baku </w:t>
       </w:r>
       <w:r>
         <w:rPr>
@@ -11895,7 +10465,7 @@
           <w:sz w:val="24"/>
           <w:rFonts w:ascii="Times New Roman" w:hAnsi="Times New Roman" w:cs="Times New Roman"/>
         </w:rPr>
-        <w:t xml:space="preserve"> yang diadaptasi ke dalam 10 pernyataan bahasa Indonesia komunikatif skala Likert 1–5, sebagaimana dirangkum pada Tabel 6:</w:t>
+        <w:t xml:space="preserve"> yang diadaptasi ke dalam 10 butir pernyataan komunikatif bahasa Indonesia berskala Likert 1–5, sebagaimana dirangkum pada Tabel 6:</w:t>
       </w:r>
     </w:p>
     <w:p>
@@ -13293,7 +11863,7 @@
           <w:sz w:val="24"/>
           <w:rFonts w:ascii="Times New Roman" w:hAnsi="Times New Roman" w:cs="Times New Roman"/>
         </w:rPr>
-        <w:t>Penerapan sistem digital pada warung tradisional diantisipasi melalui mitigasi risiko terencana (Tabel 7):</w:t>
+        <w:t>Penerapan sistem pada warung tradisional diantisipasi melalui mitigasi risiko terencana (Tabel 7):</w:t>
       </w:r>
     </w:p>
     <w:p>
@@ -13805,29 +12375,7 @@
           <w:sz w:val="24"/>
           <w:rFonts w:ascii="Times New Roman" w:hAnsi="Times New Roman" w:cs="Times New Roman"/>
         </w:rPr>
-        <w:t xml:space="preserve">1. </w:t>
-      </w:r>
-      <w:r>
-        <w:rPr>
-          <w:rFonts w:ascii="Times New Roman" w:hAnsi="Times New Roman"/>
-          <w:b/>
-          <w:i w:val="0"/>
-          <w:color w:val="000000"/>
-          <w:sz w:val="24"/>
-          <w:rFonts w:ascii="Times New Roman" w:hAnsi="Times New Roman" w:cs="Times New Roman"/>
-        </w:rPr>
-        <w:t>Fase 1 — Uji Lab &amp; Kesiapan Berkas Aplikasi (Build) (Bulan 1):</w:t>
-      </w:r>
-      <w:r>
-        <w:rPr>
-          <w:rFonts w:ascii="Times New Roman" w:hAnsi="Times New Roman"/>
-          <w:b w:val="0"/>
-          <w:i w:val="0"/>
-          <w:color w:val="000000"/>
-          <w:sz w:val="24"/>
-          <w:rFonts w:ascii="Times New Roman" w:hAnsi="Times New Roman" w:cs="Times New Roman"/>
-        </w:rPr>
-        <w:t xml:space="preserve"> Tuntasnya pengujian otomatis </w:t>
+        <w:t xml:space="preserve">1. Fase 1 (Bulan 1) - Pengujian Lab dan Kesiapan Sistem: Menuntaskan pengujian otomatis </w:t>
       </w:r>
       <w:r>
         <w:rPr>
@@ -13849,7 +12397,7 @@
           <w:sz w:val="24"/>
           <w:rFonts w:ascii="Times New Roman" w:hAnsi="Times New Roman" w:cs="Times New Roman"/>
         </w:rPr>
-        <w:t xml:space="preserve">, validasi kepatuhan </w:t>
+        <w:t xml:space="preserve">, memvalidasi kepatuhan antarmuka </w:t>
       </w:r>
       <w:r>
         <w:rPr>
@@ -13871,7 +12419,7 @@
           <w:sz w:val="24"/>
           <w:rFonts w:ascii="Times New Roman" w:hAnsi="Times New Roman" w:cs="Times New Roman"/>
         </w:rPr>
-        <w:t>, dan verifikasi 32 model data.</w:t>
+        <w:t>, dan memverifikasi konsistensi 32 model data.</w:t>
       </w:r>
     </w:p>
     <w:p>
@@ -13889,29 +12437,7 @@
           <w:sz w:val="24"/>
           <w:rFonts w:ascii="Times New Roman" w:hAnsi="Times New Roman" w:cs="Times New Roman"/>
         </w:rPr>
-        <w:t xml:space="preserve">2. </w:t>
-      </w:r>
-      <w:r>
-        <w:rPr>
-          <w:rFonts w:ascii="Times New Roman" w:hAnsi="Times New Roman"/>
-          <w:b/>
-          <w:i w:val="0"/>
-          <w:color w:val="000000"/>
-          <w:sz w:val="24"/>
-          <w:rFonts w:ascii="Times New Roman" w:hAnsi="Times New Roman" w:cs="Times New Roman"/>
-        </w:rPr>
-        <w:t>Fase 2 — Pilot di Toko Mitra (Bulan 2–3):</w:t>
-      </w:r>
-      <w:r>
-        <w:rPr>
-          <w:rFonts w:ascii="Times New Roman" w:hAnsi="Times New Roman"/>
-          <w:b w:val="0"/>
-          <w:i w:val="0"/>
-          <w:color w:val="000000"/>
-          <w:sz w:val="24"/>
-          <w:rFonts w:ascii="Times New Roman" w:hAnsi="Times New Roman" w:cs="Times New Roman"/>
-        </w:rPr>
-        <w:t xml:space="preserve"> Pemasangan aplikasi pada peladen lokal gerai mitra RPTRA Jatinegara, pendampingan kasir lansia, dan pencatatan metrik rekap harian.</w:t>
+        <w:t>2. Fase 2 (Bulan 2–3) - Uji Coba di Toko Mitra: Memasang aplikasi pada komputer lokal di gerai mitra RPTRA Jatinegara, mendampingi kasir lanjut usia, dan mencatat evaluasi durasi rekap harian.</w:t>
       </w:r>
     </w:p>
     <w:p>
@@ -13929,29 +12455,7 @@
           <w:sz w:val="24"/>
           <w:rFonts w:ascii="Times New Roman" w:hAnsi="Times New Roman" w:cs="Times New Roman"/>
         </w:rPr>
-        <w:t xml:space="preserve">3. </w:t>
-      </w:r>
-      <w:r>
-        <w:rPr>
-          <w:rFonts w:ascii="Times New Roman" w:hAnsi="Times New Roman"/>
-          <w:b/>
-          <w:i w:val="0"/>
-          <w:color w:val="000000"/>
-          <w:sz w:val="24"/>
-          <w:rFonts w:ascii="Times New Roman" w:hAnsi="Times New Roman" w:cs="Times New Roman"/>
-        </w:rPr>
-        <w:t>Fase 3 — Evaluasi &amp; Rilis Terbuka (Bulan 4):</w:t>
-      </w:r>
-      <w:r>
-        <w:rPr>
-          <w:rFonts w:ascii="Times New Roman" w:hAnsi="Times New Roman"/>
-          <w:b w:val="0"/>
-          <w:i w:val="0"/>
-          <w:color w:val="000000"/>
-          <w:sz w:val="24"/>
-          <w:rFonts w:ascii="Times New Roman" w:hAnsi="Times New Roman" w:cs="Times New Roman"/>
-        </w:rPr>
-        <w:t xml:space="preserve"> Pengukuran skor SUS, evaluasi selisih kas, dan penyusunan paket instalasi mandiri terbuka (</w:t>
+        <w:t>3. Fase 3 (Bulan 4) - Evaluasi dan Paket Instalasi Mandiri: Mengukur capaian skor SUS, mengevaluasi selisih kas, serta menyusun paket instalasi mandiri terbuka (</w:t>
       </w:r>
       <w:r>
         <w:rPr>
@@ -14008,7 +12512,7 @@
           <w:sz w:val="24"/>
           <w:rFonts w:ascii="Times New Roman" w:hAnsi="Times New Roman" w:cs="Times New Roman"/>
         </w:rPr>
-        <w:t>Pengembangan Grossmart berpegang pada etika rekayasa perangkat lunak, kepatuhan regulasi data, dan pelindungan karya cipta:</w:t>
+        <w:t>Pengembangan Grossmart memperhatikan etika rekayasa perangkat lunak, regulasi pelindungan data, dan hak kekayaan intelektual:</w:t>
       </w:r>
     </w:p>
     <w:p>
@@ -14026,29 +12530,7 @@
           <w:sz w:val="24"/>
           <w:rFonts w:ascii="Times New Roman" w:hAnsi="Times New Roman" w:cs="Times New Roman"/>
         </w:rPr>
-        <w:t xml:space="preserve">1. </w:t>
-      </w:r>
-      <w:r>
-        <w:rPr>
-          <w:rFonts w:ascii="Times New Roman" w:hAnsi="Times New Roman"/>
-          <w:b/>
-          <w:i w:val="0"/>
-          <w:color w:val="000000"/>
-          <w:sz w:val="24"/>
-          <w:rFonts w:ascii="Times New Roman" w:hAnsi="Times New Roman" w:cs="Times New Roman"/>
-        </w:rPr>
-        <w:t>Etika Desain dan Inklusivitas Usia:</w:t>
-      </w:r>
-      <w:r>
-        <w:rPr>
-          <w:rFonts w:ascii="Times New Roman" w:hAnsi="Times New Roman"/>
-          <w:b w:val="0"/>
-          <w:i w:val="0"/>
-          <w:color w:val="000000"/>
-          <w:sz w:val="24"/>
-          <w:rFonts w:ascii="Times New Roman" w:hAnsi="Times New Roman" w:cs="Times New Roman"/>
-        </w:rPr>
-        <w:t xml:space="preserve"> Rancangan ramah lansia ditujukan membantu pengelola warung sepuh agar tetap percaya diri dan mandiri menjalankan usaha keluarganya. Alur tutup kasir buta dan catatan riwayat (</w:t>
+        <w:t>1. Etika desain dan inklusivitas: Antarmuka ramah lansia dirancang agar pengelola warung sepuh tetap percaya diri menjalankan usahanya. Alur tutup kasir buta dan catatan aktivitas (</w:t>
       </w:r>
       <w:r>
         <w:rPr>
@@ -14070,7 +12552,7 @@
           <w:sz w:val="24"/>
           <w:rFonts w:ascii="Times New Roman" w:hAnsi="Times New Roman" w:cs="Times New Roman"/>
         </w:rPr>
-        <w:t>) ditempatkan sebagai sarana keterbukaan bersama yang saling menjaga ketenangan pemilik toko maupun petugas kasir.</w:t>
+        <w:t>) berfungsi sebagai sarana transparansi kerja yang menjaga keterbukaan antara pemilik dan kasir.</w:t>
       </w:r>
     </w:p>
     <w:p>
@@ -14088,18 +12570,7 @@
           <w:sz w:val="24"/>
           <w:rFonts w:ascii="Times New Roman" w:hAnsi="Times New Roman" w:cs="Times New Roman"/>
         </w:rPr>
-        <w:t xml:space="preserve">2. </w:t>
-      </w:r>
-      <w:r>
-        <w:rPr>
-          <w:rFonts w:ascii="Times New Roman" w:hAnsi="Times New Roman"/>
-          <w:b/>
-          <w:i w:val="0"/>
-          <w:color w:val="000000"/>
-          <w:sz w:val="24"/>
-          <w:rFonts w:ascii="Times New Roman" w:hAnsi="Times New Roman" w:cs="Times New Roman"/>
-        </w:rPr>
-        <w:t>Kepatuhan Undang-Undang Pelindungan Data Pribadi (UU No. 27/2022):</w:t>
+        <w:t>2. Kepatuhan Pelindungan Data Pribadi (UU No. 27/2022):</w:t>
       </w:r>
     </w:p>
     <w:p>
@@ -14117,29 +12588,7 @@
           <w:sz w:val="24"/>
           <w:rFonts w:ascii="Times New Roman" w:hAnsi="Times New Roman" w:cs="Times New Roman"/>
         </w:rPr>
-        <w:t xml:space="preserve">• </w:t>
-      </w:r>
-      <w:r>
-        <w:rPr>
-          <w:rFonts w:ascii="Times New Roman" w:hAnsi="Times New Roman"/>
-          <w:b/>
-          <w:i w:val="0"/>
-          <w:color w:val="000000"/>
-          <w:sz w:val="24"/>
-          <w:rFonts w:ascii="Times New Roman" w:hAnsi="Times New Roman" w:cs="Times New Roman"/>
-        </w:rPr>
-        <w:t>Prinsip Pembatasan Data:</w:t>
-      </w:r>
-      <w:r>
-        <w:rPr>
-          <w:rFonts w:ascii="Times New Roman" w:hAnsi="Times New Roman"/>
-          <w:b w:val="0"/>
-          <w:i w:val="0"/>
-          <w:color w:val="000000"/>
-          <w:sz w:val="24"/>
-          <w:rFonts w:ascii="Times New Roman" w:hAnsi="Times New Roman" w:cs="Times New Roman"/>
-        </w:rPr>
-        <w:t xml:space="preserve"> Sistem hanya mencatat nama dan nomor kontak pelanggan tetap yang memiliki catatan bon utang belanja. Transaksi tunai pembeli harian tidak merekam data pribadi apa pun.</w:t>
+        <w:t>• Pembatasan data: Sistem hanya mencatat nama dan nomor telepon pelanggan yang memiliki catatan bon utang. Pembeli tunai harian tidak dimintai data pribadi apa pun.</w:t>
       </w:r>
     </w:p>
     <w:p>
@@ -14157,29 +12606,7 @@
           <w:sz w:val="24"/>
           <w:rFonts w:ascii="Times New Roman" w:hAnsi="Times New Roman" w:cs="Times New Roman"/>
         </w:rPr>
-        <w:t xml:space="preserve">• </w:t>
-      </w:r>
-      <w:r>
-        <w:rPr>
-          <w:rFonts w:ascii="Times New Roman" w:hAnsi="Times New Roman"/>
-          <w:b/>
-          <w:i w:val="0"/>
-          <w:color w:val="000000"/>
-          <w:sz w:val="24"/>
-          <w:rFonts w:ascii="Times New Roman" w:hAnsi="Times New Roman" w:cs="Times New Roman"/>
-        </w:rPr>
-        <w:t>Penyimpanan Mandiri di Toko:</w:t>
-      </w:r>
-      <w:r>
-        <w:rPr>
-          <w:rFonts w:ascii="Times New Roman" w:hAnsi="Times New Roman"/>
-          <w:b w:val="0"/>
-          <w:i w:val="0"/>
-          <w:color w:val="000000"/>
-          <w:sz w:val="24"/>
-          <w:rFonts w:ascii="Times New Roman" w:hAnsi="Times New Roman" w:cs="Times New Roman"/>
-        </w:rPr>
-        <w:t xml:space="preserve"> Seluruh basis data penjualan, catatan utang, dan riwayat kas tersimpan di komputer warung sendiri, tidak diserahkan ke pihak ketiga.</w:t>
+        <w:t>• Penyimpanan lokal di toko: Seluruh basis data transaksi, catatan utang, dan mutasi kas tersimpan di komputer toko sendiri dan tidak dialirkan ke pihak luar.</w:t>
       </w:r>
     </w:p>
     <w:p>
@@ -14197,29 +12624,7 @@
           <w:sz w:val="24"/>
           <w:rFonts w:ascii="Times New Roman" w:hAnsi="Times New Roman" w:cs="Times New Roman"/>
         </w:rPr>
-        <w:t xml:space="preserve">• </w:t>
-      </w:r>
-      <w:r>
-        <w:rPr>
-          <w:rFonts w:ascii="Times New Roman" w:hAnsi="Times New Roman"/>
-          <w:b/>
-          <w:i w:val="0"/>
-          <w:color w:val="000000"/>
-          <w:sz w:val="24"/>
-          <w:rFonts w:ascii="Times New Roman" w:hAnsi="Times New Roman" w:cs="Times New Roman"/>
-        </w:rPr>
-        <w:t>Pengamanan Kata Sandi:</w:t>
-      </w:r>
-      <w:r>
-        <w:rPr>
-          <w:rFonts w:ascii="Times New Roman" w:hAnsi="Times New Roman"/>
-          <w:b w:val="0"/>
-          <w:i w:val="0"/>
-          <w:color w:val="000000"/>
-          <w:sz w:val="24"/>
-          <w:rFonts w:ascii="Times New Roman" w:hAnsi="Times New Roman" w:cs="Times New Roman"/>
-        </w:rPr>
-        <w:t xml:space="preserve"> Kata sandi akun dilindungi enkripsi satu arah (</w:t>
+        <w:t xml:space="preserve">• Pengamanan akun: Kata sandi pengguna diamankan dengan enkripsi </w:t>
       </w:r>
       <w:r>
         <w:rPr>
@@ -14241,7 +12646,7 @@
           <w:sz w:val="24"/>
           <w:rFonts w:ascii="Times New Roman" w:hAnsi="Times New Roman" w:cs="Times New Roman"/>
         </w:rPr>
-        <w:t>), dan sesi login diamankan dengan token khusus.</w:t>
+        <w:t>, dan sesi login dilindungi token otentikasi.</w:t>
       </w:r>
     </w:p>
     <w:p>
@@ -14259,29 +12664,7 @@
           <w:sz w:val="24"/>
           <w:rFonts w:ascii="Times New Roman" w:hAnsi="Times New Roman" w:cs="Times New Roman"/>
         </w:rPr>
-        <w:t xml:space="preserve">3. </w:t>
-      </w:r>
-      <w:r>
-        <w:rPr>
-          <w:rFonts w:ascii="Times New Roman" w:hAnsi="Times New Roman"/>
-          <w:b/>
-          <w:i w:val="0"/>
-          <w:color w:val="000000"/>
-          <w:sz w:val="24"/>
-          <w:rFonts w:ascii="Times New Roman" w:hAnsi="Times New Roman" w:cs="Times New Roman"/>
-        </w:rPr>
-        <w:t>Legalitas Perangkat Lunak Terbuka:</w:t>
-      </w:r>
-      <w:r>
-        <w:rPr>
-          <w:rFonts w:ascii="Times New Roman" w:hAnsi="Times New Roman"/>
-          <w:b w:val="0"/>
-          <w:i w:val="0"/>
-          <w:color w:val="000000"/>
-          <w:sz w:val="24"/>
-          <w:rFonts w:ascii="Times New Roman" w:hAnsi="Times New Roman" w:cs="Times New Roman"/>
-        </w:rPr>
-        <w:t xml:space="preserve"> Seluruh komponen utama memanfaatkan teknologi sumber terbuka berlisensi resmi (</w:t>
+        <w:t>3. Legalitas perangkat lunak terbuka: Seluruh komponen utama memanfaatkan teknologi sumber terbuka berlisensi resmi (</w:t>
       </w:r>
       <w:r>
         <w:rPr>
@@ -14347,7 +12730,7 @@
           <w:sz w:val="24"/>
           <w:rFonts w:ascii="Times New Roman" w:hAnsi="Times New Roman" w:cs="Times New Roman"/>
         </w:rPr>
-        <w:t xml:space="preserve"> di bawah lisensi GPL), bebas dari sengketa hak cipta komersial.</w:t>
+        <w:t xml:space="preserve"> di bawah lisensi GPL), bebas dari sengketa lisensi komersial.</w:t>
       </w:r>
     </w:p>
     <w:p>
@@ -14365,18 +12748,7 @@
           <w:sz w:val="24"/>
           <w:rFonts w:ascii="Times New Roman" w:hAnsi="Times New Roman" w:cs="Times New Roman"/>
         </w:rPr>
-        <w:t xml:space="preserve">4. </w:t>
-      </w:r>
-      <w:r>
-        <w:rPr>
-          <w:rFonts w:ascii="Times New Roman" w:hAnsi="Times New Roman"/>
-          <w:b/>
-          <w:i w:val="0"/>
-          <w:color w:val="000000"/>
-          <w:sz w:val="24"/>
-          <w:rFonts w:ascii="Times New Roman" w:hAnsi="Times New Roman" w:cs="Times New Roman"/>
-        </w:rPr>
-        <w:t>Potensi Hak Kekayaan Intelektual (HKI):</w:t>
+        <w:t>4. Potensi Hak Kekayaan Intelektual (HKI):</w:t>
       </w:r>
     </w:p>
     <w:p>
@@ -14394,29 +12766,7 @@
           <w:sz w:val="24"/>
           <w:rFonts w:ascii="Times New Roman" w:hAnsi="Times New Roman" w:cs="Times New Roman"/>
         </w:rPr>
-        <w:t xml:space="preserve">• </w:t>
-      </w:r>
-      <w:r>
-        <w:rPr>
-          <w:rFonts w:ascii="Times New Roman" w:hAnsi="Times New Roman"/>
-          <w:b/>
-          <w:i w:val="0"/>
-          <w:color w:val="000000"/>
-          <w:sz w:val="24"/>
-          <w:rFonts w:ascii="Times New Roman" w:hAnsi="Times New Roman" w:cs="Times New Roman"/>
-        </w:rPr>
-        <w:t>Hak Cipta Program Komputer:</w:t>
-      </w:r>
-      <w:r>
-        <w:rPr>
-          <w:rFonts w:ascii="Times New Roman" w:hAnsi="Times New Roman"/>
-          <w:b w:val="0"/>
-          <w:i w:val="0"/>
-          <w:color w:val="000000"/>
-          <w:sz w:val="24"/>
-          <w:rFonts w:ascii="Times New Roman" w:hAnsi="Times New Roman" w:cs="Times New Roman"/>
-        </w:rPr>
-        <w:t xml:space="preserve"> Kode sumber aplikasi, tata letak antarmuka ramah lansia, dan buku panduan sistem berpotensi didaftarkan Hak Ciptanya ke Direktorat Jenderal Kekayaan Intelektual (DJKI) Kemenkumham RI pada jenis ciptaan Program Komputer.</w:t>
+        <w:t>• Hak Cipta Program Komputer: Kode sumber aplikasi, tata letak antarmuka ramah lansia, dan buku panduan sistem berpotensi didaftarkan hak ciptanya ke DJKI Kemenkumham RI pada jenis ciptaan Program Komputer.</w:t>
       </w:r>
     </w:p>
     <w:p>
@@ -14434,29 +12784,7 @@
           <w:sz w:val="24"/>
           <w:rFonts w:ascii="Times New Roman" w:hAnsi="Times New Roman" w:cs="Times New Roman"/>
         </w:rPr>
-        <w:t xml:space="preserve">• </w:t>
-      </w:r>
-      <w:r>
-        <w:rPr>
-          <w:rFonts w:ascii="Times New Roman" w:hAnsi="Times New Roman"/>
-          <w:b/>
-          <w:i w:val="0"/>
-          <w:color w:val="000000"/>
-          <w:sz w:val="24"/>
-          <w:rFonts w:ascii="Times New Roman" w:hAnsi="Times New Roman" w:cs="Times New Roman"/>
-        </w:rPr>
-        <w:t>Merek Dagang:</w:t>
-      </w:r>
-      <w:r>
-        <w:rPr>
-          <w:rFonts w:ascii="Times New Roman" w:hAnsi="Times New Roman"/>
-          <w:b w:val="0"/>
-          <w:i w:val="0"/>
-          <w:color w:val="000000"/>
-          <w:sz w:val="24"/>
-          <w:rFonts w:ascii="Times New Roman" w:hAnsi="Times New Roman" w:cs="Times New Roman"/>
-        </w:rPr>
-        <w:t xml:space="preserve"> Nama dan logo "Grossmart" berpotensi didaftarkan hak mereknya untuk kategori layanan perangkat lunak ritel mandiri.</w:t>
+        <w:t>• Merek Dagang: Nama dan logo Grossmart berpotensi didaftarkan sebagai merek dagang untuk aplikasi kasir ritel mandiri.</w:t>
       </w:r>
     </w:p>
     <w:p>
@@ -14491,7 +12819,7 @@
           <w:sz w:val="24"/>
           <w:rFonts w:ascii="Times New Roman" w:hAnsi="Times New Roman" w:cs="Times New Roman"/>
         </w:rPr>
-        <w:t>Grossmart lahir dari kenyataan sehari-hari warung kelontong tradisional yang selama ini terpinggirkan oleh digitalisasi yang serba rumit dan berbayar mahal. Dengan menggabungkan aplikasi mandiri tanpa biaya sewa, perlindungan laci kasir lewat tutup kasir buta (</w:t>
+        <w:t xml:space="preserve">Grossmart dirancang untuk menjawab persoalan operasional toko kelontong mandiri yang dikelola oleh pedagang lanjut usia. Melalui arsitektur lokal tanpa biaya sewa bulanan, antarmuka ergonomis berstandar </w:t>
       </w:r>
       <w:r>
         <w:rPr>
@@ -14502,6 +12830,28 @@
           <w:sz w:val="24"/>
           <w:rFonts w:ascii="Times New Roman" w:hAnsi="Times New Roman" w:cs="Times New Roman"/>
         </w:rPr>
+        <w:t>WCAG 2.1 AAA</w:t>
+      </w:r>
+      <w:r>
+        <w:rPr>
+          <w:rFonts w:ascii="Times New Roman" w:hAnsi="Times New Roman"/>
+          <w:b w:val="0"/>
+          <w:i w:val="0"/>
+          <w:color w:val="000000"/>
+          <w:sz w:val="24"/>
+          <w:rFonts w:ascii="Times New Roman" w:hAnsi="Times New Roman" w:cs="Times New Roman"/>
+        </w:rPr>
+        <w:t>, dan mekanisme tutup kasir buta (</w:t>
+      </w:r>
+      <w:r>
+        <w:rPr>
+          <w:rFonts w:ascii="Times New Roman" w:hAnsi="Times New Roman"/>
+          <w:b w:val="0"/>
+          <w:i/>
+          <w:color w:val="000000"/>
+          <w:sz w:val="24"/>
+          <w:rFonts w:ascii="Times New Roman" w:hAnsi="Times New Roman" w:cs="Times New Roman"/>
+        </w:rPr>
         <w:t>blind cash-up</w:t>
       </w:r>
       <w:r>
@@ -14513,29 +12863,7 @@
           <w:sz w:val="24"/>
           <w:rFonts w:ascii="Times New Roman" w:hAnsi="Times New Roman" w:cs="Times New Roman"/>
         </w:rPr>
-        <w:t>), serta tampilan ramah lansia (</w:t>
-      </w:r>
-      <w:r>
-        <w:rPr>
-          <w:rFonts w:ascii="Times New Roman" w:hAnsi="Times New Roman"/>
-          <w:b w:val="0"/>
-          <w:i/>
-          <w:color w:val="000000"/>
-          <w:sz w:val="24"/>
-          <w:rFonts w:ascii="Times New Roman" w:hAnsi="Times New Roman" w:cs="Times New Roman"/>
-        </w:rPr>
-        <w:t>WCAG 2.1 AAA</w:t>
-      </w:r>
-      <w:r>
-        <w:rPr>
-          <w:rFonts w:ascii="Times New Roman" w:hAnsi="Times New Roman"/>
-          <w:b w:val="0"/>
-          <w:i w:val="0"/>
-          <w:color w:val="000000"/>
-          <w:sz w:val="24"/>
-          <w:rFonts w:ascii="Times New Roman" w:hAnsi="Times New Roman" w:cs="Times New Roman"/>
-        </w:rPr>
-        <w:t>), Grossmart membuktikan bahwa digitalisasi toko dapat hadir secara sederhana, membumi, dan benar-benar membantu pedagang kecil.</w:t>
+        <w:t>), sistem ini membantu warung mengelola transaksi harian secara tertib tanpa membebani kasir sepuh.</w:t>
       </w:r>
     </w:p>
     <w:p>
@@ -14552,7 +12880,7 @@
           <w:sz w:val="24"/>
           <w:rFonts w:ascii="Times New Roman" w:hAnsi="Times New Roman" w:cs="Times New Roman"/>
         </w:rPr>
-        <w:t>Melalui pencatatan kasir yang cepat, penataan data makanan titipan warga, pencatatan bon utang langganan, dan pemecahan kemasan eceran, Grossmart menjaga kelangsungan hidup warung kelontong di tengah persaingan minimarket modern. Uji coba sistem secara menyeluruh di laboratorium dan pendampingan langsung di warung mitra memastikan bahwa Grossmart bukan sekadar rancangan di atas kertas, melainkan teknologi yang siap dipakai, beretika, dan berkelanjutan.</w:t>
+        <w:t>Dukungan fitur khas warung, seperti pencatatan bon utang pelanggan, penataan data barang titipan warga, dan konversi kemasan eceran, menjadikan Grossmart relevan dengan praktik niaga di kawasan permukiman. Pengujian otomatis di laboratorium dan pendampingan bertahap di warung mitra memastikan sistem ini dapat diandalkan secara teknis serta mudah dioperasikan dalam kegiatan harian toko.</w:t>
       </w:r>
     </w:p>
     <w:p>
@@ -15682,7 +14010,7 @@
           <w:sz w:val="24"/>
           <w:rFonts w:ascii="Times New Roman" w:hAnsi="Times New Roman" w:cs="Times New Roman"/>
         </w:rPr>
-        <w:t xml:space="preserve"> Kasir memasukkan modal awal receh di laci; sistem mencatat sesi shift baru dan mengunci modal awal tersebut.</w:t>
+        <w:t xml:space="preserve"> Kasir memasukkan modal awal uang receh di laci; sistem mencatat sesi shift baru dan mengunci nilai modal awal.</w:t>
       </w:r>
     </w:p>
     <w:p>
@@ -15722,7 +14050,7 @@
           <w:sz w:val="24"/>
           <w:rFonts w:ascii="Times New Roman" w:hAnsi="Times New Roman" w:cs="Times New Roman"/>
         </w:rPr>
-        <w:t xml:space="preserve"> Muncul pemberitahuan jelas disertai tombol cari manual lewat nama barang; penambahan barang baru dibatasi hak aksesnya.</w:t>
+        <w:t xml:space="preserve"> Menampilkan notifikasi visual disertai tombol pencarian manual berdasarkan nama barang; penambahan barang baru dibatasi hak akses pemilik.</w:t>
       </w:r>
     </w:p>
     <w:p>
@@ -15762,7 +14090,7 @@
           <w:sz w:val="24"/>
           <w:rFonts w:ascii="Times New Roman" w:hAnsi="Times New Roman" w:cs="Times New Roman"/>
         </w:rPr>
-        <w:t xml:space="preserve"> Kasir dapat membatalkan barang, memarkir belanjaan sementara (F3), atau mencatatnya ke bon utang langganan tetap.</w:t>
+        <w:t xml:space="preserve"> Kasir dapat membatalkan item belanja, memarkir keranjang sementara (F3), atau mengalihkan transaksi ke bon utang pelanggan tetap.</w:t>
       </w:r>
     </w:p>
     <w:p>
@@ -15802,7 +14130,7 @@
           <w:sz w:val="24"/>
           <w:rFonts w:ascii="Times New Roman" w:hAnsi="Times New Roman" w:cs="Times New Roman"/>
         </w:rPr>
-        <w:t xml:space="preserve"> Sistem menampilkan peringatan sambungan tanpa mengeluarkan bukti bayar palsu; alur nota cadangan darurat aktif.</w:t>
+        <w:t xml:space="preserve"> Sistem menampilkan peringatan sambungan tanpa mencetak struk keliru; kasir beralih ke alur nota cadangan darurat.</w:t>
       </w:r>
     </w:p>
     <w:p>
@@ -15842,7 +14170,7 @@
           <w:sz w:val="24"/>
           <w:rFonts w:ascii="Times New Roman" w:hAnsi="Times New Roman" w:cs="Times New Roman"/>
         </w:rPr>
-        <w:t xml:space="preserve"> Pembatalan sebelum bayar langsung diproses kasir; pembatalan nota belanja yang sudah selesai (</w:t>
+        <w:t xml:space="preserve"> Pembatalan keranjang sebelum bayar dapat diproses langsung oleh kasir; pembatalan nota belanja yang sudah selesai (</w:t>
       </w:r>
       <w:r>
         <w:rPr>
@@ -15864,7 +14192,7 @@
           <w:sz w:val="24"/>
           <w:rFonts w:ascii="Times New Roman" w:hAnsi="Times New Roman" w:cs="Times New Roman"/>
         </w:rPr>
-        <w:t>) wajib meminta persetujuan pemilik toko.</w:t>
+        <w:t>) wajib diverifikasi oleh pemilik toko.</w:t>
       </w:r>
     </w:p>
     <w:p>
@@ -15904,7 +14232,7 @@
           <w:sz w:val="24"/>
           <w:rFonts w:ascii="Times New Roman" w:hAnsi="Times New Roman" w:cs="Times New Roman"/>
         </w:rPr>
-        <w:t xml:space="preserve"> Alur penerimaan kulakan disiapkan dalam fondasi skema pembelian (</w:t>
+        <w:t xml:space="preserve"> Penerimaan pasokan barang tercatat pada skema pembelian (</w:t>
       </w:r>
       <w:r>
         <w:rPr>
@@ -15955,18 +14283,18 @@
           <w:sz w:val="24"/>
           <w:rFonts w:ascii="Times New Roman" w:hAnsi="Times New Roman" w:cs="Times New Roman"/>
         </w:rPr>
-        <w:t>Skenario G (Barang Rusak dan Basi):</w:t>
-      </w:r>
-      <w:r>
-        <w:rPr>
-          <w:rFonts w:ascii="Times New Roman" w:hAnsi="Times New Roman"/>
-          <w:b w:val="0"/>
-          <w:i w:val="0"/>
-          <w:color w:val="000000"/>
-          <w:sz w:val="24"/>
-          <w:rFonts w:ascii="Times New Roman" w:hAnsi="Times New Roman" w:cs="Times New Roman"/>
-        </w:rPr>
-        <w:t xml:space="preserve"> Pencatatan barang kadaluwarsa memotong stok secara otomatis dan membukukan kerugian modal toko.</w:t>
+        <w:t>Skenario G (Barang Rusak dan Kedaluwarsa):</w:t>
+      </w:r>
+      <w:r>
+        <w:rPr>
+          <w:rFonts w:ascii="Times New Roman" w:hAnsi="Times New Roman"/>
+          <w:b w:val="0"/>
+          <w:i w:val="0"/>
+          <w:color w:val="000000"/>
+          <w:sz w:val="24"/>
+          <w:rFonts w:ascii="Times New Roman" w:hAnsi="Times New Roman" w:cs="Times New Roman"/>
+        </w:rPr>
+        <w:t xml:space="preserve"> Pencatatan barang kedaluwarsa memotong stok secara otomatis dan membukukan penyesuaian kerugian modal toko.</w:t>
       </w:r>
     </w:p>
     <w:p>
@@ -16006,7 +14334,7 @@
           <w:sz w:val="24"/>
           <w:rFonts w:ascii="Times New Roman" w:hAnsi="Times New Roman" w:cs="Times New Roman"/>
         </w:rPr>
-        <w:t xml:space="preserve"> Pergantian kasir siang hari mewajibkan tutup shift pertama sebelum kasir berikutnya membuka shift baru.</w:t>
+        <w:t xml:space="preserve"> Pergantian kasir mewajibkan tutup shift pertama sebelum kasir pengganti membuka shift baru.</w:t>
       </w:r>
     </w:p>
     <w:p>
@@ -16046,7 +14374,7 @@
           <w:sz w:val="24"/>
           <w:rFonts w:ascii="Times New Roman" w:hAnsi="Times New Roman" w:cs="Times New Roman"/>
         </w:rPr>
-        <w:t xml:space="preserve"> Pengecekan nomor struk resmi mengembalikan barang ke stok dan mencatat pengembalian uang dari laci.</w:t>
+        <w:t xml:space="preserve"> Verifikasi nomor struk resmi mengembalikan kuantitas barang ke persediaan dan mencatat pengeluaran kas retur dari laci.</w:t>
       </w:r>
     </w:p>
     <w:p>
@@ -16086,7 +14414,7 @@
           <w:sz w:val="24"/>
           <w:rFonts w:ascii="Times New Roman" w:hAnsi="Times New Roman" w:cs="Times New Roman"/>
         </w:rPr>
-        <w:t xml:space="preserve"> Kasir menghitung fisik uang tanpa melihat saldo sistem di layar; laporan selisih uang langsung dikirim ke layar pemilik.</w:t>
+        <w:t xml:space="preserve"> Kasir menghitung fisik uang tunai tanpa melihat saldo sistem di layar; laporan selisih uang langsung dicatat untuk ditinjau oleh pemilik.</w:t>
       </w:r>
     </w:p>
     <w:p>

</xml_diff>